<commit_message>
Started lab111 configs, ip addressing, servers configs, planned OSPF areas
</commit_message>
<xml_diff>
--- a/CCNP Lab111 - Small Enterprise Network Design/CCNP_Lab111_-_Small_Enterprise_Network_Design_Documentation.docx
+++ b/CCNP Lab111 - Small Enterprise Network Design/CCNP_Lab111_-_Small_Enterprise_Network_Design_Documentation.docx
@@ -409,11 +409,13 @@
       <w:pPr>
         <w:spacing w:before="200"/>
         <w:rPr>
-          <w:lang w:val="en-US"/>
-        </w:rPr>
-      </w:pPr>
-      <w:r>
-        <w:rPr>
+          <w:color w:val="EE0000"/>
+          <w:lang w:val="en-US"/>
+        </w:rPr>
+      </w:pPr>
+      <w:r>
+        <w:rPr>
+          <w:color w:val="EE0000"/>
           <w:lang w:val="en-US"/>
         </w:rPr>
         <w:lastRenderedPageBreak/>
@@ -421,6 +423,7 @@
       </w:r>
       <w:r>
         <w:rPr>
+          <w:color w:val="EE0000"/>
           <w:lang w:val="en-US"/>
         </w:rPr>
         <w:t xml:space="preserve"> private network of class A</w:t>
@@ -429,20 +432,21 @@
     <w:p>
       <w:pPr>
         <w:spacing w:before="200"/>
-      </w:pPr>
-      <w:r>
+        <w:rPr>
+          <w:color w:val="EE0000"/>
+        </w:rPr>
+      </w:pPr>
+      <w:r>
+        <w:rPr>
+          <w:color w:val="EE0000"/>
+        </w:rPr>
         <w:t>SITE 01</w:t>
       </w:r>
       <w:r>
-        <w:t xml:space="preserve"> – </w:t>
-      </w:r>
-      <w:proofErr w:type="spellStart"/>
-      <w:r>
-        <w:t>Summary</w:t>
-      </w:r>
-      <w:proofErr w:type="spellEnd"/>
-      <w:r>
-        <w:t xml:space="preserve"> 10.1.0.0/20</w:t>
+        <w:rPr>
+          <w:color w:val="EE0000"/>
+        </w:rPr>
+        <w:t xml:space="preserve"> – Summary 10.1.0.0/20</w:t>
       </w:r>
     </w:p>
     <w:p>
@@ -452,20 +456,38 @@
           <w:numId w:val="2"/>
         </w:numPr>
         <w:spacing w:before="200"/>
-      </w:pPr>
-      <w:r>
+        <w:rPr>
+          <w:color w:val="EE0000"/>
+        </w:rPr>
+      </w:pPr>
+      <w:r>
+        <w:rPr>
+          <w:color w:val="EE0000"/>
+        </w:rPr>
         <w:t xml:space="preserve">VLAN 10 (MANAGEMENT) – </w:t>
       </w:r>
       <w:r>
+        <w:rPr>
+          <w:color w:val="EE0000"/>
+        </w:rPr>
         <w:t>10.</w:t>
       </w:r>
       <w:r>
+        <w:rPr>
+          <w:color w:val="EE0000"/>
+        </w:rPr>
         <w:t>1</w:t>
       </w:r>
       <w:r>
+        <w:rPr>
+          <w:color w:val="EE0000"/>
+        </w:rPr>
         <w:t>.0.0</w:t>
       </w:r>
       <w:r>
+        <w:rPr>
+          <w:color w:val="EE0000"/>
+        </w:rPr>
         <w:t>/24</w:t>
       </w:r>
     </w:p>
@@ -476,20 +498,38 @@
           <w:numId w:val="2"/>
         </w:numPr>
         <w:spacing w:before="200"/>
-      </w:pPr>
-      <w:r>
+        <w:rPr>
+          <w:color w:val="EE0000"/>
+        </w:rPr>
+      </w:pPr>
+      <w:r>
+        <w:rPr>
+          <w:color w:val="EE0000"/>
+        </w:rPr>
         <w:t xml:space="preserve">VLAN 20 (FINANCE/ACCOUNTING) – </w:t>
       </w:r>
       <w:r>
+        <w:rPr>
+          <w:color w:val="EE0000"/>
+        </w:rPr>
         <w:t>10.</w:t>
       </w:r>
       <w:r>
+        <w:rPr>
+          <w:color w:val="EE0000"/>
+        </w:rPr>
         <w:t>1</w:t>
       </w:r>
       <w:r>
+        <w:rPr>
+          <w:color w:val="EE0000"/>
+        </w:rPr>
         <w:t>.1.0</w:t>
       </w:r>
       <w:r>
+        <w:rPr>
+          <w:color w:val="EE0000"/>
+        </w:rPr>
         <w:t>/24</w:t>
       </w:r>
     </w:p>
@@ -500,20 +540,38 @@
           <w:numId w:val="2"/>
         </w:numPr>
         <w:spacing w:before="200"/>
-      </w:pPr>
-      <w:r>
+        <w:rPr>
+          <w:color w:val="EE0000"/>
+        </w:rPr>
+      </w:pPr>
+      <w:r>
+        <w:rPr>
+          <w:color w:val="EE0000"/>
+        </w:rPr>
         <w:t xml:space="preserve">VLAN 50 (VoIP) – </w:t>
       </w:r>
       <w:r>
+        <w:rPr>
+          <w:color w:val="EE0000"/>
+        </w:rPr>
         <w:t>10.</w:t>
       </w:r>
       <w:r>
+        <w:rPr>
+          <w:color w:val="EE0000"/>
+        </w:rPr>
         <w:t>1</w:t>
       </w:r>
       <w:r>
+        <w:rPr>
+          <w:color w:val="EE0000"/>
+        </w:rPr>
         <w:t>.2.0</w:t>
       </w:r>
       <w:r>
+        <w:rPr>
+          <w:color w:val="EE0000"/>
+        </w:rPr>
         <w:t>/23</w:t>
       </w:r>
     </w:p>
@@ -524,28 +582,38 @@
           <w:numId w:val="2"/>
         </w:numPr>
         <w:spacing w:before="200"/>
-      </w:pPr>
-      <w:r>
-        <w:t xml:space="preserve">VLAN 80 (Access </w:t>
-      </w:r>
-      <w:proofErr w:type="spellStart"/>
-      <w:r>
-        <w:t>Points</w:t>
-      </w:r>
-      <w:proofErr w:type="spellEnd"/>
-      <w:r>
-        <w:t xml:space="preserve">) – </w:t>
-      </w:r>
-      <w:r>
+        <w:rPr>
+          <w:color w:val="EE0000"/>
+        </w:rPr>
+      </w:pPr>
+      <w:r>
+        <w:rPr>
+          <w:color w:val="EE0000"/>
+        </w:rPr>
+        <w:t xml:space="preserve">VLAN 80 (Access Points) – </w:t>
+      </w:r>
+      <w:r>
+        <w:rPr>
+          <w:color w:val="EE0000"/>
+        </w:rPr>
         <w:t>10.</w:t>
       </w:r>
       <w:r>
+        <w:rPr>
+          <w:color w:val="EE0000"/>
+        </w:rPr>
         <w:t>1</w:t>
       </w:r>
       <w:r>
+        <w:rPr>
+          <w:color w:val="EE0000"/>
+        </w:rPr>
         <w:t>.6.0</w:t>
       </w:r>
       <w:r>
+        <w:rPr>
+          <w:color w:val="EE0000"/>
+        </w:rPr>
         <w:t>/24</w:t>
       </w:r>
     </w:p>
@@ -556,26 +624,50 @@
           <w:numId w:val="2"/>
         </w:numPr>
         <w:spacing w:before="200"/>
-      </w:pPr>
-      <w:r>
+        <w:rPr>
+          <w:color w:val="EE0000"/>
+        </w:rPr>
+      </w:pPr>
+      <w:r>
+        <w:rPr>
+          <w:color w:val="EE0000"/>
+        </w:rPr>
         <w:t>VLAN 100 (CORP-WIFI</w:t>
       </w:r>
       <w:r>
+        <w:rPr>
+          <w:color w:val="EE0000"/>
+        </w:rPr>
         <w:t>-AAA</w:t>
       </w:r>
       <w:r>
+        <w:rPr>
+          <w:color w:val="EE0000"/>
+        </w:rPr>
         <w:t xml:space="preserve">) – </w:t>
       </w:r>
       <w:r>
+        <w:rPr>
+          <w:color w:val="EE0000"/>
+        </w:rPr>
         <w:t>10.</w:t>
       </w:r>
       <w:r>
+        <w:rPr>
+          <w:color w:val="EE0000"/>
+        </w:rPr>
         <w:t>1</w:t>
       </w:r>
       <w:r>
+        <w:rPr>
+          <w:color w:val="EE0000"/>
+        </w:rPr>
         <w:t>.4.0</w:t>
       </w:r>
       <w:r>
+        <w:rPr>
+          <w:color w:val="EE0000"/>
+        </w:rPr>
         <w:t>/23</w:t>
       </w:r>
     </w:p>
@@ -586,20 +678,38 @@
           <w:numId w:val="2"/>
         </w:numPr>
         <w:spacing w:before="200"/>
-      </w:pPr>
-      <w:r>
+        <w:rPr>
+          <w:color w:val="EE0000"/>
+        </w:rPr>
+      </w:pPr>
+      <w:r>
+        <w:rPr>
+          <w:color w:val="EE0000"/>
+        </w:rPr>
         <w:t xml:space="preserve">VLAN 110 (CORP-WIFI-PSK) – </w:t>
       </w:r>
       <w:r>
+        <w:rPr>
+          <w:color w:val="EE0000"/>
+        </w:rPr>
         <w:t>10.</w:t>
       </w:r>
       <w:r>
+        <w:rPr>
+          <w:color w:val="EE0000"/>
+        </w:rPr>
         <w:t>1</w:t>
       </w:r>
       <w:r>
+        <w:rPr>
+          <w:color w:val="EE0000"/>
+        </w:rPr>
         <w:t>.7.0</w:t>
       </w:r>
       <w:r>
+        <w:rPr>
+          <w:color w:val="EE0000"/>
+        </w:rPr>
         <w:t>/24</w:t>
       </w:r>
     </w:p>
@@ -610,20 +720,38 @@
           <w:numId w:val="2"/>
         </w:numPr>
         <w:spacing w:before="200"/>
-      </w:pPr>
-      <w:r>
+        <w:rPr>
+          <w:color w:val="EE0000"/>
+        </w:rPr>
+      </w:pPr>
+      <w:r>
+        <w:rPr>
+          <w:color w:val="EE0000"/>
+        </w:rPr>
         <w:t xml:space="preserve">VLAN 120 (GUEST-WIFI) – </w:t>
       </w:r>
       <w:r>
+        <w:rPr>
+          <w:color w:val="EE0000"/>
+        </w:rPr>
         <w:t>10.</w:t>
       </w:r>
       <w:r>
+        <w:rPr>
+          <w:color w:val="EE0000"/>
+        </w:rPr>
         <w:t>1</w:t>
       </w:r>
       <w:r>
+        <w:rPr>
+          <w:color w:val="EE0000"/>
+        </w:rPr>
         <w:t>.8.0</w:t>
       </w:r>
       <w:r>
+        <w:rPr>
+          <w:color w:val="EE0000"/>
+        </w:rPr>
         <w:t>/24</w:t>
       </w:r>
     </w:p>
@@ -631,11 +759,13 @@
       <w:pPr>
         <w:spacing w:before="200"/>
         <w:rPr>
-          <w:lang w:val="en-US"/>
-        </w:rPr>
-      </w:pPr>
-      <w:r>
-        <w:rPr>
+          <w:color w:val="EE0000"/>
+          <w:lang w:val="en-US"/>
+        </w:rPr>
+      </w:pPr>
+      <w:r>
+        <w:rPr>
+          <w:color w:val="EE0000"/>
           <w:lang w:val="en-US"/>
         </w:rPr>
         <w:t>SHARED / CORE SERVICES (not tied to a single site)</w:t>
@@ -648,21 +778,27 @@
           <w:numId w:val="4"/>
         </w:numPr>
         <w:spacing w:before="200"/>
-      </w:pPr>
-      <w:r>
-        <w:t xml:space="preserve">VLAN 38 (DMZ) – </w:t>
-      </w:r>
-      <w:r>
-        <w:t>10.0.</w:t>
-      </w:r>
-      <w:r>
+        <w:rPr>
+          <w:color w:val="EE0000"/>
+        </w:rPr>
+      </w:pPr>
+      <w:r>
+        <w:rPr>
+          <w:color w:val="EE0000"/>
+        </w:rPr>
+        <w:t>VLAN 38 (DMZ) – 10.0.</w:t>
+      </w:r>
+      <w:r>
+        <w:rPr>
+          <w:color w:val="EE0000"/>
+        </w:rPr>
         <w:t>1</w:t>
       </w:r>
       <w:r>
-        <w:t>.0</w:t>
-      </w:r>
-      <w:r>
-        <w:t>/24</w:t>
+        <w:rPr>
+          <w:color w:val="EE0000"/>
+        </w:rPr>
+        <w:t>.0/24</w:t>
       </w:r>
     </w:p>
     <w:p>
@@ -672,17 +808,32 @@
           <w:numId w:val="4"/>
         </w:numPr>
         <w:spacing w:before="200"/>
-      </w:pPr>
-      <w:r>
+        <w:rPr>
+          <w:color w:val="EE0000"/>
+        </w:rPr>
+      </w:pPr>
+      <w:r>
+        <w:rPr>
+          <w:color w:val="EE0000"/>
+        </w:rPr>
         <w:t xml:space="preserve">VLAN 42 (WLC) – </w:t>
       </w:r>
       <w:r>
+        <w:rPr>
+          <w:color w:val="EE0000"/>
+        </w:rPr>
         <w:t>10.0.2.0</w:t>
       </w:r>
       <w:r>
+        <w:rPr>
+          <w:color w:val="EE0000"/>
+        </w:rPr>
         <w:t>/</w:t>
       </w:r>
       <w:r>
+        <w:rPr>
+          <w:color w:val="EE0000"/>
+        </w:rPr>
         <w:t>24</w:t>
       </w:r>
     </w:p>
@@ -693,8 +844,14 @@
           <w:numId w:val="4"/>
         </w:numPr>
         <w:spacing w:before="200"/>
-      </w:pPr>
-      <w:r>
+        <w:rPr>
+          <w:color w:val="EE0000"/>
+        </w:rPr>
+      </w:pPr>
+      <w:r>
+        <w:rPr>
+          <w:color w:val="EE0000"/>
+        </w:rPr>
         <w:t>VLAN 90 (SRV-ROOM) – 192.168.0.0/24</w:t>
       </w:r>
     </w:p>
@@ -705,8 +862,14 @@
           <w:numId w:val="4"/>
         </w:numPr>
         <w:spacing w:before="200"/>
-      </w:pPr>
-      <w:r>
+        <w:rPr>
+          <w:color w:val="EE0000"/>
+        </w:rPr>
+      </w:pPr>
+      <w:r>
+        <w:rPr>
+          <w:color w:val="EE0000"/>
+        </w:rPr>
         <w:t>INTERNAL ADDRESSING – 10.0.0.0/24</w:t>
       </w:r>
     </w:p>
@@ -717,23 +880,18 @@
           <w:numId w:val="4"/>
         </w:numPr>
         <w:spacing w:before="200"/>
+        <w:rPr>
+          <w:color w:val="EE0000"/>
+        </w:rPr>
       </w:pPr>
       <w:r>
         <w:rPr>
           <w:b/>
           <w:bCs/>
-        </w:rPr>
-        <w:t xml:space="preserve">Edge / Internet </w:t>
-      </w:r>
-      <w:proofErr w:type="spellStart"/>
-      <w:r>
-        <w:rPr>
-          <w:b/>
-          <w:bCs/>
-        </w:rPr>
-        <w:t>block</w:t>
-      </w:r>
-      <w:proofErr w:type="spellEnd"/>
+          <w:color w:val="EE0000"/>
+        </w:rPr>
+        <w:t>Edge / Internet block</w:t>
+      </w:r>
     </w:p>
     <w:p>
       <w:pPr>
@@ -742,21 +900,42 @@
           <w:numId w:val="4"/>
         </w:numPr>
         <w:spacing w:before="200"/>
-      </w:pPr>
-      <w:r>
-        <w:t xml:space="preserve">0. </w:t>
-      </w:r>
-      <w:r>
-        <w:t>ISP – FW</w:t>
-      </w:r>
-      <w:r>
-        <w:t xml:space="preserve"> (203.0.113.0</w:t>
-      </w:r>
-      <w:r>
-        <w:t>/</w:t>
-      </w:r>
-      <w:r>
-        <w:t>30)</w:t>
+        <w:rPr>
+          <w:color w:val="EE0000"/>
+        </w:rPr>
+      </w:pPr>
+      <w:r>
+        <w:rPr>
+          <w:color w:val="EE0000"/>
+        </w:rPr>
+        <w:t xml:space="preserve">-1. ISP – </w:t>
+      </w:r>
+      <w:r>
+        <w:rPr>
+          <w:color w:val="EE0000"/>
+        </w:rPr>
+        <w:t xml:space="preserve">WAN-R1 </w:t>
+      </w:r>
+      <w:r>
+        <w:rPr>
+          <w:color w:val="EE0000"/>
+          <w:lang w:val="en-US"/>
+        </w:rPr>
+        <w:t>(10.0.0.5</w:t>
+      </w:r>
+      <w:r>
+        <w:rPr>
+          <w:color w:val="EE0000"/>
+          <w:lang w:val="en-US"/>
+        </w:rPr>
+        <w:t>6</w:t>
+      </w:r>
+      <w:r>
+        <w:rPr>
+          <w:color w:val="EE0000"/>
+          <w:lang w:val="en-US"/>
+        </w:rPr>
+        <w:t>/30)</w:t>
       </w:r>
     </w:p>
     <w:p>
@@ -766,18 +945,27 @@
           <w:numId w:val="4"/>
         </w:numPr>
         <w:spacing w:before="200"/>
-      </w:pPr>
-      <w:r>
-        <w:t xml:space="preserve">1. </w:t>
-      </w:r>
-      <w:r>
-        <w:t>FW – DMZ-SW</w:t>
-      </w:r>
-      <w:r>
-        <w:t xml:space="preserve"> </w:t>
-      </w:r>
-      <w:r>
-        <w:t>(10.0.0.0/30)</w:t>
+        <w:rPr>
+          <w:color w:val="EE0000"/>
+        </w:rPr>
+      </w:pPr>
+      <w:r>
+        <w:rPr>
+          <w:color w:val="EE0000"/>
+        </w:rPr>
+        <w:t xml:space="preserve">0. </w:t>
+      </w:r>
+      <w:r>
+        <w:rPr>
+          <w:color w:val="EE0000"/>
+        </w:rPr>
+        <w:t>WAN-R1</w:t>
+      </w:r>
+      <w:r>
+        <w:rPr>
+          <w:color w:val="EE0000"/>
+        </w:rPr>
+        <w:t xml:space="preserve"> – FW (203.0.113.0/30)</w:t>
       </w:r>
     </w:p>
     <w:p>
@@ -787,24 +975,15 @@
           <w:numId w:val="4"/>
         </w:numPr>
         <w:spacing w:before="200"/>
-      </w:pPr>
-      <w:r>
-        <w:t xml:space="preserve">2. </w:t>
-      </w:r>
-      <w:r>
-        <w:t>FW – CORE-R1</w:t>
-      </w:r>
-      <w:r>
-        <w:t xml:space="preserve"> </w:t>
-      </w:r>
-      <w:r>
-        <w:t>(10.0.0.</w:t>
-      </w:r>
-      <w:r>
-        <w:t>4</w:t>
-      </w:r>
-      <w:r>
-        <w:t>/30)</w:t>
+        <w:rPr>
+          <w:color w:val="EE0000"/>
+        </w:rPr>
+      </w:pPr>
+      <w:r>
+        <w:rPr>
+          <w:color w:val="EE0000"/>
+        </w:rPr>
+        <w:t>1. FW – DMZ-SW (10.0.0.0/30)</w:t>
       </w:r>
     </w:p>
     <w:p>
@@ -814,24 +993,15 @@
           <w:numId w:val="4"/>
         </w:numPr>
         <w:spacing w:before="200"/>
-      </w:pPr>
-      <w:r>
-        <w:t xml:space="preserve">3. </w:t>
-      </w:r>
-      <w:r>
-        <w:t>FW – CORE-R2</w:t>
-      </w:r>
-      <w:r>
-        <w:t xml:space="preserve"> </w:t>
-      </w:r>
-      <w:r>
-        <w:t>(10.0.0.</w:t>
-      </w:r>
-      <w:r>
-        <w:t>8</w:t>
-      </w:r>
-      <w:r>
-        <w:t>/30)</w:t>
+        <w:rPr>
+          <w:color w:val="EE0000"/>
+        </w:rPr>
+      </w:pPr>
+      <w:r>
+        <w:rPr>
+          <w:color w:val="EE0000"/>
+        </w:rPr>
+        <w:t>2. FW – CORE-R1 (10.0.0.4/30)</w:t>
       </w:r>
     </w:p>
     <w:p>
@@ -842,100 +1012,14 @@
         </w:numPr>
         <w:spacing w:before="200"/>
         <w:rPr>
-          <w:lang w:val="en-US"/>
-        </w:rPr>
-      </w:pPr>
-      <w:r>
-        <w:rPr>
-          <w:b/>
-          <w:bCs/>
-          <w:lang w:val="en-US"/>
-        </w:rPr>
-        <w:t>Server room</w:t>
-      </w:r>
-      <w:r>
-        <w:rPr>
-          <w:lang w:val="en-US"/>
-        </w:rPr>
-        <w:br/>
-      </w:r>
-      <w:r>
-        <w:rPr>
-          <w:lang w:val="en-US"/>
-        </w:rPr>
-        <w:t>4</w:t>
-      </w:r>
-      <w:r>
-        <w:rPr>
-          <w:lang w:val="en-US"/>
-        </w:rPr>
-        <w:t>. SRVRM-SW1 – CORE-R1</w:t>
-      </w:r>
-      <w:r>
-        <w:rPr>
-          <w:lang w:val="en-US"/>
-        </w:rPr>
-        <w:t xml:space="preserve"> </w:t>
-      </w:r>
-      <w:r>
-        <w:rPr>
-          <w:lang w:val="en-US"/>
-        </w:rPr>
-        <w:t>(10.0.0.</w:t>
-      </w:r>
-      <w:r>
-        <w:rPr>
-          <w:lang w:val="en-US"/>
-        </w:rPr>
-        <w:t>12</w:t>
-      </w:r>
-      <w:r>
-        <w:rPr>
-          <w:lang w:val="en-US"/>
-        </w:rPr>
-        <w:t>/30)</w:t>
-      </w:r>
-      <w:r>
-        <w:rPr>
-          <w:lang w:val="en-US"/>
-        </w:rPr>
-        <w:br/>
-      </w:r>
-      <w:r>
-        <w:rPr>
-          <w:lang w:val="en-US"/>
-        </w:rPr>
-        <w:t>5</w:t>
-      </w:r>
-      <w:r>
-        <w:rPr>
-          <w:lang w:val="en-US"/>
-        </w:rPr>
-        <w:t>. SRVRM-SW1 – CORE-R2</w:t>
-      </w:r>
-      <w:r>
-        <w:rPr>
-          <w:lang w:val="en-US"/>
-        </w:rPr>
-        <w:t xml:space="preserve"> </w:t>
-      </w:r>
-      <w:r>
-        <w:rPr>
-          <w:lang w:val="en-US"/>
-        </w:rPr>
-        <w:t>(10.0.0.</w:t>
-      </w:r>
-      <w:r>
-        <w:rPr>
-          <w:lang w:val="en-US"/>
-        </w:rPr>
-        <w:t>16</w:t>
-      </w:r>
-      <w:r>
-        <w:rPr>
-          <w:lang w:val="en-US"/>
-        </w:rPr>
-        <w:t>/30)</w:t>
+          <w:color w:val="EE0000"/>
+        </w:rPr>
+      </w:pPr>
+      <w:r>
+        <w:rPr>
+          <w:color w:val="EE0000"/>
+        </w:rPr>
+        <w:t>3. FW – CORE-R2 (10.0.0.8/30)</w:t>
       </w:r>
     </w:p>
     <w:p>
@@ -946,6 +1030,7 @@
         </w:numPr>
         <w:spacing w:before="200"/>
         <w:rPr>
+          <w:color w:val="EE0000"/>
           <w:lang w:val="en-US"/>
         </w:rPr>
       </w:pPr>
@@ -953,28 +1038,26 @@
         <w:rPr>
           <w:b/>
           <w:bCs/>
-          <w:lang w:val="en-US"/>
-        </w:rPr>
-        <w:t>Core</w:t>
-      </w:r>
-      <w:r>
-        <w:rPr>
+          <w:color w:val="EE0000"/>
+          <w:lang w:val="en-US"/>
+        </w:rPr>
+        <w:t>Server room</w:t>
+      </w:r>
+      <w:r>
+        <w:rPr>
+          <w:color w:val="EE0000"/>
           <w:lang w:val="en-US"/>
         </w:rPr>
         <w:br/>
-        <w:t>6. CORE-R1 – CORE-R2 (10.0.0.</w:t>
-      </w:r>
-      <w:r>
-        <w:rPr>
-          <w:lang w:val="en-US"/>
-        </w:rPr>
-        <w:t>20</w:t>
-      </w:r>
-      <w:r>
-        <w:rPr>
-          <w:lang w:val="en-US"/>
-        </w:rPr>
-        <w:t>/30)</w:t>
+        <w:t>4. SRVRM-SW1 – CORE-R1 (10.0.0.12/30)</w:t>
+      </w:r>
+      <w:r>
+        <w:rPr>
+          <w:color w:val="EE0000"/>
+          <w:lang w:val="en-US"/>
+        </w:rPr>
+        <w:br/>
+        <w:t>5. SRVRM-SW1 – CORE-R2 (10.0.0.16/30)</w:t>
       </w:r>
     </w:p>
     <w:p>
@@ -985,6 +1068,7 @@
         </w:numPr>
         <w:spacing w:before="200"/>
         <w:rPr>
+          <w:color w:val="EE0000"/>
           <w:lang w:val="en-US"/>
         </w:rPr>
       </w:pPr>
@@ -992,361 +1076,18 @@
         <w:rPr>
           <w:b/>
           <w:bCs/>
-          <w:lang w:val="en-US"/>
-        </w:rPr>
-        <w:t>Core → Distribution (full mesh, both sites)</w:t>
-      </w:r>
-      <w:r>
-        <w:rPr>
+          <w:color w:val="EE0000"/>
+          <w:lang w:val="en-US"/>
+        </w:rPr>
+        <w:t>Core</w:t>
+      </w:r>
+      <w:r>
+        <w:rPr>
+          <w:color w:val="EE0000"/>
           <w:lang w:val="en-US"/>
         </w:rPr>
         <w:br/>
-      </w:r>
-      <w:r>
-        <w:rPr>
-          <w:lang w:val="en-US"/>
-        </w:rPr>
-        <w:t>7</w:t>
-      </w:r>
-      <w:r>
-        <w:rPr>
-          <w:lang w:val="en-US"/>
-        </w:rPr>
-        <w:t>. CORE-R1 – DSW01-SITE01</w:t>
-      </w:r>
-      <w:r>
-        <w:rPr>
-          <w:lang w:val="en-US"/>
-        </w:rPr>
-        <w:t xml:space="preserve"> </w:t>
-      </w:r>
-      <w:r>
-        <w:rPr>
-          <w:lang w:val="en-US"/>
-        </w:rPr>
-        <w:t>(10.0.0.</w:t>
-      </w:r>
-      <w:r>
-        <w:rPr>
-          <w:lang w:val="en-US"/>
-        </w:rPr>
-        <w:t>24</w:t>
-      </w:r>
-      <w:r>
-        <w:rPr>
-          <w:lang w:val="en-US"/>
-        </w:rPr>
-        <w:t>/30)</w:t>
-      </w:r>
-      <w:r>
-        <w:rPr>
-          <w:lang w:val="en-US"/>
-        </w:rPr>
-        <w:br/>
-      </w:r>
-      <w:r>
-        <w:rPr>
-          <w:lang w:val="en-US"/>
-        </w:rPr>
-        <w:t>8</w:t>
-      </w:r>
-      <w:r>
-        <w:rPr>
-          <w:lang w:val="en-US"/>
-        </w:rPr>
-        <w:t>. CORE-R1 – DSW02-SITE01</w:t>
-      </w:r>
-      <w:r>
-        <w:rPr>
-          <w:lang w:val="en-US"/>
-        </w:rPr>
-        <w:t xml:space="preserve"> </w:t>
-      </w:r>
-      <w:r>
-        <w:rPr>
-          <w:lang w:val="en-US"/>
-        </w:rPr>
-        <w:t>(10.0.0.</w:t>
-      </w:r>
-      <w:r>
-        <w:rPr>
-          <w:lang w:val="en-US"/>
-        </w:rPr>
-        <w:t>2</w:t>
-      </w:r>
-      <w:r>
-        <w:rPr>
-          <w:lang w:val="en-US"/>
-        </w:rPr>
-        <w:t>8</w:t>
-      </w:r>
-      <w:r>
-        <w:rPr>
-          <w:lang w:val="en-US"/>
-        </w:rPr>
-        <w:t>/30)</w:t>
-      </w:r>
-      <w:r>
-        <w:rPr>
-          <w:lang w:val="en-US"/>
-        </w:rPr>
-        <w:br/>
-      </w:r>
-      <w:r>
-        <w:rPr>
-          <w:lang w:val="en-US"/>
-        </w:rPr>
-        <w:t>9</w:t>
-      </w:r>
-      <w:r>
-        <w:rPr>
-          <w:lang w:val="en-US"/>
-        </w:rPr>
-        <w:t>. CORE-R1 – DSW01-SITE02</w:t>
-      </w:r>
-      <w:r>
-        <w:rPr>
-          <w:lang w:val="en-US"/>
-        </w:rPr>
-        <w:t xml:space="preserve"> </w:t>
-      </w:r>
-      <w:r>
-        <w:rPr>
-          <w:lang w:val="en-US"/>
-        </w:rPr>
-        <w:t>(10.0.0.</w:t>
-      </w:r>
-      <w:r>
-        <w:rPr>
-          <w:lang w:val="en-US"/>
-        </w:rPr>
-        <w:t>32</w:t>
-      </w:r>
-      <w:r>
-        <w:rPr>
-          <w:lang w:val="en-US"/>
-        </w:rPr>
-        <w:t>/30)</w:t>
-      </w:r>
-      <w:r>
-        <w:rPr>
-          <w:lang w:val="en-US"/>
-        </w:rPr>
-        <w:br/>
-      </w:r>
-      <w:r>
-        <w:rPr>
-          <w:lang w:val="en-US"/>
-        </w:rPr>
-        <w:t>10</w:t>
-      </w:r>
-      <w:r>
-        <w:rPr>
-          <w:lang w:val="en-US"/>
-        </w:rPr>
-        <w:t>. CORE-R1 – DSW02-SITE02</w:t>
-      </w:r>
-      <w:r>
-        <w:rPr>
-          <w:lang w:val="en-US"/>
-        </w:rPr>
-        <w:t xml:space="preserve"> </w:t>
-      </w:r>
-      <w:r>
-        <w:rPr>
-          <w:lang w:val="en-US"/>
-        </w:rPr>
-        <w:t>(10.0.0.</w:t>
-      </w:r>
-      <w:r>
-        <w:rPr>
-          <w:lang w:val="en-US"/>
-        </w:rPr>
-        <w:t>36</w:t>
-      </w:r>
-      <w:r>
-        <w:rPr>
-          <w:lang w:val="en-US"/>
-        </w:rPr>
-        <w:t>/30)</w:t>
-      </w:r>
-      <w:r>
-        <w:rPr>
-          <w:lang w:val="en-US"/>
-        </w:rPr>
-        <w:br/>
-        <w:t>1</w:t>
-      </w:r>
-      <w:r>
-        <w:rPr>
-          <w:lang w:val="en-US"/>
-        </w:rPr>
-        <w:t>1</w:t>
-      </w:r>
-      <w:r>
-        <w:rPr>
-          <w:lang w:val="en-US"/>
-        </w:rPr>
-        <w:t>. CORE-R2 – DSW01-SITE01</w:t>
-      </w:r>
-      <w:r>
-        <w:rPr>
-          <w:lang w:val="en-US"/>
-        </w:rPr>
-        <w:t xml:space="preserve"> </w:t>
-      </w:r>
-      <w:r>
-        <w:rPr>
-          <w:lang w:val="en-US"/>
-        </w:rPr>
-        <w:t>(10.0.0.</w:t>
-      </w:r>
-      <w:r>
-        <w:rPr>
-          <w:lang w:val="en-US"/>
-        </w:rPr>
-        <w:t>40</w:t>
-      </w:r>
-      <w:r>
-        <w:rPr>
-          <w:lang w:val="en-US"/>
-        </w:rPr>
-        <w:t>/30)</w:t>
-      </w:r>
-      <w:r>
-        <w:rPr>
-          <w:lang w:val="en-US"/>
-        </w:rPr>
-        <w:br/>
-        <w:t>1</w:t>
-      </w:r>
-      <w:r>
-        <w:rPr>
-          <w:lang w:val="en-US"/>
-        </w:rPr>
-        <w:t>2</w:t>
-      </w:r>
-      <w:r>
-        <w:rPr>
-          <w:lang w:val="en-US"/>
-        </w:rPr>
-        <w:t>. CORE-R2 – DSW02-SITE01</w:t>
-      </w:r>
-      <w:r>
-        <w:rPr>
-          <w:lang w:val="en-US"/>
-        </w:rPr>
-        <w:t xml:space="preserve"> </w:t>
-      </w:r>
-      <w:r>
-        <w:rPr>
-          <w:lang w:val="en-US"/>
-        </w:rPr>
-        <w:t>(10.0.0.</w:t>
-      </w:r>
-      <w:r>
-        <w:rPr>
-          <w:lang w:val="en-US"/>
-        </w:rPr>
-        <w:t>44</w:t>
-      </w:r>
-      <w:r>
-        <w:rPr>
-          <w:lang w:val="en-US"/>
-        </w:rPr>
-        <w:t>/30)</w:t>
-      </w:r>
-      <w:r>
-        <w:rPr>
-          <w:lang w:val="en-US"/>
-        </w:rPr>
-        <w:br/>
-      </w:r>
-      <w:r>
-        <w:rPr>
-          <w:lang w:val="en-US"/>
-        </w:rPr>
-        <w:lastRenderedPageBreak/>
-        <w:t>1</w:t>
-      </w:r>
-      <w:r>
-        <w:rPr>
-          <w:lang w:val="en-US"/>
-        </w:rPr>
-        <w:t>3</w:t>
-      </w:r>
-      <w:r>
-        <w:rPr>
-          <w:lang w:val="en-US"/>
-        </w:rPr>
-        <w:t>. CORE-R2 – DSW01-SITE02</w:t>
-      </w:r>
-      <w:r>
-        <w:rPr>
-          <w:lang w:val="en-US"/>
-        </w:rPr>
-        <w:t xml:space="preserve"> </w:t>
-      </w:r>
-      <w:r>
-        <w:rPr>
-          <w:lang w:val="en-US"/>
-        </w:rPr>
-        <w:t>(10.0.0.</w:t>
-      </w:r>
-      <w:r>
-        <w:rPr>
-          <w:lang w:val="en-US"/>
-        </w:rPr>
-        <w:t>48</w:t>
-      </w:r>
-      <w:r>
-        <w:rPr>
-          <w:lang w:val="en-US"/>
-        </w:rPr>
-        <w:t>/30)</w:t>
-      </w:r>
-      <w:r>
-        <w:rPr>
-          <w:lang w:val="en-US"/>
-        </w:rPr>
-        <w:br/>
-        <w:t>1</w:t>
-      </w:r>
-      <w:r>
-        <w:rPr>
-          <w:lang w:val="en-US"/>
-        </w:rPr>
-        <w:t>4</w:t>
-      </w:r>
-      <w:r>
-        <w:rPr>
-          <w:lang w:val="en-US"/>
-        </w:rPr>
-        <w:t>. CORE-R2 – DSW02-SITE02</w:t>
-      </w:r>
-      <w:r>
-        <w:rPr>
-          <w:lang w:val="en-US"/>
-        </w:rPr>
-        <w:t xml:space="preserve"> </w:t>
-      </w:r>
-      <w:r>
-        <w:rPr>
-          <w:lang w:val="en-US"/>
-        </w:rPr>
-        <w:t>(10.0.0.</w:t>
-      </w:r>
-      <w:r>
-        <w:rPr>
-          <w:lang w:val="en-US"/>
-        </w:rPr>
-        <w:t>52</w:t>
-      </w:r>
-      <w:r>
-        <w:rPr>
-          <w:lang w:val="en-US"/>
-        </w:rPr>
-        <w:t>/30)</w:t>
+        <w:t>6. CORE-R1 – CORE-R2 (10.0.0.20/30)</w:t>
       </w:r>
     </w:p>
     <w:p>
@@ -1364,9 +1105,138 @@
         <w:rPr>
           <w:b/>
           <w:bCs/>
-          <w:lang w:val="en-US"/>
-        </w:rPr>
-        <w:t>Intra-distribution (per site)</w:t>
+          <w:color w:val="EE0000"/>
+          <w:lang w:val="en-US"/>
+        </w:rPr>
+        <w:t>Core → Distribution (full mesh, both sites)</w:t>
+      </w:r>
+      <w:r>
+        <w:rPr>
+          <w:color w:val="EE0000"/>
+          <w:lang w:val="en-US"/>
+        </w:rPr>
+        <w:br/>
+        <w:t>7. CORE-R1 – DSW01-SITE01 (10.0.0.24/30)</w:t>
+      </w:r>
+      <w:r>
+        <w:rPr>
+          <w:color w:val="EE0000"/>
+          <w:lang w:val="en-US"/>
+        </w:rPr>
+        <w:br/>
+        <w:t>8. CORE-R1 – DSW02-SITE01 (10.0.0.28/30)</w:t>
+      </w:r>
+      <w:r>
+        <w:rPr>
+          <w:lang w:val="en-US"/>
+        </w:rPr>
+        <w:br/>
+      </w:r>
+      <w:r>
+        <w:rPr>
+          <w:lang w:val="en-US"/>
+        </w:rPr>
+        <w:t>9</w:t>
+      </w:r>
+      <w:r>
+        <w:rPr>
+          <w:lang w:val="en-US"/>
+        </w:rPr>
+        <w:t>. CORE-R1 – DSW01-SITE02</w:t>
+      </w:r>
+      <w:r>
+        <w:rPr>
+          <w:lang w:val="en-US"/>
+        </w:rPr>
+        <w:t xml:space="preserve"> </w:t>
+      </w:r>
+      <w:r>
+        <w:rPr>
+          <w:lang w:val="en-US"/>
+        </w:rPr>
+        <w:t>(10.0.0.</w:t>
+      </w:r>
+      <w:r>
+        <w:rPr>
+          <w:lang w:val="en-US"/>
+        </w:rPr>
+        <w:t>32</w:t>
+      </w:r>
+      <w:r>
+        <w:rPr>
+          <w:lang w:val="en-US"/>
+        </w:rPr>
+        <w:t>/30)</w:t>
+      </w:r>
+      <w:r>
+        <w:rPr>
+          <w:lang w:val="en-US"/>
+        </w:rPr>
+        <w:br/>
+      </w:r>
+      <w:r>
+        <w:rPr>
+          <w:lang w:val="en-US"/>
+        </w:rPr>
+        <w:t>10</w:t>
+      </w:r>
+      <w:r>
+        <w:rPr>
+          <w:lang w:val="en-US"/>
+        </w:rPr>
+        <w:t>. CORE-R1 – DSW02-SITE02</w:t>
+      </w:r>
+      <w:r>
+        <w:rPr>
+          <w:lang w:val="en-US"/>
+        </w:rPr>
+        <w:t xml:space="preserve"> </w:t>
+      </w:r>
+      <w:r>
+        <w:rPr>
+          <w:lang w:val="en-US"/>
+        </w:rPr>
+        <w:t>(10.0.0.</w:t>
+      </w:r>
+      <w:r>
+        <w:rPr>
+          <w:lang w:val="en-US"/>
+        </w:rPr>
+        <w:t>36</w:t>
+      </w:r>
+      <w:r>
+        <w:rPr>
+          <w:lang w:val="en-US"/>
+        </w:rPr>
+        <w:t>/30)</w:t>
+      </w:r>
+      <w:r>
+        <w:rPr>
+          <w:lang w:val="en-US"/>
+        </w:rPr>
+        <w:br/>
+      </w:r>
+      <w:r>
+        <w:rPr>
+          <w:color w:val="EE0000"/>
+          <w:lang w:val="en-US"/>
+        </w:rPr>
+        <w:t>11. CORE-R2 – DSW01-SITE01 (10.0.0.40/30)</w:t>
+      </w:r>
+      <w:r>
+        <w:rPr>
+          <w:color w:val="EE0000"/>
+          <w:lang w:val="en-US"/>
+        </w:rPr>
+        <w:br/>
+      </w:r>
+      <w:r>
+        <w:rPr>
+          <w:color w:val="EE0000"/>
+          <w:lang w:val="en-US"/>
+        </w:rPr>
+        <w:lastRenderedPageBreak/>
+        <w:t>12. CORE-R2 – DSW02-SITE01 (10.0.0.44/30)</w:t>
       </w:r>
       <w:r>
         <w:rPr>
@@ -1379,13 +1249,13 @@
         <w:rPr>
           <w:lang w:val="en-US"/>
         </w:rPr>
-        <w:t>5</w:t>
-      </w:r>
-      <w:r>
-        <w:rPr>
-          <w:lang w:val="en-US"/>
-        </w:rPr>
-        <w:t>. DSW01-SITE01 – DSW02-SITE01 (port-channel)</w:t>
+        <w:t>3</w:t>
+      </w:r>
+      <w:r>
+        <w:rPr>
+          <w:lang w:val="en-US"/>
+        </w:rPr>
+        <w:t>. CORE-R2 – DSW01-SITE02</w:t>
       </w:r>
       <w:r>
         <w:rPr>
@@ -1403,13 +1273,19 @@
         <w:rPr>
           <w:lang w:val="en-US"/>
         </w:rPr>
-        <w:t>56</w:t>
+        <w:t>48</w:t>
       </w:r>
       <w:r>
         <w:rPr>
           <w:lang w:val="en-US"/>
         </w:rPr>
         <w:t>/30)</w:t>
+      </w:r>
+      <w:r>
+        <w:rPr>
+          <w:lang w:val="en-US"/>
+        </w:rPr>
+        <w:t xml:space="preserve"> </w:t>
       </w:r>
       <w:r>
         <w:rPr>
@@ -1422,6 +1298,89 @@
         <w:rPr>
           <w:lang w:val="en-US"/>
         </w:rPr>
+        <w:t>4</w:t>
+      </w:r>
+      <w:r>
+        <w:rPr>
+          <w:lang w:val="en-US"/>
+        </w:rPr>
+        <w:t>. CORE-R2 – DSW02-SITE02</w:t>
+      </w:r>
+      <w:r>
+        <w:rPr>
+          <w:lang w:val="en-US"/>
+        </w:rPr>
+        <w:t xml:space="preserve"> </w:t>
+      </w:r>
+      <w:r>
+        <w:rPr>
+          <w:lang w:val="en-US"/>
+        </w:rPr>
+        <w:t>(10.0.0.</w:t>
+      </w:r>
+      <w:r>
+        <w:rPr>
+          <w:lang w:val="en-US"/>
+        </w:rPr>
+        <w:t>52</w:t>
+      </w:r>
+      <w:r>
+        <w:rPr>
+          <w:lang w:val="en-US"/>
+        </w:rPr>
+        <w:t>/30)</w:t>
+      </w:r>
+    </w:p>
+    <w:p>
+      <w:pPr>
+        <w:numPr>
+          <w:ilvl w:val="1"/>
+          <w:numId w:val="4"/>
+        </w:numPr>
+        <w:spacing w:before="200"/>
+        <w:rPr>
+          <w:lang w:val="en-US"/>
+        </w:rPr>
+      </w:pPr>
+      <w:r>
+        <w:rPr>
+          <w:b/>
+          <w:bCs/>
+          <w:lang w:val="en-US"/>
+        </w:rPr>
+        <w:t>Intra-distribution (per site)</w:t>
+      </w:r>
+      <w:r>
+        <w:rPr>
+          <w:lang w:val="en-US"/>
+        </w:rPr>
+        <w:br/>
+      </w:r>
+      <w:r>
+        <w:rPr>
+          <w:color w:val="EE0000"/>
+          <w:lang w:val="en-US"/>
+        </w:rPr>
+        <w:t>15. DSW01-SITE01 – DSW02-SITE01 (port-channel)</w:t>
+      </w:r>
+      <w:r>
+        <w:rPr>
+          <w:color w:val="EE0000"/>
+          <w:lang w:val="en-US"/>
+        </w:rPr>
+        <w:t xml:space="preserve"> (10.0.0.56/30)</w:t>
+      </w:r>
+      <w:r>
+        <w:rPr>
+          <w:lang w:val="en-US"/>
+        </w:rPr>
+        <w:br/>
+        <w:t>1</w:t>
+      </w:r>
+      <w:r>
+        <w:rPr>
+          <w:lang w:val="en-US"/>
+        </w:rPr>
         <w:t>6</w:t>
       </w:r>
       <w:r>
@@ -1458,26 +1417,33 @@
     <w:p>
       <w:pPr>
         <w:spacing w:before="200"/>
-      </w:pPr>
-      <w:r>
+        <w:rPr>
+          <w:lang w:val="en-US"/>
+        </w:rPr>
+      </w:pPr>
+      <w:r>
+        <w:rPr>
+          <w:lang w:val="en-US"/>
+        </w:rPr>
         <w:t>SITE 02</w:t>
       </w:r>
       <w:r>
-        <w:t xml:space="preserve"> </w:t>
-      </w:r>
-      <w:proofErr w:type="spellStart"/>
-      <w:r>
-        <w:t>Summary</w:t>
-      </w:r>
-      <w:proofErr w:type="spellEnd"/>
-      <w:r>
-        <w:t xml:space="preserve"> 10.</w:t>
-      </w:r>
-      <w:r>
-        <w:t>2</w:t>
-      </w:r>
-      <w:r>
-        <w:t>.0.0/20</w:t>
+        <w:rPr>
+          <w:lang w:val="en-US"/>
+        </w:rPr>
+        <w:t xml:space="preserve"> Summary 10.2.0.0/20</w:t>
+      </w:r>
+      <w:r>
+        <w:rPr>
+          <w:lang w:val="en-US"/>
+        </w:rPr>
+        <w:t xml:space="preserve"> – does not e</w:t>
+      </w:r>
+      <w:r>
+        <w:rPr>
+          <w:lang w:val="en-US"/>
+        </w:rPr>
+        <w:t>xist in CML</w:t>
       </w:r>
     </w:p>
     <w:p>
@@ -1591,15 +1557,7 @@
         <w:spacing w:before="200"/>
       </w:pPr>
       <w:r>
-        <w:t xml:space="preserve">VLAN 80 (Access </w:t>
-      </w:r>
-      <w:proofErr w:type="spellStart"/>
-      <w:r>
-        <w:t>Points</w:t>
-      </w:r>
-      <w:proofErr w:type="spellEnd"/>
-      <w:r>
-        <w:t xml:space="preserve">) – </w:t>
+        <w:t xml:space="preserve">VLAN 80 (Access Points) – </w:t>
       </w:r>
       <w:r>
         <w:t>10.</w:t>
@@ -1760,6 +1718,12 @@
           <w:lang w:val="en-US"/>
         </w:rPr>
       </w:pPr>
+      <w:r>
+        <w:rPr>
+          <w:lang w:val="en-US"/>
+        </w:rPr>
+        <w:t>IGP DESIGN</w:t>
+      </w:r>
     </w:p>
     <w:p>
       <w:pPr>
@@ -1854,7 +1818,6 @@
           <w:bCs/>
           <w:lang w:val="en-US"/>
         </w:rPr>
-        <w:lastRenderedPageBreak/>
         <w:t>Document Section Index</w:t>
       </w:r>
     </w:p>
@@ -3829,61 +3792,7 @@
           <w:iCs/>
           <w:color w:val="888888"/>
         </w:rPr>
-        <w:t xml:space="preserve">[Content </w:t>
-      </w:r>
-      <w:proofErr w:type="spellStart"/>
-      <w:r>
-        <w:rPr>
-          <w:i/>
-          <w:iCs/>
-          <w:color w:val="888888"/>
-        </w:rPr>
-        <w:t>to</w:t>
-      </w:r>
-      <w:proofErr w:type="spellEnd"/>
-      <w:r>
-        <w:rPr>
-          <w:i/>
-          <w:iCs/>
-          <w:color w:val="888888"/>
-        </w:rPr>
-        <w:t xml:space="preserve"> </w:t>
-      </w:r>
-      <w:proofErr w:type="spellStart"/>
-      <w:r>
-        <w:rPr>
-          <w:i/>
-          <w:iCs/>
-          <w:color w:val="888888"/>
-        </w:rPr>
-        <w:t>be</w:t>
-      </w:r>
-      <w:proofErr w:type="spellEnd"/>
-      <w:r>
-        <w:rPr>
-          <w:i/>
-          <w:iCs/>
-          <w:color w:val="888888"/>
-        </w:rPr>
-        <w:t xml:space="preserve"> </w:t>
-      </w:r>
-      <w:proofErr w:type="spellStart"/>
-      <w:r>
-        <w:rPr>
-          <w:i/>
-          <w:iCs/>
-          <w:color w:val="888888"/>
-        </w:rPr>
-        <w:t>added</w:t>
-      </w:r>
-      <w:proofErr w:type="spellEnd"/>
-      <w:r>
-        <w:rPr>
-          <w:i/>
-          <w:iCs/>
-          <w:color w:val="888888"/>
-        </w:rPr>
-        <w:t>]</w:t>
+        <w:t>[Content to be added]</w:t>
       </w:r>
     </w:p>
     <w:sectPr>
@@ -5046,6 +4955,7 @@
   <w:style w:type="character" w:default="1" w:styleId="a0">
     <w:name w:val="Default Paragraph Font"/>
     <w:uiPriority w:val="1"/>
+    <w:semiHidden/>
     <w:unhideWhenUsed/>
   </w:style>
   <w:style w:type="table" w:default="1" w:styleId="a1">

</xml_diff>

<commit_message>
implemented ospf, mgmt addressing, bgp, firewall configs, dhcp configs on server - next time NAT and DNS
</commit_message>
<xml_diff>
--- a/CCNP Lab111 - Small Enterprise Network Design/CCNP_Lab111_-_Small_Enterprise_Network_Design_Documentation.docx
+++ b/CCNP Lab111 - Small Enterprise Network Design/CCNP_Lab111_-_Small_Enterprise_Network_Design_Documentation.docx
@@ -409,44 +409,100 @@
       <w:pPr>
         <w:spacing w:before="200"/>
         <w:rPr>
-          <w:color w:val="EE0000"/>
-          <w:lang w:val="en-US"/>
-        </w:rPr>
-      </w:pPr>
-      <w:r>
-        <w:rPr>
-          <w:color w:val="EE0000"/>
+          <w:color w:val="00B0F0"/>
+        </w:rPr>
+      </w:pPr>
+      <w:r>
+        <w:rPr>
+          <w:color w:val="00B0F0"/>
           <w:lang w:val="en-US"/>
         </w:rPr>
         <w:lastRenderedPageBreak/>
-        <w:t>VLAN – Subnet mapping</w:t>
-      </w:r>
-      <w:r>
-        <w:rPr>
-          <w:color w:val="EE0000"/>
-          <w:lang w:val="en-US"/>
-        </w:rPr>
-        <w:t xml:space="preserve"> private network of class A</w:t>
-      </w:r>
-    </w:p>
-    <w:p>
-      <w:pPr>
-        <w:spacing w:before="200"/>
-        <w:rPr>
-          <w:color w:val="EE0000"/>
-        </w:rPr>
-      </w:pPr>
-      <w:r>
-        <w:rPr>
-          <w:color w:val="EE0000"/>
-        </w:rPr>
-        <w:t>SITE 01</w:t>
-      </w:r>
-      <w:r>
-        <w:rPr>
-          <w:color w:val="EE0000"/>
-        </w:rPr>
-        <w:t xml:space="preserve"> – Summary 10.1.0.0/20</w:t>
+        <w:t xml:space="preserve">Assigned Public IP block - </w:t>
+      </w:r>
+      <w:r>
+        <w:rPr>
+          <w:color w:val="00B0F0"/>
+        </w:rPr>
+        <w:t>203.0.113.0/29</w:t>
+      </w:r>
+    </w:p>
+    <w:p>
+      <w:pPr>
+        <w:spacing w:before="200"/>
+        <w:rPr>
+          <w:color w:val="00B0F0"/>
+          <w:lang w:val="en-US"/>
+        </w:rPr>
+      </w:pPr>
+      <w:r>
+        <w:rPr>
+          <w:color w:val="00B0F0"/>
+          <w:lang w:val="en-US"/>
+        </w:rPr>
+        <w:t>ISP BGP ASN 6500</w:t>
+      </w:r>
+    </w:p>
+    <w:p>
+      <w:pPr>
+        <w:spacing w:before="200"/>
+        <w:rPr>
+          <w:color w:val="00B0F0"/>
+          <w:lang w:val="en-US"/>
+        </w:rPr>
+      </w:pPr>
+      <w:r>
+        <w:rPr>
+          <w:color w:val="00B0F0"/>
+          <w:lang w:val="en-US"/>
+        </w:rPr>
+        <w:t>LOCAL BGL ASN 65001</w:t>
+      </w:r>
+    </w:p>
+    <w:p>
+      <w:pPr>
+        <w:spacing w:before="200"/>
+        <w:rPr>
+          <w:color w:val="EE0000"/>
+          <w:lang w:val="en-US"/>
+        </w:rPr>
+      </w:pPr>
+      <w:r>
+        <w:rPr>
+          <w:color w:val="EE0000"/>
+          <w:lang w:val="en-US"/>
+        </w:rPr>
+        <w:t>VLAN – Subnet mapping private network of class A</w:t>
+      </w:r>
+    </w:p>
+    <w:p>
+      <w:pPr>
+        <w:spacing w:before="200"/>
+        <w:rPr>
+          <w:color w:val="EE0000"/>
+          <w:lang w:val="en-US"/>
+        </w:rPr>
+      </w:pPr>
+      <w:r>
+        <w:rPr>
+          <w:color w:val="EE0000"/>
+          <w:lang w:val="en-US"/>
+        </w:rPr>
+        <w:t xml:space="preserve">SITE 01 – </w:t>
+      </w:r>
+      <w:r>
+        <w:rPr>
+          <w:color w:val="EE0000"/>
+          <w:lang w:val="en-US"/>
+        </w:rPr>
+        <w:t>WIRED_SUM = 10.1.0.0/20, WIFI_S</w:t>
+      </w:r>
+      <w:r>
+        <w:rPr>
+          <w:color w:val="EE0000"/>
+          <w:lang w:val="en-US"/>
+        </w:rPr>
+        <w:t>UM = is not summarized to route to the WLC</w:t>
       </w:r>
     </w:p>
     <w:p>
@@ -464,31 +520,7 @@
         <w:rPr>
           <w:color w:val="EE0000"/>
         </w:rPr>
-        <w:t xml:space="preserve">VLAN 10 (MANAGEMENT) – </w:t>
-      </w:r>
-      <w:r>
-        <w:rPr>
-          <w:color w:val="EE0000"/>
-        </w:rPr>
-        <w:t>10.</w:t>
-      </w:r>
-      <w:r>
-        <w:rPr>
-          <w:color w:val="EE0000"/>
-        </w:rPr>
-        <w:t>1</w:t>
-      </w:r>
-      <w:r>
-        <w:rPr>
-          <w:color w:val="EE0000"/>
-        </w:rPr>
-        <w:t>.0.0</w:t>
-      </w:r>
-      <w:r>
-        <w:rPr>
-          <w:color w:val="EE0000"/>
-        </w:rPr>
-        <w:t>/24</w:t>
+        <w:t>VLAN 10 (MANAGEMENT) – 10.1.0.0/24</w:t>
       </w:r>
     </w:p>
     <w:p>
@@ -506,31 +538,7 @@
         <w:rPr>
           <w:color w:val="EE0000"/>
         </w:rPr>
-        <w:t xml:space="preserve">VLAN 20 (FINANCE/ACCOUNTING) – </w:t>
-      </w:r>
-      <w:r>
-        <w:rPr>
-          <w:color w:val="EE0000"/>
-        </w:rPr>
-        <w:t>10.</w:t>
-      </w:r>
-      <w:r>
-        <w:rPr>
-          <w:color w:val="EE0000"/>
-        </w:rPr>
-        <w:t>1</w:t>
-      </w:r>
-      <w:r>
-        <w:rPr>
-          <w:color w:val="EE0000"/>
-        </w:rPr>
-        <w:t>.1.0</w:t>
-      </w:r>
-      <w:r>
-        <w:rPr>
-          <w:color w:val="EE0000"/>
-        </w:rPr>
-        <w:t>/24</w:t>
+        <w:t>VLAN 20 (FINANCE/ACCOUNTING) – 10.1.1.0/24</w:t>
       </w:r>
     </w:p>
     <w:p>
@@ -548,31 +556,7 @@
         <w:rPr>
           <w:color w:val="EE0000"/>
         </w:rPr>
-        <w:t xml:space="preserve">VLAN 50 (VoIP) – </w:t>
-      </w:r>
-      <w:r>
-        <w:rPr>
-          <w:color w:val="EE0000"/>
-        </w:rPr>
-        <w:t>10.</w:t>
-      </w:r>
-      <w:r>
-        <w:rPr>
-          <w:color w:val="EE0000"/>
-        </w:rPr>
-        <w:t>1</w:t>
-      </w:r>
-      <w:r>
-        <w:rPr>
-          <w:color w:val="EE0000"/>
-        </w:rPr>
-        <w:t>.2.0</w:t>
-      </w:r>
-      <w:r>
-        <w:rPr>
-          <w:color w:val="EE0000"/>
-        </w:rPr>
-        <w:t>/23</w:t>
+        <w:t>VLAN 50 (VoIP) – 10.1.2.0/23</w:t>
       </w:r>
     </w:p>
     <w:p>
@@ -590,31 +574,7 @@
         <w:rPr>
           <w:color w:val="EE0000"/>
         </w:rPr>
-        <w:t xml:space="preserve">VLAN 80 (Access Points) – </w:t>
-      </w:r>
-      <w:r>
-        <w:rPr>
-          <w:color w:val="EE0000"/>
-        </w:rPr>
-        <w:t>10.</w:t>
-      </w:r>
-      <w:r>
-        <w:rPr>
-          <w:color w:val="EE0000"/>
-        </w:rPr>
-        <w:t>1</w:t>
-      </w:r>
-      <w:r>
-        <w:rPr>
-          <w:color w:val="EE0000"/>
-        </w:rPr>
-        <w:t>.6.0</w:t>
-      </w:r>
-      <w:r>
-        <w:rPr>
-          <w:color w:val="EE0000"/>
-        </w:rPr>
-        <w:t>/24</w:t>
+        <w:t>VLAN 80 (Access Points) – 10.1.6.0/24</w:t>
       </w:r>
     </w:p>
     <w:p>
@@ -632,43 +592,7 @@
         <w:rPr>
           <w:color w:val="EE0000"/>
         </w:rPr>
-        <w:t>VLAN 100 (CORP-WIFI</w:t>
-      </w:r>
-      <w:r>
-        <w:rPr>
-          <w:color w:val="EE0000"/>
-        </w:rPr>
-        <w:t>-AAA</w:t>
-      </w:r>
-      <w:r>
-        <w:rPr>
-          <w:color w:val="EE0000"/>
-        </w:rPr>
-        <w:t xml:space="preserve">) – </w:t>
-      </w:r>
-      <w:r>
-        <w:rPr>
-          <w:color w:val="EE0000"/>
-        </w:rPr>
-        <w:t>10.</w:t>
-      </w:r>
-      <w:r>
-        <w:rPr>
-          <w:color w:val="EE0000"/>
-        </w:rPr>
-        <w:t>1</w:t>
-      </w:r>
-      <w:r>
-        <w:rPr>
-          <w:color w:val="EE0000"/>
-        </w:rPr>
-        <w:t>.4.0</w:t>
-      </w:r>
-      <w:r>
-        <w:rPr>
-          <w:color w:val="EE0000"/>
-        </w:rPr>
-        <w:t>/23</w:t>
+        <w:t>VLAN 99 (MGMT) – 10.1.9.0/24</w:t>
       </w:r>
     </w:p>
     <w:p>
@@ -686,31 +610,7 @@
         <w:rPr>
           <w:color w:val="EE0000"/>
         </w:rPr>
-        <w:t xml:space="preserve">VLAN 110 (CORP-WIFI-PSK) – </w:t>
-      </w:r>
-      <w:r>
-        <w:rPr>
-          <w:color w:val="EE0000"/>
-        </w:rPr>
-        <w:t>10.</w:t>
-      </w:r>
-      <w:r>
-        <w:rPr>
-          <w:color w:val="EE0000"/>
-        </w:rPr>
-        <w:t>1</w:t>
-      </w:r>
-      <w:r>
-        <w:rPr>
-          <w:color w:val="EE0000"/>
-        </w:rPr>
-        <w:t>.7.0</w:t>
-      </w:r>
-      <w:r>
-        <w:rPr>
-          <w:color w:val="EE0000"/>
-        </w:rPr>
-        <w:t>/24</w:t>
+        <w:t>VLAN 100 (CORP-WIFI-AAA) – 10.1.4.0/23</w:t>
       </w:r>
     </w:p>
     <w:p>
@@ -728,31 +628,37 @@
         <w:rPr>
           <w:color w:val="EE0000"/>
         </w:rPr>
-        <w:t xml:space="preserve">VLAN 120 (GUEST-WIFI) – </w:t>
-      </w:r>
-      <w:r>
-        <w:rPr>
-          <w:color w:val="EE0000"/>
-        </w:rPr>
-        <w:t>10.</w:t>
-      </w:r>
-      <w:r>
-        <w:rPr>
-          <w:color w:val="EE0000"/>
-        </w:rPr>
-        <w:t>1</w:t>
-      </w:r>
-      <w:r>
-        <w:rPr>
-          <w:color w:val="EE0000"/>
-        </w:rPr>
-        <w:t>.8.0</w:t>
-      </w:r>
-      <w:r>
-        <w:rPr>
-          <w:color w:val="EE0000"/>
-        </w:rPr>
-        <w:t>/24</w:t>
+        <w:t>VLAN 110 (CORP-WIFI-PSK) – 10.1.7.0/24</w:t>
+      </w:r>
+    </w:p>
+    <w:p>
+      <w:pPr>
+        <w:numPr>
+          <w:ilvl w:val="0"/>
+          <w:numId w:val="2"/>
+        </w:numPr>
+        <w:spacing w:before="200"/>
+        <w:rPr>
+          <w:color w:val="EE0000"/>
+        </w:rPr>
+      </w:pPr>
+      <w:r>
+        <w:rPr>
+          <w:color w:val="EE0000"/>
+        </w:rPr>
+        <w:t>VLAN 120 (</w:t>
+      </w:r>
+      <w:r>
+        <w:rPr>
+          <w:color w:val="EE0000"/>
+        </w:rPr>
+        <w:t>CORP-</w:t>
+      </w:r>
+      <w:r>
+        <w:rPr>
+          <w:color w:val="EE0000"/>
+        </w:rPr>
+        <w:t>GUEST-WIFI) – 10.1.8.0/24</w:t>
       </w:r>
     </w:p>
     <w:p>
@@ -786,19 +692,7 @@
         <w:rPr>
           <w:color w:val="EE0000"/>
         </w:rPr>
-        <w:t>VLAN 38 (DMZ) – 10.0.</w:t>
-      </w:r>
-      <w:r>
-        <w:rPr>
-          <w:color w:val="EE0000"/>
-        </w:rPr>
-        <w:t>1</w:t>
-      </w:r>
-      <w:r>
-        <w:rPr>
-          <w:color w:val="EE0000"/>
-        </w:rPr>
-        <w:t>.0/24</w:t>
+        <w:t>VLAN 38 (DMZ) – 10.0.1.0/24</w:t>
       </w:r>
     </w:p>
     <w:p>
@@ -816,25 +710,7 @@
         <w:rPr>
           <w:color w:val="EE0000"/>
         </w:rPr>
-        <w:t xml:space="preserve">VLAN 42 (WLC) – </w:t>
-      </w:r>
-      <w:r>
-        <w:rPr>
-          <w:color w:val="EE0000"/>
-        </w:rPr>
-        <w:t>10.0.2.0</w:t>
-      </w:r>
-      <w:r>
-        <w:rPr>
-          <w:color w:val="EE0000"/>
-        </w:rPr>
-        <w:t>/</w:t>
-      </w:r>
-      <w:r>
-        <w:rPr>
-          <w:color w:val="EE0000"/>
-        </w:rPr>
-        <w:t>24</w:t>
+        <w:t>VLAN 42 (WLC) – 10.0.2.0/24</w:t>
       </w:r>
     </w:p>
     <w:p>
@@ -864,6 +740,26 @@
         <w:spacing w:before="200"/>
         <w:rPr>
           <w:color w:val="EE0000"/>
+          <w:lang w:val="en-US"/>
+        </w:rPr>
+      </w:pPr>
+      <w:r>
+        <w:rPr>
+          <w:color w:val="EE0000"/>
+          <w:lang w:val="en-US"/>
+        </w:rPr>
+        <w:t>MGMT LOOPBACK BLOCK (L3 device Router IDs) – 10.0.5.0/24</w:t>
+      </w:r>
+    </w:p>
+    <w:p>
+      <w:pPr>
+        <w:numPr>
+          <w:ilvl w:val="0"/>
+          <w:numId w:val="4"/>
+        </w:numPr>
+        <w:spacing w:before="200"/>
+        <w:rPr>
+          <w:color w:val="EE0000"/>
         </w:rPr>
       </w:pPr>
       <w:r>
@@ -908,34 +804,33 @@
         <w:rPr>
           <w:color w:val="EE0000"/>
         </w:rPr>
-        <w:t xml:space="preserve">-1. ISP – </w:t>
-      </w:r>
-      <w:r>
-        <w:rPr>
-          <w:color w:val="EE0000"/>
-        </w:rPr>
-        <w:t xml:space="preserve">WAN-R1 </w:t>
-      </w:r>
-      <w:r>
-        <w:rPr>
-          <w:color w:val="EE0000"/>
-          <w:lang w:val="en-US"/>
-        </w:rPr>
-        <w:t>(10.0.0.5</w:t>
-      </w:r>
-      <w:r>
-        <w:rPr>
-          <w:color w:val="EE0000"/>
-          <w:lang w:val="en-US"/>
-        </w:rPr>
-        <w:t>6</w:t>
-      </w:r>
-      <w:r>
-        <w:rPr>
-          <w:color w:val="EE0000"/>
-          <w:lang w:val="en-US"/>
-        </w:rPr>
-        <w:t>/30)</w:t>
+        <w:t>0</w:t>
+      </w:r>
+      <w:r>
+        <w:rPr>
+          <w:color w:val="EE0000"/>
+        </w:rPr>
+        <w:t xml:space="preserve">. ISP – WAN-R1 </w:t>
+      </w:r>
+      <w:r>
+        <w:rPr>
+          <w:color w:val="EE0000"/>
+          <w:lang w:val="en-US"/>
+        </w:rPr>
+        <w:t>(</w:t>
+      </w:r>
+      <w:r>
+        <w:rPr>
+          <w:color w:val="EE0000"/>
+        </w:rPr>
+        <w:t>172.16.100.0/30</w:t>
+      </w:r>
+      <w:r>
+        <w:rPr>
+          <w:color w:val="EE0000"/>
+          <w:lang w:val="en-US"/>
+        </w:rPr>
+        <w:t>)</w:t>
       </w:r>
     </w:p>
     <w:p>
@@ -953,19 +848,25 @@
         <w:rPr>
           <w:color w:val="EE0000"/>
         </w:rPr>
-        <w:t xml:space="preserve">0. </w:t>
-      </w:r>
-      <w:r>
-        <w:rPr>
-          <w:color w:val="EE0000"/>
-        </w:rPr>
-        <w:t>WAN-R1</w:t>
-      </w:r>
-      <w:r>
-        <w:rPr>
-          <w:color w:val="EE0000"/>
-        </w:rPr>
-        <w:t xml:space="preserve"> – FW (203.0.113.0/30)</w:t>
+        <w:t>1</w:t>
+      </w:r>
+      <w:r>
+        <w:rPr>
+          <w:color w:val="EE0000"/>
+        </w:rPr>
+        <w:t>. WAN-R1 – FW (</w:t>
+      </w:r>
+      <w:r>
+        <w:rPr>
+          <w:color w:val="EE0000"/>
+        </w:rPr>
+        <w:t>10.0.0.0/30</w:t>
+      </w:r>
+      <w:r>
+        <w:rPr>
+          <w:color w:val="EE0000"/>
+        </w:rPr>
+        <w:t>)</w:t>
       </w:r>
     </w:p>
     <w:p>
@@ -983,7 +884,7 @@
         <w:rPr>
           <w:color w:val="EE0000"/>
         </w:rPr>
-        <w:t>1. FW – DMZ-SW (10.0.0.0/30)</w:t>
+        <w:t>2. FW – CORE-R1 (10.0.0.4/30)</w:t>
       </w:r>
     </w:p>
     <w:p>
@@ -1001,7 +902,7 @@
         <w:rPr>
           <w:color w:val="EE0000"/>
         </w:rPr>
-        <w:t>2. FW – CORE-R1 (10.0.0.4/30)</w:t>
+        <w:t>3. FW – CORE-R2 (10.0.0.8/30)</w:t>
       </w:r>
     </w:p>
     <w:p>
@@ -1013,13 +914,33 @@
         <w:spacing w:before="200"/>
         <w:rPr>
           <w:color w:val="EE0000"/>
-        </w:rPr>
-      </w:pPr>
-      <w:r>
-        <w:rPr>
-          <w:color w:val="EE0000"/>
-        </w:rPr>
-        <w:t>3. FW – CORE-R2 (10.0.0.8/30)</w:t>
+          <w:lang w:val="en-US"/>
+        </w:rPr>
+      </w:pPr>
+      <w:r>
+        <w:rPr>
+          <w:b/>
+          <w:bCs/>
+          <w:color w:val="EE0000"/>
+          <w:lang w:val="en-US"/>
+        </w:rPr>
+        <w:t>Server room</w:t>
+      </w:r>
+      <w:r>
+        <w:rPr>
+          <w:color w:val="EE0000"/>
+          <w:lang w:val="en-US"/>
+        </w:rPr>
+        <w:br/>
+        <w:t>4. SRVRM-SW1 – CORE-R1 (10.0.0.12/30)</w:t>
+      </w:r>
+      <w:r>
+        <w:rPr>
+          <w:color w:val="EE0000"/>
+          <w:lang w:val="en-US"/>
+        </w:rPr>
+        <w:br/>
+        <w:t>5. SRVRM-SW1 – CORE-R2 (10.0.0.16/30)</w:t>
       </w:r>
     </w:p>
     <w:p>
@@ -1041,7 +962,7 @@
           <w:color w:val="EE0000"/>
           <w:lang w:val="en-US"/>
         </w:rPr>
-        <w:t>Server room</w:t>
+        <w:t>Core</w:t>
       </w:r>
       <w:r>
         <w:rPr>
@@ -1049,15 +970,7 @@
           <w:lang w:val="en-US"/>
         </w:rPr>
         <w:br/>
-        <w:t>4. SRVRM-SW1 – CORE-R1 (10.0.0.12/30)</w:t>
-      </w:r>
-      <w:r>
-        <w:rPr>
-          <w:color w:val="EE0000"/>
-          <w:lang w:val="en-US"/>
-        </w:rPr>
-        <w:br/>
-        <w:t>5. SRVRM-SW1 – CORE-R2 (10.0.0.16/30)</w:t>
+        <w:t>6. CORE-R1 – CORE-R2 (10.0.0.20/30)</w:t>
       </w:r>
     </w:p>
     <w:p>
@@ -1068,7 +981,6 @@
         </w:numPr>
         <w:spacing w:before="200"/>
         <w:rPr>
-          <w:color w:val="EE0000"/>
           <w:lang w:val="en-US"/>
         </w:rPr>
       </w:pPr>
@@ -1079,7 +991,8 @@
           <w:color w:val="EE0000"/>
           <w:lang w:val="en-US"/>
         </w:rPr>
-        <w:t>Core</w:t>
+        <w:lastRenderedPageBreak/>
+        <w:t>Core → Distribution (full mesh, both sites)</w:t>
       </w:r>
       <w:r>
         <w:rPr>
@@ -1087,7 +1000,64 @@
           <w:lang w:val="en-US"/>
         </w:rPr>
         <w:br/>
-        <w:t>6. CORE-R1 – CORE-R2 (10.0.0.20/30)</w:t>
+        <w:t>7. CORE-R1 – DSW01-SITE01 (10.0.0.24/30)</w:t>
+      </w:r>
+      <w:r>
+        <w:rPr>
+          <w:color w:val="EE0000"/>
+          <w:lang w:val="en-US"/>
+        </w:rPr>
+        <w:br/>
+        <w:t>8. CORE-R1 – DSW02-SITE01 (10.0.0.28/30)</w:t>
+      </w:r>
+      <w:r>
+        <w:rPr>
+          <w:lang w:val="en-US"/>
+        </w:rPr>
+        <w:br/>
+        <w:t>9. CORE-R1 – DSW01-SITE02 (10.0.0.32/30)</w:t>
+      </w:r>
+      <w:r>
+        <w:rPr>
+          <w:lang w:val="en-US"/>
+        </w:rPr>
+        <w:br/>
+        <w:t>10. CORE-R1 – DSW02-SITE02 (10.0.0.36/30)</w:t>
+      </w:r>
+      <w:r>
+        <w:rPr>
+          <w:lang w:val="en-US"/>
+        </w:rPr>
+        <w:br/>
+      </w:r>
+      <w:r>
+        <w:rPr>
+          <w:color w:val="EE0000"/>
+          <w:lang w:val="en-US"/>
+        </w:rPr>
+        <w:t>11. CORE-R2 – DSW01-SITE01 (10.0.0.40/30)</w:t>
+      </w:r>
+      <w:r>
+        <w:rPr>
+          <w:color w:val="EE0000"/>
+          <w:lang w:val="en-US"/>
+        </w:rPr>
+        <w:br/>
+        <w:t>12. CORE-R2 – DSW02-SITE01 (10.0.0.44/30)</w:t>
+      </w:r>
+      <w:r>
+        <w:rPr>
+          <w:lang w:val="en-US"/>
+        </w:rPr>
+        <w:br/>
+        <w:t xml:space="preserve">13. CORE-R2 – DSW01-SITE02 (10.0.0.48/30) </w:t>
+      </w:r>
+      <w:r>
+        <w:rPr>
+          <w:lang w:val="en-US"/>
+        </w:rPr>
+        <w:br/>
+        <w:t>14. CORE-R2 – DSW02-SITE02 (10.0.0.52/30)</w:t>
       </w:r>
     </w:p>
     <w:p>
@@ -1105,345 +1075,43 @@
         <w:rPr>
           <w:b/>
           <w:bCs/>
-          <w:color w:val="EE0000"/>
-          <w:lang w:val="en-US"/>
-        </w:rPr>
-        <w:t>Core → Distribution (full mesh, both sites)</w:t>
-      </w:r>
-      <w:r>
-        <w:rPr>
-          <w:color w:val="EE0000"/>
+          <w:lang w:val="en-US"/>
+        </w:rPr>
+        <w:t>Intra-distribution (per site)</w:t>
+      </w:r>
+      <w:r>
+        <w:rPr>
           <w:lang w:val="en-US"/>
         </w:rPr>
         <w:br/>
-        <w:t>7. CORE-R1 – DSW01-SITE01 (10.0.0.24/30)</w:t>
-      </w:r>
-      <w:r>
-        <w:rPr>
-          <w:color w:val="EE0000"/>
+      </w:r>
+      <w:r>
+        <w:rPr>
+          <w:color w:val="EE0000"/>
+          <w:lang w:val="en-US"/>
+        </w:rPr>
+        <w:t>15. DSW01-SITE01 – DSW02-SITE01 (port-channel) (10.0.0.56/30)</w:t>
+      </w:r>
+      <w:r>
+        <w:rPr>
           <w:lang w:val="en-US"/>
         </w:rPr>
         <w:br/>
-        <w:t>8. CORE-R1 – DSW02-SITE01 (10.0.0.28/30)</w:t>
-      </w:r>
-      <w:r>
-        <w:rPr>
-          <w:lang w:val="en-US"/>
-        </w:rPr>
-        <w:br/>
-      </w:r>
-      <w:r>
-        <w:rPr>
-          <w:lang w:val="en-US"/>
-        </w:rPr>
-        <w:t>9</w:t>
-      </w:r>
-      <w:r>
-        <w:rPr>
-          <w:lang w:val="en-US"/>
-        </w:rPr>
-        <w:t>. CORE-R1 – DSW01-SITE02</w:t>
-      </w:r>
-      <w:r>
-        <w:rPr>
-          <w:lang w:val="en-US"/>
-        </w:rPr>
-        <w:t xml:space="preserve"> </w:t>
-      </w:r>
-      <w:r>
-        <w:rPr>
-          <w:lang w:val="en-US"/>
-        </w:rPr>
-        <w:t>(10.0.0.</w:t>
-      </w:r>
-      <w:r>
-        <w:rPr>
-          <w:lang w:val="en-US"/>
-        </w:rPr>
-        <w:t>32</w:t>
-      </w:r>
-      <w:r>
-        <w:rPr>
-          <w:lang w:val="en-US"/>
-        </w:rPr>
-        <w:t>/30)</w:t>
-      </w:r>
-      <w:r>
-        <w:rPr>
-          <w:lang w:val="en-US"/>
-        </w:rPr>
-        <w:br/>
-      </w:r>
-      <w:r>
-        <w:rPr>
-          <w:lang w:val="en-US"/>
-        </w:rPr>
-        <w:t>10</w:t>
-      </w:r>
-      <w:r>
-        <w:rPr>
-          <w:lang w:val="en-US"/>
-        </w:rPr>
-        <w:t>. CORE-R1 – DSW02-SITE02</w:t>
-      </w:r>
-      <w:r>
-        <w:rPr>
-          <w:lang w:val="en-US"/>
-        </w:rPr>
-        <w:t xml:space="preserve"> </w:t>
-      </w:r>
-      <w:r>
-        <w:rPr>
-          <w:lang w:val="en-US"/>
-        </w:rPr>
-        <w:t>(10.0.0.</w:t>
-      </w:r>
-      <w:r>
-        <w:rPr>
-          <w:lang w:val="en-US"/>
-        </w:rPr>
-        <w:t>36</w:t>
-      </w:r>
-      <w:r>
-        <w:rPr>
-          <w:lang w:val="en-US"/>
-        </w:rPr>
-        <w:t>/30)</w:t>
-      </w:r>
-      <w:r>
-        <w:rPr>
-          <w:lang w:val="en-US"/>
-        </w:rPr>
-        <w:br/>
-      </w:r>
-      <w:r>
-        <w:rPr>
-          <w:color w:val="EE0000"/>
-          <w:lang w:val="en-US"/>
-        </w:rPr>
-        <w:t>11. CORE-R2 – DSW01-SITE01 (10.0.0.40/30)</w:t>
-      </w:r>
-      <w:r>
-        <w:rPr>
-          <w:color w:val="EE0000"/>
-          <w:lang w:val="en-US"/>
-        </w:rPr>
-        <w:br/>
-      </w:r>
-      <w:r>
-        <w:rPr>
-          <w:color w:val="EE0000"/>
-          <w:lang w:val="en-US"/>
-        </w:rPr>
-        <w:lastRenderedPageBreak/>
-        <w:t>12. CORE-R2 – DSW02-SITE01 (10.0.0.44/30)</w:t>
-      </w:r>
-      <w:r>
-        <w:rPr>
-          <w:lang w:val="en-US"/>
-        </w:rPr>
-        <w:br/>
-        <w:t>1</w:t>
-      </w:r>
-      <w:r>
-        <w:rPr>
-          <w:lang w:val="en-US"/>
-        </w:rPr>
-        <w:t>3</w:t>
-      </w:r>
-      <w:r>
-        <w:rPr>
-          <w:lang w:val="en-US"/>
-        </w:rPr>
-        <w:t>. CORE-R2 – DSW01-SITE02</w:t>
-      </w:r>
-      <w:r>
-        <w:rPr>
-          <w:lang w:val="en-US"/>
-        </w:rPr>
-        <w:t xml:space="preserve"> </w:t>
-      </w:r>
-      <w:r>
-        <w:rPr>
-          <w:lang w:val="en-US"/>
-        </w:rPr>
-        <w:t>(10.0.0.</w:t>
-      </w:r>
-      <w:r>
-        <w:rPr>
-          <w:lang w:val="en-US"/>
-        </w:rPr>
-        <w:t>48</w:t>
-      </w:r>
-      <w:r>
-        <w:rPr>
-          <w:lang w:val="en-US"/>
-        </w:rPr>
-        <w:t>/30)</w:t>
-      </w:r>
-      <w:r>
-        <w:rPr>
-          <w:lang w:val="en-US"/>
-        </w:rPr>
-        <w:t xml:space="preserve"> </w:t>
-      </w:r>
-      <w:r>
-        <w:rPr>
-          <w:lang w:val="en-US"/>
-        </w:rPr>
-        <w:br/>
-        <w:t>1</w:t>
-      </w:r>
-      <w:r>
-        <w:rPr>
-          <w:lang w:val="en-US"/>
-        </w:rPr>
-        <w:t>4</w:t>
-      </w:r>
-      <w:r>
-        <w:rPr>
-          <w:lang w:val="en-US"/>
-        </w:rPr>
-        <w:t>. CORE-R2 – DSW02-SITE02</w:t>
-      </w:r>
-      <w:r>
-        <w:rPr>
-          <w:lang w:val="en-US"/>
-        </w:rPr>
-        <w:t xml:space="preserve"> </w:t>
-      </w:r>
-      <w:r>
-        <w:rPr>
-          <w:lang w:val="en-US"/>
-        </w:rPr>
-        <w:t>(10.0.0.</w:t>
-      </w:r>
-      <w:r>
-        <w:rPr>
-          <w:lang w:val="en-US"/>
-        </w:rPr>
-        <w:t>52</w:t>
-      </w:r>
-      <w:r>
-        <w:rPr>
-          <w:lang w:val="en-US"/>
-        </w:rPr>
-        <w:t>/30)</w:t>
-      </w:r>
-    </w:p>
-    <w:p>
-      <w:pPr>
-        <w:numPr>
-          <w:ilvl w:val="1"/>
-          <w:numId w:val="4"/>
-        </w:numPr>
-        <w:spacing w:before="200"/>
-        <w:rPr>
-          <w:lang w:val="en-US"/>
-        </w:rPr>
-      </w:pPr>
-      <w:r>
-        <w:rPr>
-          <w:b/>
-          <w:bCs/>
-          <w:lang w:val="en-US"/>
-        </w:rPr>
-        <w:t>Intra-distribution (per site)</w:t>
-      </w:r>
-      <w:r>
-        <w:rPr>
-          <w:lang w:val="en-US"/>
-        </w:rPr>
-        <w:br/>
-      </w:r>
-      <w:r>
-        <w:rPr>
-          <w:color w:val="EE0000"/>
-          <w:lang w:val="en-US"/>
-        </w:rPr>
-        <w:t>15. DSW01-SITE01 – DSW02-SITE01 (port-channel)</w:t>
-      </w:r>
-      <w:r>
-        <w:rPr>
-          <w:color w:val="EE0000"/>
-          <w:lang w:val="en-US"/>
-        </w:rPr>
-        <w:t xml:space="preserve"> (10.0.0.56/30)</w:t>
-      </w:r>
-      <w:r>
-        <w:rPr>
-          <w:lang w:val="en-US"/>
-        </w:rPr>
-        <w:br/>
-        <w:t>1</w:t>
-      </w:r>
-      <w:r>
-        <w:rPr>
-          <w:lang w:val="en-US"/>
-        </w:rPr>
-        <w:t>6</w:t>
-      </w:r>
-      <w:r>
-        <w:rPr>
-          <w:lang w:val="en-US"/>
-        </w:rPr>
-        <w:t>. DSW01-SITE02 – DSW02-SITE02 (port-channel)</w:t>
-      </w:r>
-      <w:r>
-        <w:rPr>
-          <w:lang w:val="en-US"/>
-        </w:rPr>
-        <w:t xml:space="preserve"> </w:t>
-      </w:r>
-      <w:r>
-        <w:rPr>
-          <w:lang w:val="en-US"/>
-        </w:rPr>
-        <w:t>(10.0.0.</w:t>
-      </w:r>
-      <w:r>
-        <w:rPr>
-          <w:lang w:val="en-US"/>
-        </w:rPr>
-        <w:t>60</w:t>
-      </w:r>
-      <w:r>
-        <w:rPr>
-          <w:lang w:val="en-US"/>
-        </w:rPr>
-        <w:t>/30)</w:t>
-      </w:r>
-    </w:p>
-    <w:p>
-      <w:pPr>
-        <w:spacing w:before="200"/>
-        <w:rPr>
-          <w:lang w:val="en-US"/>
-        </w:rPr>
-      </w:pPr>
-      <w:r>
-        <w:rPr>
-          <w:lang w:val="en-US"/>
-        </w:rPr>
-        <w:t>SITE 02</w:t>
-      </w:r>
-      <w:r>
-        <w:rPr>
-          <w:lang w:val="en-US"/>
-        </w:rPr>
-        <w:t xml:space="preserve"> Summary 10.2.0.0/20</w:t>
-      </w:r>
-      <w:r>
-        <w:rPr>
-          <w:lang w:val="en-US"/>
-        </w:rPr>
-        <w:t xml:space="preserve"> – does not e</w:t>
-      </w:r>
-      <w:r>
-        <w:rPr>
-          <w:lang w:val="en-US"/>
-        </w:rPr>
-        <w:t>xist in CML</w:t>
+        <w:t>16. DSW01-SITE02 – DSW02-SITE02 (port-channel) (10.0.0.60/30)</w:t>
+      </w:r>
+    </w:p>
+    <w:p>
+      <w:pPr>
+        <w:spacing w:before="200"/>
+        <w:rPr>
+          <w:lang w:val="en-US"/>
+        </w:rPr>
+      </w:pPr>
+      <w:r>
+        <w:rPr>
+          <w:lang w:val="en-US"/>
+        </w:rPr>
+        <w:t>SITE 02 Summary 10.2.0.0/20 – does not exist in CML</w:t>
       </w:r>
     </w:p>
     <w:p>
@@ -1455,31 +1123,7 @@
         <w:spacing w:before="200"/>
       </w:pPr>
       <w:r>
-        <w:t xml:space="preserve">VLAN </w:t>
-      </w:r>
-      <w:r>
-        <w:t>1</w:t>
-      </w:r>
-      <w:r>
-        <w:t xml:space="preserve">0 (SALES/MARKETING) – </w:t>
-      </w:r>
-      <w:r>
-        <w:t>10.</w:t>
-      </w:r>
-      <w:r>
-        <w:t>2</w:t>
-      </w:r>
-      <w:r>
-        <w:t>.</w:t>
-      </w:r>
-      <w:r>
-        <w:t>0</w:t>
-      </w:r>
-      <w:r>
-        <w:t>.0</w:t>
-      </w:r>
-      <w:r>
-        <w:t>/24</w:t>
+        <w:t>VLAN 10 (SALES/MARKETING) – 10.2.0.0/24</w:t>
       </w:r>
     </w:p>
     <w:p>
@@ -1491,31 +1135,7 @@
         <w:spacing w:before="200"/>
       </w:pPr>
       <w:r>
-        <w:t xml:space="preserve">VLAN </w:t>
-      </w:r>
-      <w:r>
-        <w:t>2</w:t>
-      </w:r>
-      <w:r>
-        <w:t xml:space="preserve">0 (ENGINEERING/R&amp;D) – </w:t>
-      </w:r>
-      <w:r>
-        <w:t>10.</w:t>
-      </w:r>
-      <w:r>
-        <w:t>2</w:t>
-      </w:r>
-      <w:r>
-        <w:t>.</w:t>
-      </w:r>
-      <w:r>
-        <w:t>1</w:t>
-      </w:r>
-      <w:r>
-        <w:t>.0</w:t>
-      </w:r>
-      <w:r>
-        <w:t>/24</w:t>
+        <w:t>VLAN 20 (ENGINEERING/R&amp;D) – 10.2.1.0/24</w:t>
       </w:r>
     </w:p>
     <w:p>
@@ -1527,25 +1147,7 @@
         <w:spacing w:before="200"/>
       </w:pPr>
       <w:r>
-        <w:t xml:space="preserve">VLAN 50 (VoIP) – </w:t>
-      </w:r>
-      <w:r>
-        <w:t>10.</w:t>
-      </w:r>
-      <w:r>
-        <w:t>2</w:t>
-      </w:r>
-      <w:r>
-        <w:t>.</w:t>
-      </w:r>
-      <w:r>
-        <w:t>2</w:t>
-      </w:r>
-      <w:r>
-        <w:t>.0</w:t>
-      </w:r>
-      <w:r>
-        <w:t>/23</w:t>
+        <w:t>VLAN 50 (VoIP) – 10.2.2.0/23</w:t>
       </w:r>
     </w:p>
     <w:p>
@@ -1557,25 +1159,7 @@
         <w:spacing w:before="200"/>
       </w:pPr>
       <w:r>
-        <w:t xml:space="preserve">VLAN 80 (Access Points) – </w:t>
-      </w:r>
-      <w:r>
-        <w:t>10.</w:t>
-      </w:r>
-      <w:r>
-        <w:t>2</w:t>
-      </w:r>
-      <w:r>
-        <w:t>.</w:t>
-      </w:r>
-      <w:r>
-        <w:t>6</w:t>
-      </w:r>
-      <w:r>
-        <w:t>.0</w:t>
-      </w:r>
-      <w:r>
-        <w:t>/24</w:t>
+        <w:t>VLAN 80 (Access Points) – 10.2.6.0/24</w:t>
       </w:r>
     </w:p>
     <w:p>
@@ -1587,31 +1171,7 @@
         <w:spacing w:before="200"/>
       </w:pPr>
       <w:r>
-        <w:t>VLAN 100 (CORP-WIFI</w:t>
-      </w:r>
-      <w:r>
-        <w:t>-AAA</w:t>
-      </w:r>
-      <w:r>
-        <w:t xml:space="preserve">) – </w:t>
-      </w:r>
-      <w:r>
-        <w:t>10.</w:t>
-      </w:r>
-      <w:r>
-        <w:t>2</w:t>
-      </w:r>
-      <w:r>
-        <w:t>.</w:t>
-      </w:r>
-      <w:r>
-        <w:t>4</w:t>
-      </w:r>
-      <w:r>
-        <w:t>.0</w:t>
-      </w:r>
-      <w:r>
-        <w:t>/23</w:t>
+        <w:t>VLAN 99 (MGMT) – 10.2.9.0/24</w:t>
       </w:r>
     </w:p>
     <w:p>
@@ -1623,25 +1183,7 @@
         <w:spacing w:before="200"/>
       </w:pPr>
       <w:r>
-        <w:t xml:space="preserve">VLAN 110 (CORP-WIFI-PSK) – </w:t>
-      </w:r>
-      <w:r>
-        <w:t>10.</w:t>
-      </w:r>
-      <w:r>
-        <w:t>2</w:t>
-      </w:r>
-      <w:r>
-        <w:t>.</w:t>
-      </w:r>
-      <w:r>
-        <w:t>7</w:t>
-      </w:r>
-      <w:r>
-        <w:t>.0</w:t>
-      </w:r>
-      <w:r>
-        <w:t>/24</w:t>
+        <w:t>VLAN 100 (CORP-WIFI-AAA) – 10.2.4.0/23</w:t>
       </w:r>
     </w:p>
     <w:p>
@@ -1653,77 +1195,57 @@
         <w:spacing w:before="200"/>
       </w:pPr>
       <w:r>
-        <w:t xml:space="preserve">VLAN 120 (GUEST-WIFI) – </w:t>
-      </w:r>
-      <w:r>
-        <w:t>10.</w:t>
-      </w:r>
-      <w:r>
-        <w:t>2</w:t>
-      </w:r>
-      <w:r>
-        <w:t>.</w:t>
-      </w:r>
-      <w:r>
-        <w:t>8</w:t>
-      </w:r>
-      <w:r>
-        <w:t>.0</w:t>
-      </w:r>
-      <w:r>
-        <w:t>/24</w:t>
-      </w:r>
-    </w:p>
-    <w:p>
-      <w:pPr>
-        <w:spacing w:before="200"/>
-      </w:pPr>
-    </w:p>
-    <w:p>
-      <w:pPr>
-        <w:spacing w:before="200"/>
-        <w:rPr>
-          <w:lang w:val="en-US"/>
-        </w:rPr>
-      </w:pPr>
-    </w:p>
-    <w:p>
-      <w:pPr>
-        <w:spacing w:before="200"/>
-        <w:rPr>
-          <w:lang w:val="en-US"/>
-        </w:rPr>
-      </w:pPr>
-    </w:p>
-    <w:p>
-      <w:pPr>
-        <w:spacing w:before="200"/>
-        <w:rPr>
-          <w:lang w:val="en-US"/>
-        </w:rPr>
-      </w:pPr>
-    </w:p>
-    <w:p>
-      <w:pPr>
-        <w:spacing w:before="200"/>
-        <w:rPr>
-          <w:lang w:val="en-US"/>
-        </w:rPr>
-      </w:pPr>
-    </w:p>
-    <w:p>
-      <w:pPr>
-        <w:spacing w:before="200"/>
-        <w:rPr>
-          <w:lang w:val="en-US"/>
-        </w:rPr>
-      </w:pPr>
-      <w:r>
-        <w:rPr>
-          <w:lang w:val="en-US"/>
-        </w:rPr>
-        <w:t>IGP DESIGN</w:t>
-      </w:r>
+        <w:t>VLAN 110 (CORP-WIFI-PSK) – 10.2.7.0/24</w:t>
+      </w:r>
+    </w:p>
+    <w:p>
+      <w:pPr>
+        <w:numPr>
+          <w:ilvl w:val="0"/>
+          <w:numId w:val="3"/>
+        </w:numPr>
+        <w:spacing w:before="200"/>
+      </w:pPr>
+      <w:r>
+        <w:t>VLAN 120 (GUEST-WIFI) – 10.2.8.0/24</w:t>
+      </w:r>
+    </w:p>
+    <w:p>
+      <w:pPr>
+        <w:spacing w:before="200"/>
+      </w:pPr>
+    </w:p>
+    <w:p>
+      <w:pPr>
+        <w:spacing w:before="200"/>
+        <w:rPr>
+          <w:lang w:val="en-US"/>
+        </w:rPr>
+      </w:pPr>
+    </w:p>
+    <w:p>
+      <w:pPr>
+        <w:spacing w:before="200"/>
+        <w:rPr>
+          <w:lang w:val="en-US"/>
+        </w:rPr>
+      </w:pPr>
+    </w:p>
+    <w:p>
+      <w:pPr>
+        <w:spacing w:before="200"/>
+        <w:rPr>
+          <w:lang w:val="en-US"/>
+        </w:rPr>
+      </w:pPr>
+    </w:p>
+    <w:p>
+      <w:pPr>
+        <w:spacing w:before="200"/>
+        <w:rPr>
+          <w:lang w:val="en-US"/>
+        </w:rPr>
+      </w:pPr>
     </w:p>
     <w:p>
       <w:pPr>
@@ -3435,6 +2957,1512 @@
     </w:p>
     <w:p>
       <w:pPr>
+        <w:spacing w:before="200"/>
+        <w:rPr>
+          <w:lang w:val="en-US"/>
+        </w:rPr>
+      </w:pPr>
+      <w:bookmarkStart w:id="49" w:name="sec_mgmt_monitoring"/>
+      <w:r>
+        <w:rPr>
+          <w:lang w:val="en-US"/>
+        </w:rPr>
+        <w:t>All L3 devices (WAN-R1, FW, CORE-R1/R2, SRVRM-SW1, DSW01/02 at each site) are managed via a Loopback0 interface, carved from a shared, site-independent /24 block (10.0.5.0/24). The loopback doubles as the OSPF Router ID and as the source address for SSH/SNMP/syslog/NTP, so management reachability survives any single physical link failure.</w:t>
+      </w:r>
+    </w:p>
+    <w:tbl>
+      <w:tblPr>
+        <w:tblW w:w="10100" w:type="dxa"/>
+        <w:tblBorders>
+          <w:top w:val="single" w:sz="4" w:space="0" w:color="999999"/>
+          <w:left w:val="single" w:sz="4" w:space="0" w:color="999999"/>
+          <w:bottom w:val="single" w:sz="4" w:space="0" w:color="999999"/>
+          <w:right w:val="single" w:sz="4" w:space="0" w:color="999999"/>
+          <w:insideH w:val="single" w:sz="4" w:space="0" w:color="999999"/>
+          <w:insideV w:val="single" w:sz="4" w:space="0" w:color="999999"/>
+        </w:tblBorders>
+        <w:tblLook w:val="04A0" w:firstRow="1" w:lastRow="0" w:firstColumn="1" w:lastColumn="0" w:noHBand="0" w:noVBand="1"/>
+      </w:tblPr>
+      <w:tblGrid>
+        <w:gridCol w:w="3200"/>
+        <w:gridCol w:w="2200"/>
+        <w:gridCol w:w="2500"/>
+        <w:gridCol w:w="2200"/>
+      </w:tblGrid>
+      <w:tr>
+        <w:tc>
+          <w:tcPr>
+            <w:tcW w:w="3200" w:type="dxa"/>
+            <w:shd w:val="clear" w:color="auto" w:fill="D9D9D9"/>
+          </w:tcPr>
+          <w:p>
+            <w:r>
+              <w:rPr>
+                <w:b/>
+                <w:bCs/>
+              </w:rPr>
+              <w:t>Device</w:t>
+            </w:r>
+          </w:p>
+        </w:tc>
+        <w:tc>
+          <w:tcPr>
+            <w:tcW w:w="2200" w:type="dxa"/>
+            <w:shd w:val="clear" w:color="auto" w:fill="D9D9D9"/>
+          </w:tcPr>
+          <w:p>
+            <w:r>
+              <w:rPr>
+                <w:b/>
+                <w:bCs/>
+              </w:rPr>
+              <w:t>Role</w:t>
+            </w:r>
+          </w:p>
+        </w:tc>
+        <w:tc>
+          <w:tcPr>
+            <w:tcW w:w="2500" w:type="dxa"/>
+            <w:shd w:val="clear" w:color="auto" w:fill="D9D9D9"/>
+          </w:tcPr>
+          <w:p>
+            <w:r>
+              <w:rPr>
+                <w:b/>
+                <w:bCs/>
+              </w:rPr>
+              <w:t>Interface</w:t>
+            </w:r>
+          </w:p>
+        </w:tc>
+        <w:tc>
+          <w:tcPr>
+            <w:tcW w:w="2200" w:type="dxa"/>
+            <w:shd w:val="clear" w:color="auto" w:fill="D9D9D9"/>
+          </w:tcPr>
+          <w:p>
+            <w:r>
+              <w:rPr>
+                <w:b/>
+                <w:bCs/>
+              </w:rPr>
+              <w:t>Address</w:t>
+            </w:r>
+          </w:p>
+        </w:tc>
+      </w:tr>
+      <w:tr>
+        <w:tc>
+          <w:tcPr>
+            <w:tcW w:w="3200" w:type="dxa"/>
+          </w:tcPr>
+          <w:p>
+            <w:pPr>
+              <w:rPr>
+                <w:color w:val="EE0000"/>
+              </w:rPr>
+            </w:pPr>
+            <w:r>
+              <w:rPr>
+                <w:color w:val="EE0000"/>
+              </w:rPr>
+              <w:t>WAN-R1</w:t>
+            </w:r>
+          </w:p>
+        </w:tc>
+        <w:tc>
+          <w:tcPr>
+            <w:tcW w:w="2200" w:type="dxa"/>
+          </w:tcPr>
+          <w:p>
+            <w:pPr>
+              <w:rPr>
+                <w:color w:val="EE0000"/>
+              </w:rPr>
+            </w:pPr>
+            <w:r>
+              <w:rPr>
+                <w:color w:val="EE0000"/>
+              </w:rPr>
+              <w:t>Edge router</w:t>
+            </w:r>
+          </w:p>
+        </w:tc>
+        <w:tc>
+          <w:tcPr>
+            <w:tcW w:w="2500" w:type="dxa"/>
+          </w:tcPr>
+          <w:p>
+            <w:pPr>
+              <w:rPr>
+                <w:color w:val="EE0000"/>
+              </w:rPr>
+            </w:pPr>
+            <w:r>
+              <w:rPr>
+                <w:color w:val="EE0000"/>
+              </w:rPr>
+              <w:t>L3 Loopback0</w:t>
+            </w:r>
+          </w:p>
+        </w:tc>
+        <w:tc>
+          <w:tcPr>
+            <w:tcW w:w="2200" w:type="dxa"/>
+          </w:tcPr>
+          <w:p>
+            <w:pPr>
+              <w:rPr>
+                <w:color w:val="EE0000"/>
+              </w:rPr>
+            </w:pPr>
+            <w:r>
+              <w:rPr>
+                <w:color w:val="EE0000"/>
+              </w:rPr>
+              <w:t>10.0.5.1/32</w:t>
+            </w:r>
+          </w:p>
+        </w:tc>
+      </w:tr>
+      <w:tr>
+        <w:tc>
+          <w:tcPr>
+            <w:tcW w:w="3200" w:type="dxa"/>
+          </w:tcPr>
+          <w:p>
+            <w:pPr>
+              <w:rPr>
+                <w:color w:val="EE0000"/>
+              </w:rPr>
+            </w:pPr>
+            <w:r>
+              <w:rPr>
+                <w:color w:val="EE0000"/>
+              </w:rPr>
+              <w:t>FW</w:t>
+            </w:r>
+          </w:p>
+        </w:tc>
+        <w:tc>
+          <w:tcPr>
+            <w:tcW w:w="2200" w:type="dxa"/>
+          </w:tcPr>
+          <w:p>
+            <w:pPr>
+              <w:rPr>
+                <w:color w:val="EE0000"/>
+              </w:rPr>
+            </w:pPr>
+            <w:r>
+              <w:rPr>
+                <w:color w:val="EE0000"/>
+              </w:rPr>
+              <w:t>Firewall</w:t>
+            </w:r>
+          </w:p>
+        </w:tc>
+        <w:tc>
+          <w:tcPr>
+            <w:tcW w:w="2500" w:type="dxa"/>
+          </w:tcPr>
+          <w:p>
+            <w:pPr>
+              <w:rPr>
+                <w:color w:val="EE0000"/>
+              </w:rPr>
+            </w:pPr>
+            <w:r>
+              <w:rPr>
+                <w:color w:val="EE0000"/>
+              </w:rPr>
+              <w:t>L3 Loopback0</w:t>
+            </w:r>
+          </w:p>
+        </w:tc>
+        <w:tc>
+          <w:tcPr>
+            <w:tcW w:w="2200" w:type="dxa"/>
+          </w:tcPr>
+          <w:p>
+            <w:pPr>
+              <w:rPr>
+                <w:color w:val="EE0000"/>
+              </w:rPr>
+            </w:pPr>
+            <w:r>
+              <w:rPr>
+                <w:color w:val="EE0000"/>
+              </w:rPr>
+              <w:t>10.0.5.2/32</w:t>
+            </w:r>
+          </w:p>
+        </w:tc>
+      </w:tr>
+      <w:tr>
+        <w:tc>
+          <w:tcPr>
+            <w:tcW w:w="3200" w:type="dxa"/>
+          </w:tcPr>
+          <w:p>
+            <w:pPr>
+              <w:rPr>
+                <w:color w:val="EE0000"/>
+              </w:rPr>
+            </w:pPr>
+            <w:r>
+              <w:rPr>
+                <w:color w:val="EE0000"/>
+              </w:rPr>
+              <w:t>CORE-R1</w:t>
+            </w:r>
+          </w:p>
+        </w:tc>
+        <w:tc>
+          <w:tcPr>
+            <w:tcW w:w="2200" w:type="dxa"/>
+          </w:tcPr>
+          <w:p>
+            <w:pPr>
+              <w:rPr>
+                <w:color w:val="EE0000"/>
+              </w:rPr>
+            </w:pPr>
+            <w:r>
+              <w:rPr>
+                <w:color w:val="EE0000"/>
+              </w:rPr>
+              <w:t>Core router</w:t>
+            </w:r>
+          </w:p>
+        </w:tc>
+        <w:tc>
+          <w:tcPr>
+            <w:tcW w:w="2500" w:type="dxa"/>
+          </w:tcPr>
+          <w:p>
+            <w:pPr>
+              <w:rPr>
+                <w:color w:val="EE0000"/>
+              </w:rPr>
+            </w:pPr>
+            <w:r>
+              <w:rPr>
+                <w:color w:val="EE0000"/>
+              </w:rPr>
+              <w:t>L3 Loopback0</w:t>
+            </w:r>
+          </w:p>
+        </w:tc>
+        <w:tc>
+          <w:tcPr>
+            <w:tcW w:w="2200" w:type="dxa"/>
+          </w:tcPr>
+          <w:p>
+            <w:pPr>
+              <w:rPr>
+                <w:color w:val="EE0000"/>
+              </w:rPr>
+            </w:pPr>
+            <w:r>
+              <w:rPr>
+                <w:color w:val="EE0000"/>
+              </w:rPr>
+              <w:t>10.0.5.3/32</w:t>
+            </w:r>
+          </w:p>
+        </w:tc>
+      </w:tr>
+      <w:tr>
+        <w:tc>
+          <w:tcPr>
+            <w:tcW w:w="3200" w:type="dxa"/>
+          </w:tcPr>
+          <w:p>
+            <w:pPr>
+              <w:rPr>
+                <w:color w:val="EE0000"/>
+              </w:rPr>
+            </w:pPr>
+            <w:r>
+              <w:rPr>
+                <w:color w:val="EE0000"/>
+              </w:rPr>
+              <w:t>CORE-R2</w:t>
+            </w:r>
+          </w:p>
+        </w:tc>
+        <w:tc>
+          <w:tcPr>
+            <w:tcW w:w="2200" w:type="dxa"/>
+          </w:tcPr>
+          <w:p>
+            <w:pPr>
+              <w:rPr>
+                <w:color w:val="EE0000"/>
+              </w:rPr>
+            </w:pPr>
+            <w:r>
+              <w:rPr>
+                <w:color w:val="EE0000"/>
+              </w:rPr>
+              <w:t>Core router</w:t>
+            </w:r>
+          </w:p>
+        </w:tc>
+        <w:tc>
+          <w:tcPr>
+            <w:tcW w:w="2500" w:type="dxa"/>
+          </w:tcPr>
+          <w:p>
+            <w:pPr>
+              <w:rPr>
+                <w:color w:val="EE0000"/>
+              </w:rPr>
+            </w:pPr>
+            <w:r>
+              <w:rPr>
+                <w:color w:val="EE0000"/>
+              </w:rPr>
+              <w:t>L3 Loopback0</w:t>
+            </w:r>
+          </w:p>
+        </w:tc>
+        <w:tc>
+          <w:tcPr>
+            <w:tcW w:w="2200" w:type="dxa"/>
+          </w:tcPr>
+          <w:p>
+            <w:pPr>
+              <w:rPr>
+                <w:color w:val="EE0000"/>
+              </w:rPr>
+            </w:pPr>
+            <w:r>
+              <w:rPr>
+                <w:color w:val="EE0000"/>
+              </w:rPr>
+              <w:t>10.0.5.4/32</w:t>
+            </w:r>
+          </w:p>
+        </w:tc>
+      </w:tr>
+      <w:tr>
+        <w:tc>
+          <w:tcPr>
+            <w:tcW w:w="3200" w:type="dxa"/>
+          </w:tcPr>
+          <w:p>
+            <w:pPr>
+              <w:rPr>
+                <w:color w:val="EE0000"/>
+              </w:rPr>
+            </w:pPr>
+            <w:r>
+              <w:rPr>
+                <w:color w:val="EE0000"/>
+              </w:rPr>
+              <w:t>SRVRM-SW1</w:t>
+            </w:r>
+          </w:p>
+        </w:tc>
+        <w:tc>
+          <w:tcPr>
+            <w:tcW w:w="2200" w:type="dxa"/>
+          </w:tcPr>
+          <w:p>
+            <w:pPr>
+              <w:rPr>
+                <w:color w:val="EE0000"/>
+              </w:rPr>
+            </w:pPr>
+            <w:r>
+              <w:rPr>
+                <w:color w:val="EE0000"/>
+              </w:rPr>
+              <w:t>Server-room switch</w:t>
+            </w:r>
+          </w:p>
+        </w:tc>
+        <w:tc>
+          <w:tcPr>
+            <w:tcW w:w="2500" w:type="dxa"/>
+          </w:tcPr>
+          <w:p>
+            <w:pPr>
+              <w:rPr>
+                <w:color w:val="EE0000"/>
+              </w:rPr>
+            </w:pPr>
+            <w:r>
+              <w:rPr>
+                <w:color w:val="EE0000"/>
+              </w:rPr>
+              <w:t>L3 Loopback0</w:t>
+            </w:r>
+          </w:p>
+        </w:tc>
+        <w:tc>
+          <w:tcPr>
+            <w:tcW w:w="2200" w:type="dxa"/>
+          </w:tcPr>
+          <w:p>
+            <w:pPr>
+              <w:rPr>
+                <w:color w:val="EE0000"/>
+              </w:rPr>
+            </w:pPr>
+            <w:r>
+              <w:rPr>
+                <w:color w:val="EE0000"/>
+              </w:rPr>
+              <w:t>10.0.5.5/32</w:t>
+            </w:r>
+          </w:p>
+        </w:tc>
+      </w:tr>
+      <w:tr>
+        <w:tc>
+          <w:tcPr>
+            <w:tcW w:w="3200" w:type="dxa"/>
+          </w:tcPr>
+          <w:p>
+            <w:pPr>
+              <w:rPr>
+                <w:color w:val="EE0000"/>
+              </w:rPr>
+            </w:pPr>
+            <w:r>
+              <w:rPr>
+                <w:color w:val="EE0000"/>
+              </w:rPr>
+              <w:t>DSW01-SITE01</w:t>
+            </w:r>
+          </w:p>
+        </w:tc>
+        <w:tc>
+          <w:tcPr>
+            <w:tcW w:w="2200" w:type="dxa"/>
+          </w:tcPr>
+          <w:p>
+            <w:pPr>
+              <w:rPr>
+                <w:color w:val="EE0000"/>
+              </w:rPr>
+            </w:pPr>
+            <w:r>
+              <w:rPr>
+                <w:color w:val="EE0000"/>
+              </w:rPr>
+              <w:t>Distribution switch</w:t>
+            </w:r>
+          </w:p>
+        </w:tc>
+        <w:tc>
+          <w:tcPr>
+            <w:tcW w:w="2500" w:type="dxa"/>
+          </w:tcPr>
+          <w:p>
+            <w:pPr>
+              <w:rPr>
+                <w:color w:val="EE0000"/>
+              </w:rPr>
+            </w:pPr>
+            <w:r>
+              <w:rPr>
+                <w:color w:val="EE0000"/>
+              </w:rPr>
+              <w:t>L3 Loopback0</w:t>
+            </w:r>
+          </w:p>
+        </w:tc>
+        <w:tc>
+          <w:tcPr>
+            <w:tcW w:w="2200" w:type="dxa"/>
+          </w:tcPr>
+          <w:p>
+            <w:pPr>
+              <w:rPr>
+                <w:color w:val="EE0000"/>
+              </w:rPr>
+            </w:pPr>
+            <w:r>
+              <w:rPr>
+                <w:color w:val="EE0000"/>
+              </w:rPr>
+              <w:t>10.0.5.11/32</w:t>
+            </w:r>
+          </w:p>
+        </w:tc>
+      </w:tr>
+      <w:tr>
+        <w:tc>
+          <w:tcPr>
+            <w:tcW w:w="3200" w:type="dxa"/>
+          </w:tcPr>
+          <w:p>
+            <w:pPr>
+              <w:rPr>
+                <w:color w:val="EE0000"/>
+              </w:rPr>
+            </w:pPr>
+            <w:r>
+              <w:rPr>
+                <w:color w:val="EE0000"/>
+              </w:rPr>
+              <w:t>DSW02-SITE01</w:t>
+            </w:r>
+          </w:p>
+        </w:tc>
+        <w:tc>
+          <w:tcPr>
+            <w:tcW w:w="2200" w:type="dxa"/>
+          </w:tcPr>
+          <w:p>
+            <w:pPr>
+              <w:rPr>
+                <w:color w:val="EE0000"/>
+              </w:rPr>
+            </w:pPr>
+            <w:r>
+              <w:rPr>
+                <w:color w:val="EE0000"/>
+              </w:rPr>
+              <w:t>Distribution switch</w:t>
+            </w:r>
+          </w:p>
+        </w:tc>
+        <w:tc>
+          <w:tcPr>
+            <w:tcW w:w="2500" w:type="dxa"/>
+          </w:tcPr>
+          <w:p>
+            <w:pPr>
+              <w:rPr>
+                <w:color w:val="EE0000"/>
+              </w:rPr>
+            </w:pPr>
+            <w:r>
+              <w:rPr>
+                <w:color w:val="EE0000"/>
+              </w:rPr>
+              <w:t>L3 Loopback0</w:t>
+            </w:r>
+          </w:p>
+        </w:tc>
+        <w:tc>
+          <w:tcPr>
+            <w:tcW w:w="2200" w:type="dxa"/>
+          </w:tcPr>
+          <w:p>
+            <w:pPr>
+              <w:rPr>
+                <w:color w:val="EE0000"/>
+              </w:rPr>
+            </w:pPr>
+            <w:r>
+              <w:rPr>
+                <w:color w:val="EE0000"/>
+              </w:rPr>
+              <w:t>10.0.5.12/32</w:t>
+            </w:r>
+          </w:p>
+        </w:tc>
+      </w:tr>
+      <w:tr>
+        <w:tc>
+          <w:tcPr>
+            <w:tcW w:w="3200" w:type="dxa"/>
+          </w:tcPr>
+          <w:p>
+            <w:pPr>
+              <w:rPr>
+                <w:color w:val="000000" w:themeColor="text1"/>
+              </w:rPr>
+            </w:pPr>
+            <w:r>
+              <w:rPr>
+                <w:color w:val="000000" w:themeColor="text1"/>
+              </w:rPr>
+              <w:t>DSW01-SITE02</w:t>
+            </w:r>
+          </w:p>
+        </w:tc>
+        <w:tc>
+          <w:tcPr>
+            <w:tcW w:w="2200" w:type="dxa"/>
+          </w:tcPr>
+          <w:p>
+            <w:pPr>
+              <w:rPr>
+                <w:color w:val="000000" w:themeColor="text1"/>
+              </w:rPr>
+            </w:pPr>
+            <w:r>
+              <w:rPr>
+                <w:color w:val="000000" w:themeColor="text1"/>
+              </w:rPr>
+              <w:t>Distribution switch</w:t>
+            </w:r>
+          </w:p>
+        </w:tc>
+        <w:tc>
+          <w:tcPr>
+            <w:tcW w:w="2500" w:type="dxa"/>
+          </w:tcPr>
+          <w:p>
+            <w:pPr>
+              <w:rPr>
+                <w:color w:val="000000" w:themeColor="text1"/>
+              </w:rPr>
+            </w:pPr>
+            <w:r>
+              <w:rPr>
+                <w:color w:val="000000" w:themeColor="text1"/>
+              </w:rPr>
+              <w:t>L3 Loopback0</w:t>
+            </w:r>
+          </w:p>
+        </w:tc>
+        <w:tc>
+          <w:tcPr>
+            <w:tcW w:w="2200" w:type="dxa"/>
+          </w:tcPr>
+          <w:p>
+            <w:pPr>
+              <w:rPr>
+                <w:color w:val="000000" w:themeColor="text1"/>
+              </w:rPr>
+            </w:pPr>
+            <w:r>
+              <w:rPr>
+                <w:color w:val="000000" w:themeColor="text1"/>
+              </w:rPr>
+              <w:t>10.0.5.13/32</w:t>
+            </w:r>
+          </w:p>
+        </w:tc>
+      </w:tr>
+      <w:tr>
+        <w:tc>
+          <w:tcPr>
+            <w:tcW w:w="3200" w:type="dxa"/>
+          </w:tcPr>
+          <w:p>
+            <w:pPr>
+              <w:rPr>
+                <w:color w:val="000000" w:themeColor="text1"/>
+              </w:rPr>
+            </w:pPr>
+            <w:r>
+              <w:rPr>
+                <w:color w:val="000000" w:themeColor="text1"/>
+              </w:rPr>
+              <w:t>DSW02-SITE02</w:t>
+            </w:r>
+          </w:p>
+        </w:tc>
+        <w:tc>
+          <w:tcPr>
+            <w:tcW w:w="2200" w:type="dxa"/>
+          </w:tcPr>
+          <w:p>
+            <w:pPr>
+              <w:rPr>
+                <w:color w:val="000000" w:themeColor="text1"/>
+              </w:rPr>
+            </w:pPr>
+            <w:r>
+              <w:rPr>
+                <w:color w:val="000000" w:themeColor="text1"/>
+              </w:rPr>
+              <w:t>Distribution switch</w:t>
+            </w:r>
+          </w:p>
+        </w:tc>
+        <w:tc>
+          <w:tcPr>
+            <w:tcW w:w="2500" w:type="dxa"/>
+          </w:tcPr>
+          <w:p>
+            <w:pPr>
+              <w:rPr>
+                <w:color w:val="000000" w:themeColor="text1"/>
+              </w:rPr>
+            </w:pPr>
+            <w:r>
+              <w:rPr>
+                <w:color w:val="000000" w:themeColor="text1"/>
+              </w:rPr>
+              <w:t>L3 Loopback0</w:t>
+            </w:r>
+          </w:p>
+        </w:tc>
+        <w:tc>
+          <w:tcPr>
+            <w:tcW w:w="2200" w:type="dxa"/>
+          </w:tcPr>
+          <w:p>
+            <w:pPr>
+              <w:rPr>
+                <w:color w:val="000000" w:themeColor="text1"/>
+              </w:rPr>
+            </w:pPr>
+            <w:r>
+              <w:rPr>
+                <w:color w:val="000000" w:themeColor="text1"/>
+              </w:rPr>
+              <w:t>10.0.5.14/32</w:t>
+            </w:r>
+          </w:p>
+        </w:tc>
+      </w:tr>
+    </w:tbl>
+    <w:p>
+      <w:pPr>
+        <w:spacing w:before="200"/>
+        <w:rPr>
+          <w:lang w:val="en-US"/>
+        </w:rPr>
+      </w:pPr>
+    </w:p>
+    <w:p>
+      <w:pPr>
+        <w:spacing w:before="200"/>
+        <w:rPr>
+          <w:lang w:val="en-US"/>
+        </w:rPr>
+      </w:pPr>
+      <w:r>
+        <w:rPr>
+          <w:lang w:val="en-US"/>
+        </w:rPr>
+        <w:t>Pure Layer 2 access switches (ASW) cannot host a routed loopback, so each site has a dedicated management VLAN (VLAN 99) terminated as an SVI on both distribution switches, running HSRP for redundancy. Each ASW gets an SVI in this VLAN and points ip default-gateway at the site's HSRP virtual IP, since a pure L2 switch has no IP routing table of its own.</w:t>
+      </w:r>
+    </w:p>
+    <w:tbl>
+      <w:tblPr>
+        <w:tblW w:w="10100" w:type="dxa"/>
+        <w:tblBorders>
+          <w:top w:val="single" w:sz="4" w:space="0" w:color="999999"/>
+          <w:left w:val="single" w:sz="4" w:space="0" w:color="999999"/>
+          <w:bottom w:val="single" w:sz="4" w:space="0" w:color="999999"/>
+          <w:right w:val="single" w:sz="4" w:space="0" w:color="999999"/>
+          <w:insideH w:val="single" w:sz="4" w:space="0" w:color="999999"/>
+          <w:insideV w:val="single" w:sz="4" w:space="0" w:color="999999"/>
+        </w:tblBorders>
+        <w:tblLook w:val="04A0" w:firstRow="1" w:lastRow="0" w:firstColumn="1" w:lastColumn="0" w:noHBand="0" w:noVBand="1"/>
+      </w:tblPr>
+      <w:tblGrid>
+        <w:gridCol w:w="3200"/>
+        <w:gridCol w:w="2200"/>
+        <w:gridCol w:w="2500"/>
+        <w:gridCol w:w="2200"/>
+      </w:tblGrid>
+      <w:tr>
+        <w:tc>
+          <w:tcPr>
+            <w:tcW w:w="3200" w:type="dxa"/>
+            <w:shd w:val="clear" w:color="auto" w:fill="D9D9D9"/>
+          </w:tcPr>
+          <w:p>
+            <w:r>
+              <w:rPr>
+                <w:b/>
+                <w:bCs/>
+              </w:rPr>
+              <w:t>Device</w:t>
+            </w:r>
+          </w:p>
+        </w:tc>
+        <w:tc>
+          <w:tcPr>
+            <w:tcW w:w="2200" w:type="dxa"/>
+            <w:shd w:val="clear" w:color="auto" w:fill="D9D9D9"/>
+          </w:tcPr>
+          <w:p>
+            <w:r>
+              <w:rPr>
+                <w:b/>
+                <w:bCs/>
+              </w:rPr>
+              <w:t>Role</w:t>
+            </w:r>
+          </w:p>
+        </w:tc>
+        <w:tc>
+          <w:tcPr>
+            <w:tcW w:w="2500" w:type="dxa"/>
+            <w:shd w:val="clear" w:color="auto" w:fill="D9D9D9"/>
+          </w:tcPr>
+          <w:p>
+            <w:r>
+              <w:rPr>
+                <w:b/>
+                <w:bCs/>
+              </w:rPr>
+              <w:t>Interface</w:t>
+            </w:r>
+          </w:p>
+        </w:tc>
+        <w:tc>
+          <w:tcPr>
+            <w:tcW w:w="2200" w:type="dxa"/>
+            <w:shd w:val="clear" w:color="auto" w:fill="D9D9D9"/>
+          </w:tcPr>
+          <w:p>
+            <w:r>
+              <w:rPr>
+                <w:b/>
+                <w:bCs/>
+              </w:rPr>
+              <w:t>Address</w:t>
+            </w:r>
+          </w:p>
+        </w:tc>
+      </w:tr>
+      <w:tr>
+        <w:tc>
+          <w:tcPr>
+            <w:tcW w:w="3200" w:type="dxa"/>
+          </w:tcPr>
+          <w:p>
+            <w:pPr>
+              <w:rPr>
+                <w:color w:val="EE0000"/>
+              </w:rPr>
+            </w:pPr>
+            <w:r>
+              <w:rPr>
+                <w:color w:val="EE0000"/>
+              </w:rPr>
+              <w:t>DSW01-SITE01</w:t>
+            </w:r>
+          </w:p>
+        </w:tc>
+        <w:tc>
+          <w:tcPr>
+            <w:tcW w:w="2200" w:type="dxa"/>
+          </w:tcPr>
+          <w:p>
+            <w:pPr>
+              <w:rPr>
+                <w:color w:val="EE0000"/>
+              </w:rPr>
+            </w:pPr>
+            <w:r>
+              <w:rPr>
+                <w:color w:val="EE0000"/>
+              </w:rPr>
+              <w:t>Distribution</w:t>
+            </w:r>
+          </w:p>
+        </w:tc>
+        <w:tc>
+          <w:tcPr>
+            <w:tcW w:w="2500" w:type="dxa"/>
+          </w:tcPr>
+          <w:p>
+            <w:pPr>
+              <w:rPr>
+                <w:color w:val="EE0000"/>
+              </w:rPr>
+            </w:pPr>
+            <w:r>
+              <w:rPr>
+                <w:color w:val="EE0000"/>
+              </w:rPr>
+              <w:t>VLAN 99 SVI</w:t>
+            </w:r>
+          </w:p>
+        </w:tc>
+        <w:tc>
+          <w:tcPr>
+            <w:tcW w:w="2200" w:type="dxa"/>
+          </w:tcPr>
+          <w:p>
+            <w:pPr>
+              <w:rPr>
+                <w:color w:val="EE0000"/>
+              </w:rPr>
+            </w:pPr>
+            <w:r>
+              <w:rPr>
+                <w:color w:val="EE0000"/>
+              </w:rPr>
+              <w:t>10.1.9.2/24</w:t>
+            </w:r>
+          </w:p>
+        </w:tc>
+      </w:tr>
+      <w:tr>
+        <w:tc>
+          <w:tcPr>
+            <w:tcW w:w="3200" w:type="dxa"/>
+          </w:tcPr>
+          <w:p>
+            <w:pPr>
+              <w:rPr>
+                <w:color w:val="EE0000"/>
+              </w:rPr>
+            </w:pPr>
+            <w:r>
+              <w:rPr>
+                <w:color w:val="EE0000"/>
+              </w:rPr>
+              <w:t>DSW02-SITE01</w:t>
+            </w:r>
+          </w:p>
+        </w:tc>
+        <w:tc>
+          <w:tcPr>
+            <w:tcW w:w="2200" w:type="dxa"/>
+          </w:tcPr>
+          <w:p>
+            <w:pPr>
+              <w:rPr>
+                <w:color w:val="EE0000"/>
+              </w:rPr>
+            </w:pPr>
+            <w:r>
+              <w:rPr>
+                <w:color w:val="EE0000"/>
+              </w:rPr>
+              <w:t>Distribution</w:t>
+            </w:r>
+          </w:p>
+        </w:tc>
+        <w:tc>
+          <w:tcPr>
+            <w:tcW w:w="2500" w:type="dxa"/>
+          </w:tcPr>
+          <w:p>
+            <w:pPr>
+              <w:rPr>
+                <w:color w:val="EE0000"/>
+              </w:rPr>
+            </w:pPr>
+            <w:r>
+              <w:rPr>
+                <w:color w:val="EE0000"/>
+              </w:rPr>
+              <w:t>VLAN 99 SVI</w:t>
+            </w:r>
+          </w:p>
+        </w:tc>
+        <w:tc>
+          <w:tcPr>
+            <w:tcW w:w="2200" w:type="dxa"/>
+          </w:tcPr>
+          <w:p>
+            <w:pPr>
+              <w:rPr>
+                <w:color w:val="EE0000"/>
+              </w:rPr>
+            </w:pPr>
+            <w:r>
+              <w:rPr>
+                <w:color w:val="EE0000"/>
+              </w:rPr>
+              <w:t>10.1.9.3/24</w:t>
+            </w:r>
+          </w:p>
+        </w:tc>
+      </w:tr>
+      <w:tr>
+        <w:tc>
+          <w:tcPr>
+            <w:tcW w:w="3200" w:type="dxa"/>
+          </w:tcPr>
+          <w:p>
+            <w:pPr>
+              <w:rPr>
+                <w:color w:val="EE0000"/>
+              </w:rPr>
+            </w:pPr>
+          </w:p>
+        </w:tc>
+        <w:tc>
+          <w:tcPr>
+            <w:tcW w:w="2200" w:type="dxa"/>
+          </w:tcPr>
+          <w:p>
+            <w:pPr>
+              <w:rPr>
+                <w:color w:val="EE0000"/>
+              </w:rPr>
+            </w:pPr>
+          </w:p>
+        </w:tc>
+        <w:tc>
+          <w:tcPr>
+            <w:tcW w:w="2500" w:type="dxa"/>
+          </w:tcPr>
+          <w:p>
+            <w:pPr>
+              <w:rPr>
+                <w:color w:val="EE0000"/>
+              </w:rPr>
+            </w:pPr>
+            <w:r>
+              <w:rPr>
+                <w:color w:val="EE0000"/>
+              </w:rPr>
+              <w:t>HSRP VIP (both)</w:t>
+            </w:r>
+          </w:p>
+        </w:tc>
+        <w:tc>
+          <w:tcPr>
+            <w:tcW w:w="2200" w:type="dxa"/>
+          </w:tcPr>
+          <w:p>
+            <w:pPr>
+              <w:rPr>
+                <w:color w:val="EE0000"/>
+              </w:rPr>
+            </w:pPr>
+            <w:r>
+              <w:rPr>
+                <w:color w:val="EE0000"/>
+              </w:rPr>
+              <w:t>10.1.9.1</w:t>
+            </w:r>
+          </w:p>
+        </w:tc>
+      </w:tr>
+      <w:tr>
+        <w:tc>
+          <w:tcPr>
+            <w:tcW w:w="3200" w:type="dxa"/>
+          </w:tcPr>
+          <w:p>
+            <w:pPr>
+              <w:rPr>
+                <w:color w:val="EE0000"/>
+              </w:rPr>
+            </w:pPr>
+            <w:r>
+              <w:rPr>
+                <w:color w:val="EE0000"/>
+              </w:rPr>
+              <w:t>ASW01-SITE01</w:t>
+            </w:r>
+          </w:p>
+        </w:tc>
+        <w:tc>
+          <w:tcPr>
+            <w:tcW w:w="2200" w:type="dxa"/>
+          </w:tcPr>
+          <w:p>
+            <w:pPr>
+              <w:rPr>
+                <w:color w:val="EE0000"/>
+              </w:rPr>
+            </w:pPr>
+            <w:r>
+              <w:rPr>
+                <w:color w:val="EE0000"/>
+              </w:rPr>
+              <w:t>Access (L2)</w:t>
+            </w:r>
+          </w:p>
+        </w:tc>
+        <w:tc>
+          <w:tcPr>
+            <w:tcW w:w="2500" w:type="dxa"/>
+          </w:tcPr>
+          <w:p>
+            <w:pPr>
+              <w:rPr>
+                <w:color w:val="EE0000"/>
+              </w:rPr>
+            </w:pPr>
+            <w:r>
+              <w:rPr>
+                <w:color w:val="EE0000"/>
+              </w:rPr>
+              <w:t>VLAN 99 SVI</w:t>
+            </w:r>
+          </w:p>
+        </w:tc>
+        <w:tc>
+          <w:tcPr>
+            <w:tcW w:w="2200" w:type="dxa"/>
+          </w:tcPr>
+          <w:p>
+            <w:pPr>
+              <w:rPr>
+                <w:color w:val="EE0000"/>
+              </w:rPr>
+            </w:pPr>
+            <w:r>
+              <w:rPr>
+                <w:color w:val="EE0000"/>
+              </w:rPr>
+              <w:t>10.1.9.11/24</w:t>
+            </w:r>
+          </w:p>
+        </w:tc>
+      </w:tr>
+      <w:tr>
+        <w:tc>
+          <w:tcPr>
+            <w:tcW w:w="3200" w:type="dxa"/>
+          </w:tcPr>
+          <w:p>
+            <w:pPr>
+              <w:rPr>
+                <w:color w:val="EE0000"/>
+              </w:rPr>
+            </w:pPr>
+            <w:r>
+              <w:rPr>
+                <w:color w:val="EE0000"/>
+              </w:rPr>
+              <w:t>ASW02-SITE01</w:t>
+            </w:r>
+          </w:p>
+        </w:tc>
+        <w:tc>
+          <w:tcPr>
+            <w:tcW w:w="2200" w:type="dxa"/>
+          </w:tcPr>
+          <w:p>
+            <w:pPr>
+              <w:rPr>
+                <w:color w:val="EE0000"/>
+              </w:rPr>
+            </w:pPr>
+            <w:r>
+              <w:rPr>
+                <w:color w:val="EE0000"/>
+              </w:rPr>
+              <w:t>Access (L2)</w:t>
+            </w:r>
+          </w:p>
+        </w:tc>
+        <w:tc>
+          <w:tcPr>
+            <w:tcW w:w="2500" w:type="dxa"/>
+          </w:tcPr>
+          <w:p>
+            <w:pPr>
+              <w:rPr>
+                <w:color w:val="EE0000"/>
+              </w:rPr>
+            </w:pPr>
+            <w:r>
+              <w:rPr>
+                <w:color w:val="EE0000"/>
+              </w:rPr>
+              <w:t>VLAN 99 SVI</w:t>
+            </w:r>
+          </w:p>
+        </w:tc>
+        <w:tc>
+          <w:tcPr>
+            <w:tcW w:w="2200" w:type="dxa"/>
+          </w:tcPr>
+          <w:p>
+            <w:pPr>
+              <w:rPr>
+                <w:color w:val="EE0000"/>
+              </w:rPr>
+            </w:pPr>
+            <w:r>
+              <w:rPr>
+                <w:color w:val="EE0000"/>
+              </w:rPr>
+              <w:t>10.1.9.12/24</w:t>
+            </w:r>
+          </w:p>
+        </w:tc>
+      </w:tr>
+      <w:tr>
+        <w:tc>
+          <w:tcPr>
+            <w:tcW w:w="3200" w:type="dxa"/>
+          </w:tcPr>
+          <w:p>
+            <w:r>
+              <w:t>DSW01-SITE02</w:t>
+            </w:r>
+          </w:p>
+        </w:tc>
+        <w:tc>
+          <w:tcPr>
+            <w:tcW w:w="2200" w:type="dxa"/>
+          </w:tcPr>
+          <w:p>
+            <w:r>
+              <w:t>Distribution</w:t>
+            </w:r>
+          </w:p>
+        </w:tc>
+        <w:tc>
+          <w:tcPr>
+            <w:tcW w:w="2500" w:type="dxa"/>
+          </w:tcPr>
+          <w:p>
+            <w:r>
+              <w:t>VLAN 99 SVI</w:t>
+            </w:r>
+          </w:p>
+        </w:tc>
+        <w:tc>
+          <w:tcPr>
+            <w:tcW w:w="2200" w:type="dxa"/>
+          </w:tcPr>
+          <w:p>
+            <w:r>
+              <w:t>10.2.9.2/24</w:t>
+            </w:r>
+          </w:p>
+        </w:tc>
+      </w:tr>
+      <w:tr>
+        <w:tc>
+          <w:tcPr>
+            <w:tcW w:w="3200" w:type="dxa"/>
+          </w:tcPr>
+          <w:p>
+            <w:r>
+              <w:t>DSW02-SITE02</w:t>
+            </w:r>
+          </w:p>
+        </w:tc>
+        <w:tc>
+          <w:tcPr>
+            <w:tcW w:w="2200" w:type="dxa"/>
+          </w:tcPr>
+          <w:p>
+            <w:r>
+              <w:t>Distribution</w:t>
+            </w:r>
+          </w:p>
+        </w:tc>
+        <w:tc>
+          <w:tcPr>
+            <w:tcW w:w="2500" w:type="dxa"/>
+          </w:tcPr>
+          <w:p>
+            <w:r>
+              <w:t>VLAN 99 SVI</w:t>
+            </w:r>
+          </w:p>
+        </w:tc>
+        <w:tc>
+          <w:tcPr>
+            <w:tcW w:w="2200" w:type="dxa"/>
+          </w:tcPr>
+          <w:p>
+            <w:r>
+              <w:t>10.2.9.3/24</w:t>
+            </w:r>
+          </w:p>
+        </w:tc>
+      </w:tr>
+      <w:tr>
+        <w:tc>
+          <w:tcPr>
+            <w:tcW w:w="3200" w:type="dxa"/>
+          </w:tcPr>
+          <w:p/>
+        </w:tc>
+        <w:tc>
+          <w:tcPr>
+            <w:tcW w:w="2200" w:type="dxa"/>
+          </w:tcPr>
+          <w:p/>
+        </w:tc>
+        <w:tc>
+          <w:tcPr>
+            <w:tcW w:w="2500" w:type="dxa"/>
+          </w:tcPr>
+          <w:p>
+            <w:r>
+              <w:t>HSRP VIP (both)</w:t>
+            </w:r>
+          </w:p>
+        </w:tc>
+        <w:tc>
+          <w:tcPr>
+            <w:tcW w:w="2200" w:type="dxa"/>
+          </w:tcPr>
+          <w:p>
+            <w:r>
+              <w:t>10.2.9.1</w:t>
+            </w:r>
+          </w:p>
+        </w:tc>
+      </w:tr>
+      <w:tr>
+        <w:tc>
+          <w:tcPr>
+            <w:tcW w:w="3200" w:type="dxa"/>
+          </w:tcPr>
+          <w:p>
+            <w:r>
+              <w:t>ASW01-SITE02</w:t>
+            </w:r>
+          </w:p>
+        </w:tc>
+        <w:tc>
+          <w:tcPr>
+            <w:tcW w:w="2200" w:type="dxa"/>
+          </w:tcPr>
+          <w:p>
+            <w:r>
+              <w:t>Access (L2)</w:t>
+            </w:r>
+          </w:p>
+        </w:tc>
+        <w:tc>
+          <w:tcPr>
+            <w:tcW w:w="2500" w:type="dxa"/>
+          </w:tcPr>
+          <w:p>
+            <w:r>
+              <w:t>VLAN 99 SVI</w:t>
+            </w:r>
+          </w:p>
+        </w:tc>
+        <w:tc>
+          <w:tcPr>
+            <w:tcW w:w="2200" w:type="dxa"/>
+          </w:tcPr>
+          <w:p>
+            <w:r>
+              <w:t>10.2.9.11/24</w:t>
+            </w:r>
+          </w:p>
+        </w:tc>
+      </w:tr>
+      <w:tr>
+        <w:tc>
+          <w:tcPr>
+            <w:tcW w:w="3200" w:type="dxa"/>
+          </w:tcPr>
+          <w:p>
+            <w:r>
+              <w:t>ASW02-SITE02</w:t>
+            </w:r>
+          </w:p>
+        </w:tc>
+        <w:tc>
+          <w:tcPr>
+            <w:tcW w:w="2200" w:type="dxa"/>
+          </w:tcPr>
+          <w:p>
+            <w:r>
+              <w:t>Access (L2)</w:t>
+            </w:r>
+          </w:p>
+        </w:tc>
+        <w:tc>
+          <w:tcPr>
+            <w:tcW w:w="2500" w:type="dxa"/>
+          </w:tcPr>
+          <w:p>
+            <w:r>
+              <w:t>VLAN 99 SVI</w:t>
+            </w:r>
+          </w:p>
+        </w:tc>
+        <w:tc>
+          <w:tcPr>
+            <w:tcW w:w="2200" w:type="dxa"/>
+          </w:tcPr>
+          <w:p>
+            <w:r>
+              <w:t>10.2.9.12/24</w:t>
+            </w:r>
+          </w:p>
+        </w:tc>
+      </w:tr>
+      <w:tr>
+        <w:tc>
+          <w:tcPr>
+            <w:tcW w:w="3200" w:type="dxa"/>
+          </w:tcPr>
+          <w:p/>
+        </w:tc>
+        <w:tc>
+          <w:tcPr>
+            <w:tcW w:w="2200" w:type="dxa"/>
+          </w:tcPr>
+          <w:p/>
+        </w:tc>
+        <w:tc>
+          <w:tcPr>
+            <w:tcW w:w="2500" w:type="dxa"/>
+          </w:tcPr>
+          <w:p/>
+        </w:tc>
+        <w:tc>
+          <w:tcPr>
+            <w:tcW w:w="2200" w:type="dxa"/>
+          </w:tcPr>
+          <w:p/>
+        </w:tc>
+      </w:tr>
+    </w:tbl>
+    <w:p>
+      <w:pPr>
+        <w:spacing w:before="200"/>
+        <w:rPr>
+          <w:lang w:val="en-US"/>
+        </w:rPr>
+      </w:pPr>
+    </w:p>
+    <w:p>
+      <w:pPr>
+        <w:spacing w:before="200"/>
+        <w:rPr>
+          <w:lang w:val="en-US"/>
+        </w:rPr>
+      </w:pPr>
+      <w:r>
+        <w:rPr>
+          <w:lang w:val="en-US"/>
+        </w:rPr>
+        <w:t>Management VLAN 99 and the loopback block are not advertised as a separate OSPF area; each device advertises its own management interface into whatever area it already participates in (see Section 7.2).</w:t>
+      </w:r>
+    </w:p>
+    <w:p>
+      <w:pPr>
+        <w:pStyle w:val="1"/>
+        <w:rPr>
+          <w:lang w:val="en-US"/>
+        </w:rPr>
+      </w:pPr>
+      <w:r>
+        <w:rPr>
+          <w:lang w:val="en-US"/>
+        </w:rPr>
+        <w:t>14. Management and Monitoring</w:t>
+      </w:r>
+      <w:bookmarkEnd w:id="49"/>
+    </w:p>
+    <w:p>
+      <w:pPr>
+        <w:pStyle w:val="2"/>
+        <w:rPr>
+          <w:lang w:val="en-US"/>
+        </w:rPr>
+      </w:pPr>
+      <w:bookmarkStart w:id="50" w:name="sec_mgmt_tacacs"/>
+      <w:r>
+        <w:rPr>
+          <w:lang w:val="en-US"/>
+        </w:rPr>
+        <w:t>14.1 Device Administration AAA (TACACS+)</w:t>
+      </w:r>
+      <w:bookmarkEnd w:id="50"/>
+    </w:p>
+    <w:p>
+      <w:pPr>
         <w:rPr>
           <w:lang w:val="en-US"/>
         </w:rPr>
@@ -3451,35 +4479,19 @@
     </w:p>
     <w:p>
       <w:pPr>
-        <w:pStyle w:val="1"/>
-        <w:rPr>
-          <w:lang w:val="en-US"/>
-        </w:rPr>
-      </w:pPr>
-      <w:bookmarkStart w:id="49" w:name="sec_mgmt_monitoring"/>
-      <w:r>
-        <w:rPr>
-          <w:lang w:val="en-US"/>
-        </w:rPr>
-        <w:t>14. Management and Monitoring</w:t>
-      </w:r>
-      <w:bookmarkEnd w:id="49"/>
-    </w:p>
-    <w:p>
-      <w:pPr>
         <w:pStyle w:val="2"/>
         <w:rPr>
           <w:lang w:val="en-US"/>
         </w:rPr>
       </w:pPr>
-      <w:bookmarkStart w:id="50" w:name="sec_mgmt_tacacs"/>
-      <w:r>
-        <w:rPr>
-          <w:lang w:val="en-US"/>
-        </w:rPr>
-        <w:t>14.1 Device Administration AAA (TACACS+)</w:t>
-      </w:r>
-      <w:bookmarkEnd w:id="50"/>
+      <w:bookmarkStart w:id="51" w:name="sec_mgmt_ntp"/>
+      <w:r>
+        <w:rPr>
+          <w:lang w:val="en-US"/>
+        </w:rPr>
+        <w:t>14.2 NTP Hierarchy</w:t>
+      </w:r>
+      <w:bookmarkEnd w:id="51"/>
     </w:p>
     <w:p>
       <w:pPr>
@@ -3504,14 +4516,14 @@
           <w:lang w:val="en-US"/>
         </w:rPr>
       </w:pPr>
-      <w:bookmarkStart w:id="51" w:name="sec_mgmt_ntp"/>
-      <w:r>
-        <w:rPr>
-          <w:lang w:val="en-US"/>
-        </w:rPr>
-        <w:t>14.2 NTP Hierarchy</w:t>
-      </w:r>
-      <w:bookmarkEnd w:id="51"/>
+      <w:bookmarkStart w:id="52" w:name="sec_mgmt_syslog"/>
+      <w:r>
+        <w:rPr>
+          <w:lang w:val="en-US"/>
+        </w:rPr>
+        <w:t>14.3 Syslog / SNMP</w:t>
+      </w:r>
+      <w:bookmarkEnd w:id="52"/>
     </w:p>
     <w:p>
       <w:pPr>
@@ -3536,43 +4548,12 @@
           <w:lang w:val="en-US"/>
         </w:rPr>
       </w:pPr>
-      <w:bookmarkStart w:id="52" w:name="sec_mgmt_syslog"/>
-      <w:r>
-        <w:rPr>
-          <w:lang w:val="en-US"/>
-        </w:rPr>
-        <w:t>14.3 Syslog / SNMP</w:t>
-      </w:r>
-      <w:bookmarkEnd w:id="52"/>
-    </w:p>
-    <w:p>
-      <w:pPr>
-        <w:rPr>
-          <w:lang w:val="en-US"/>
-        </w:rPr>
-      </w:pPr>
-      <w:r>
-        <w:rPr>
-          <w:i/>
-          <w:iCs/>
-          <w:color w:val="888888"/>
-          <w:lang w:val="en-US"/>
-        </w:rPr>
-        <w:t>[Content to be added]</w:t>
-      </w:r>
-    </w:p>
-    <w:p>
-      <w:pPr>
-        <w:pStyle w:val="2"/>
-        <w:rPr>
-          <w:lang w:val="en-US"/>
-        </w:rPr>
-      </w:pPr>
       <w:bookmarkStart w:id="53" w:name="sec_mgmt_backup"/>
       <w:r>
         <w:rPr>
           <w:lang w:val="en-US"/>
         </w:rPr>
+        <w:lastRenderedPageBreak/>
         <w:t>14.4 Backup and Configuration Management</w:t>
       </w:r>
       <w:bookmarkEnd w:id="53"/>
@@ -4470,6 +5451,9 @@
   </w:num>
   <w:num w:numId="5" w16cid:durableId="1190752952">
     <w:abstractNumId w:val="0"/>
+  </w:num>
+  <w:num w:numId="6" w16cid:durableId="1332635580">
+    <w:abstractNumId w:val="4"/>
   </w:num>
 </w:numbering>
 </file>
@@ -4955,7 +5939,6 @@
   <w:style w:type="character" w:default="1" w:styleId="a0">
     <w:name w:val="Default Paragraph Font"/>
     <w:uiPriority w:val="1"/>
-    <w:semiHidden/>
     <w:unhideWhenUsed/>
   </w:style>
   <w:style w:type="table" w:default="1" w:styleId="a1">

</xml_diff>

<commit_message>
Updates on project: DNS is set, DHCP is set, NTP is set, NAT is set, PUBLIC-SRV reachable from outside, hosts can reach (internet), DDNS is set
</commit_message>
<xml_diff>
--- a/CCNP Lab111 - Small Enterprise Network Design/CCNP_Lab111_-_Small_Enterprise_Network_Design_Documentation.docx
+++ b/CCNP Lab111 - Small Enterprise Network Design/CCNP_Lab111_-_Small_Enterprise_Network_Design_Documentation.docx
@@ -157,6 +157,33 @@
           <w:lang w:val="en-US"/>
         </w:rPr>
       </w:pPr>
+    </w:p>
+    <w:p>
+      <w:pPr>
+        <w:rPr>
+          <w:lang w:val="en-US"/>
+        </w:rPr>
+      </w:pPr>
+    </w:p>
+    <w:p>
+      <w:pPr>
+        <w:rPr>
+          <w:lang w:val="en-US"/>
+        </w:rPr>
+      </w:pPr>
+    </w:p>
+    <w:p>
+      <w:pPr>
+        <w:rPr>
+          <w:lang w:val="en-US"/>
+        </w:rPr>
+      </w:pPr>
+      <w:r>
+        <w:rPr>
+          <w:lang w:val="en-US"/>
+        </w:rPr>
+        <w:t>Domain name – lab111.com</w:t>
+      </w:r>
       <w:r>
         <w:rPr>
           <w:lang w:val="en-US"/>
@@ -220,282 +247,41 @@
           <w:lang w:val="en-US"/>
         </w:rPr>
       </w:pPr>
-    </w:p>
-    <w:p>
-      <w:pPr>
-        <w:spacing w:before="200"/>
-        <w:rPr>
-          <w:lang w:val="en-US"/>
-        </w:rPr>
-      </w:pPr>
-    </w:p>
-    <w:p>
-      <w:pPr>
-        <w:spacing w:before="200"/>
-        <w:rPr>
-          <w:lang w:val="en-US"/>
-        </w:rPr>
-      </w:pPr>
-    </w:p>
-    <w:p>
-      <w:pPr>
-        <w:spacing w:before="200"/>
-        <w:rPr>
-          <w:lang w:val="en-US"/>
-        </w:rPr>
-      </w:pPr>
-    </w:p>
-    <w:p>
-      <w:pPr>
-        <w:spacing w:before="200"/>
-        <w:rPr>
-          <w:lang w:val="en-US"/>
-        </w:rPr>
-      </w:pPr>
-    </w:p>
-    <w:p>
-      <w:pPr>
-        <w:spacing w:before="200"/>
-        <w:rPr>
-          <w:lang w:val="en-US"/>
-        </w:rPr>
-      </w:pPr>
-    </w:p>
-    <w:p>
-      <w:pPr>
-        <w:spacing w:before="200"/>
-        <w:rPr>
-          <w:lang w:val="en-US"/>
-        </w:rPr>
-      </w:pPr>
-    </w:p>
-    <w:p>
-      <w:pPr>
-        <w:spacing w:before="200"/>
-        <w:rPr>
-          <w:lang w:val="en-US"/>
-        </w:rPr>
-      </w:pPr>
-    </w:p>
-    <w:p>
-      <w:pPr>
-        <w:spacing w:before="200"/>
-        <w:rPr>
-          <w:lang w:val="en-US"/>
-        </w:rPr>
-      </w:pPr>
-    </w:p>
-    <w:p>
-      <w:pPr>
-        <w:spacing w:before="200"/>
-        <w:rPr>
-          <w:lang w:val="en-US"/>
-        </w:rPr>
-      </w:pPr>
-    </w:p>
-    <w:p>
-      <w:pPr>
-        <w:spacing w:before="200"/>
-        <w:rPr>
-          <w:lang w:val="en-US"/>
-        </w:rPr>
-      </w:pPr>
-    </w:p>
-    <w:p>
-      <w:pPr>
-        <w:spacing w:before="200"/>
-        <w:rPr>
-          <w:lang w:val="en-US"/>
-        </w:rPr>
-      </w:pPr>
-    </w:p>
-    <w:p>
-      <w:pPr>
-        <w:spacing w:before="200"/>
-        <w:rPr>
-          <w:lang w:val="en-US"/>
-        </w:rPr>
-      </w:pPr>
-    </w:p>
-    <w:p>
-      <w:pPr>
-        <w:spacing w:before="200"/>
-        <w:rPr>
-          <w:lang w:val="en-US"/>
-        </w:rPr>
-      </w:pPr>
-    </w:p>
-    <w:p>
-      <w:pPr>
-        <w:spacing w:before="200"/>
-        <w:rPr>
-          <w:lang w:val="en-US"/>
-        </w:rPr>
-      </w:pPr>
-    </w:p>
-    <w:p>
-      <w:pPr>
-        <w:spacing w:before="200"/>
-        <w:rPr>
-          <w:lang w:val="en-US"/>
-        </w:rPr>
-      </w:pPr>
-    </w:p>
-    <w:p>
-      <w:pPr>
-        <w:spacing w:before="200"/>
-        <w:rPr>
-          <w:lang w:val="en-US"/>
-        </w:rPr>
-      </w:pPr>
-    </w:p>
-    <w:p>
-      <w:pPr>
-        <w:spacing w:before="200"/>
-        <w:rPr>
-          <w:lang w:val="en-US"/>
-        </w:rPr>
-      </w:pPr>
-    </w:p>
-    <w:p>
-      <w:pPr>
-        <w:spacing w:before="200"/>
-        <w:rPr>
-          <w:lang w:val="en-US"/>
-        </w:rPr>
-      </w:pPr>
-    </w:p>
-    <w:p>
-      <w:pPr>
-        <w:spacing w:before="200"/>
-        <w:rPr>
-          <w:lang w:val="en-US"/>
-        </w:rPr>
-      </w:pPr>
-    </w:p>
-    <w:p>
-      <w:pPr>
-        <w:spacing w:before="200"/>
-        <w:rPr>
-          <w:lang w:val="en-US"/>
-        </w:rPr>
-      </w:pPr>
-    </w:p>
-    <w:p>
-      <w:pPr>
-        <w:spacing w:before="200"/>
-        <w:rPr>
-          <w:lang w:val="en-US"/>
-        </w:rPr>
-      </w:pPr>
-    </w:p>
-    <w:p>
-      <w:pPr>
-        <w:spacing w:before="200"/>
-        <w:rPr>
-          <w:lang w:val="en-US"/>
-        </w:rPr>
-      </w:pPr>
-    </w:p>
-    <w:p>
-      <w:pPr>
-        <w:spacing w:before="200"/>
-        <w:rPr>
-          <w:lang w:val="en-US"/>
-        </w:rPr>
-      </w:pPr>
-    </w:p>
-    <w:p>
-      <w:pPr>
-        <w:spacing w:before="200"/>
-        <w:rPr>
-          <w:color w:val="00B0F0"/>
-        </w:rPr>
-      </w:pPr>
-      <w:r>
-        <w:rPr>
-          <w:color w:val="00B0F0"/>
-          <w:lang w:val="en-US"/>
-        </w:rPr>
-        <w:lastRenderedPageBreak/>
-        <w:t xml:space="preserve">Assigned Public IP block - </w:t>
-      </w:r>
-      <w:r>
-        <w:rPr>
-          <w:color w:val="00B0F0"/>
-        </w:rPr>
-        <w:t>203.0.113.0/29</w:t>
-      </w:r>
-    </w:p>
-    <w:p>
-      <w:pPr>
-        <w:spacing w:before="200"/>
-        <w:rPr>
-          <w:color w:val="00B0F0"/>
-          <w:lang w:val="en-US"/>
-        </w:rPr>
-      </w:pPr>
-      <w:r>
-        <w:rPr>
-          <w:color w:val="00B0F0"/>
-          <w:lang w:val="en-US"/>
-        </w:rPr>
-        <w:t>ISP BGP ASN 6500</w:t>
-      </w:r>
-    </w:p>
-    <w:p>
-      <w:pPr>
-        <w:spacing w:before="200"/>
-        <w:rPr>
-          <w:color w:val="00B0F0"/>
-          <w:lang w:val="en-US"/>
-        </w:rPr>
-      </w:pPr>
-      <w:r>
-        <w:rPr>
-          <w:color w:val="00B0F0"/>
-          <w:lang w:val="en-US"/>
-        </w:rPr>
-        <w:t>LOCAL BGL ASN 65001</w:t>
-      </w:r>
-    </w:p>
-    <w:p>
-      <w:pPr>
-        <w:spacing w:before="200"/>
-        <w:rPr>
-          <w:color w:val="EE0000"/>
-          <w:lang w:val="en-US"/>
-        </w:rPr>
-      </w:pPr>
-      <w:r>
-        <w:rPr>
-          <w:color w:val="EE0000"/>
-          <w:lang w:val="en-US"/>
-        </w:rPr>
-        <w:t>VLAN – Subnet mapping private network of class A</w:t>
-      </w:r>
-    </w:p>
-    <w:p>
-      <w:pPr>
-        <w:spacing w:before="200"/>
-        <w:rPr>
-          <w:color w:val="EE0000"/>
-          <w:lang w:val="en-US"/>
-        </w:rPr>
-      </w:pPr>
-      <w:r>
-        <w:rPr>
-          <w:color w:val="EE0000"/>
-          <w:lang w:val="en-US"/>
-        </w:rPr>
-        <w:t xml:space="preserve">SITE 01 – </w:t>
-      </w:r>
-      <w:r>
-        <w:rPr>
-          <w:color w:val="EE0000"/>
-          <w:lang w:val="en-US"/>
-        </w:rPr>
-        <w:t>WIRED_SUM = 10.1.0.0/20, WIFI_S</w:t>
+      <w:r>
+        <w:rPr>
+          <w:lang w:val="en-US"/>
+        </w:rPr>
+        <w:t xml:space="preserve">DHCP server configs: </w:t>
+      </w:r>
+    </w:p>
+    <w:p>
+      <w:pPr>
+        <w:spacing w:before="200"/>
+        <w:rPr>
+          <w:lang w:val="en-US"/>
+        </w:rPr>
+      </w:pPr>
+      <w:r>
+        <w:rPr>
+          <w:lang w:val="en-US"/>
+        </w:rPr>
+        <w:t>DHCP server 192.168.0.100, serves for following vlans/subnets</w:t>
+      </w:r>
+    </w:p>
+    <w:p>
+      <w:pPr>
+        <w:spacing w:before="200"/>
+        <w:rPr>
+          <w:color w:val="EE0000"/>
+          <w:lang w:val="en-US"/>
+        </w:rPr>
+      </w:pPr>
+      <w:r>
+        <w:rPr>
+          <w:color w:val="EE0000"/>
+          <w:lang w:val="en-US"/>
+        </w:rPr>
+        <w:t>SITE 01 – WIRED_SUM = 10.1.0.0/20, WIFI_S</w:t>
       </w:r>
       <w:r>
         <w:rPr>
@@ -646,6 +432,846 @@
         <w:rPr>
           <w:color w:val="EE0000"/>
         </w:rPr>
+        <w:t>VLAN 120 (CORP-GUEST-WIFI) – 10.1.8.0/24</w:t>
+      </w:r>
+    </w:p>
+    <w:p>
+      <w:pPr>
+        <w:spacing w:before="200"/>
+        <w:rPr>
+          <w:lang w:val="en-US"/>
+        </w:rPr>
+      </w:pPr>
+      <w:r>
+        <w:rPr>
+          <w:lang w:val="en-US"/>
+        </w:rPr>
+        <w:t>SITE 02 Summary 10.2.0.0/20 – does not exist in CML</w:t>
+      </w:r>
+    </w:p>
+    <w:p>
+      <w:pPr>
+        <w:numPr>
+          <w:ilvl w:val="0"/>
+          <w:numId w:val="3"/>
+        </w:numPr>
+        <w:spacing w:before="200"/>
+      </w:pPr>
+      <w:r>
+        <w:t>VLAN 10 (SALES/MARKETING) – 10.2.0.0/24</w:t>
+      </w:r>
+    </w:p>
+    <w:p>
+      <w:pPr>
+        <w:numPr>
+          <w:ilvl w:val="0"/>
+          <w:numId w:val="3"/>
+        </w:numPr>
+        <w:spacing w:before="200"/>
+      </w:pPr>
+      <w:r>
+        <w:t>VLAN 20 (ENGINEERING/R&amp;D) – 10.2.1.0/24</w:t>
+      </w:r>
+    </w:p>
+    <w:p>
+      <w:pPr>
+        <w:numPr>
+          <w:ilvl w:val="0"/>
+          <w:numId w:val="3"/>
+        </w:numPr>
+        <w:spacing w:before="200"/>
+      </w:pPr>
+      <w:r>
+        <w:t>VLAN 50 (VoIP) – 10.2.2.0/23</w:t>
+      </w:r>
+    </w:p>
+    <w:p>
+      <w:pPr>
+        <w:numPr>
+          <w:ilvl w:val="0"/>
+          <w:numId w:val="3"/>
+        </w:numPr>
+        <w:spacing w:before="200"/>
+      </w:pPr>
+      <w:r>
+        <w:t>VLAN 80 (Access Points) – 10.2.6.0/24</w:t>
+      </w:r>
+    </w:p>
+    <w:p>
+      <w:pPr>
+        <w:numPr>
+          <w:ilvl w:val="0"/>
+          <w:numId w:val="3"/>
+        </w:numPr>
+        <w:spacing w:before="200"/>
+      </w:pPr>
+      <w:r>
+        <w:t>VLAN 99 (MGMT) – 10.2.9.0/24</w:t>
+      </w:r>
+    </w:p>
+    <w:p>
+      <w:pPr>
+        <w:numPr>
+          <w:ilvl w:val="0"/>
+          <w:numId w:val="3"/>
+        </w:numPr>
+        <w:spacing w:before="200"/>
+      </w:pPr>
+      <w:r>
+        <w:t>VLAN 100 (CORP-WIFI-AAA) – 10.2.4.0/23</w:t>
+      </w:r>
+    </w:p>
+    <w:p>
+      <w:pPr>
+        <w:numPr>
+          <w:ilvl w:val="0"/>
+          <w:numId w:val="3"/>
+        </w:numPr>
+        <w:spacing w:before="200"/>
+      </w:pPr>
+      <w:r>
+        <w:t>VLAN 110 (CORP-WIFI-PSK) – 10.2.7.0/24</w:t>
+      </w:r>
+    </w:p>
+    <w:p>
+      <w:pPr>
+        <w:numPr>
+          <w:ilvl w:val="0"/>
+          <w:numId w:val="3"/>
+        </w:numPr>
+        <w:spacing w:before="200"/>
+      </w:pPr>
+      <w:r>
+        <w:t>VLAN 120 (GUEST-WIFI) – 10.2.8.0/24</w:t>
+      </w:r>
+    </w:p>
+    <w:p>
+      <w:pPr>
+        <w:spacing w:before="200"/>
+        <w:rPr>
+          <w:lang w:val="en-US"/>
+        </w:rPr>
+      </w:pPr>
+    </w:p>
+    <w:p>
+      <w:pPr>
+        <w:spacing w:before="200"/>
+        <w:rPr>
+          <w:lang w:val="en-US"/>
+        </w:rPr>
+      </w:pPr>
+    </w:p>
+    <w:p>
+      <w:pPr>
+        <w:spacing w:before="200"/>
+        <w:rPr>
+          <w:lang w:val="en-US"/>
+        </w:rPr>
+      </w:pPr>
+    </w:p>
+    <w:p>
+      <w:pPr>
+        <w:spacing w:before="200"/>
+        <w:rPr>
+          <w:lang w:val="en-US"/>
+        </w:rPr>
+      </w:pPr>
+    </w:p>
+    <w:p>
+      <w:pPr>
+        <w:spacing w:before="200"/>
+        <w:rPr>
+          <w:lang w:val="en-US"/>
+        </w:rPr>
+      </w:pPr>
+    </w:p>
+    <w:p>
+      <w:pPr>
+        <w:spacing w:before="200"/>
+        <w:rPr>
+          <w:lang w:val="en-US"/>
+        </w:rPr>
+      </w:pPr>
+    </w:p>
+    <w:p>
+      <w:pPr>
+        <w:spacing w:before="200"/>
+        <w:rPr>
+          <w:lang w:val="en-US"/>
+        </w:rPr>
+      </w:pPr>
+    </w:p>
+    <w:p>
+      <w:pPr>
+        <w:spacing w:before="200"/>
+        <w:rPr>
+          <w:lang w:val="en-US"/>
+        </w:rPr>
+      </w:pPr>
+    </w:p>
+    <w:p>
+      <w:pPr>
+        <w:spacing w:before="200"/>
+        <w:rPr>
+          <w:lang w:val="en-US"/>
+        </w:rPr>
+      </w:pPr>
+      <w:r>
+        <w:rPr>
+          <w:lang w:val="en-US"/>
+        </w:rPr>
+        <w:t>NAT configs – pool is 203.0.113.1 to 203.0.113.3 for internal to external connections</w:t>
+      </w:r>
+    </w:p>
+    <w:p>
+      <w:pPr>
+        <w:spacing w:before="200"/>
+        <w:rPr>
+          <w:lang w:val="en-US"/>
+        </w:rPr>
+      </w:pPr>
+      <w:r>
+        <w:rPr>
+          <w:lang w:val="en-US"/>
+        </w:rPr>
+        <w:t>Static nat for tcp ports 80 and 443 from internet to the server in dmz</w:t>
+      </w:r>
+    </w:p>
+    <w:p>
+      <w:pPr>
+        <w:spacing w:before="200"/>
+        <w:rPr>
+          <w:lang w:val="en-US"/>
+        </w:rPr>
+      </w:pPr>
+      <w:r>
+        <w:rPr>
+          <w:lang w:val="en-US"/>
+        </w:rPr>
+        <w:t>Public ip is 203.0.113.0</w:t>
+      </w:r>
+      <w:r>
+        <w:rPr>
+          <w:lang w:val="en-US"/>
+        </w:rPr>
+        <w:t xml:space="preserve"> for public server is</w:t>
+      </w:r>
+    </w:p>
+    <w:p>
+      <w:pPr>
+        <w:spacing w:before="200"/>
+        <w:rPr>
+          <w:lang w:val="en-US"/>
+        </w:rPr>
+      </w:pPr>
+    </w:p>
+    <w:p>
+      <w:pPr>
+        <w:spacing w:before="200"/>
+        <w:rPr>
+          <w:lang w:val="en-US"/>
+        </w:rPr>
+      </w:pPr>
+    </w:p>
+    <w:p>
+      <w:pPr>
+        <w:spacing w:before="200"/>
+        <w:rPr>
+          <w:lang w:val="en-US"/>
+        </w:rPr>
+      </w:pPr>
+      <w:r>
+        <w:rPr>
+          <w:lang w:val="en-US"/>
+        </w:rPr>
+        <w:t>NAT Pool ACL</w:t>
+      </w:r>
+      <w:r>
+        <w:rPr>
+          <w:lang w:val="en-US"/>
+        </w:rPr>
+        <w:t xml:space="preserve"> (ASBR)</w:t>
+      </w:r>
+      <w:r>
+        <w:rPr>
+          <w:lang w:val="en-US"/>
+        </w:rPr>
+        <w:t xml:space="preserve"> — Internet Egress Documentation</w:t>
+      </w:r>
+      <w:r>
+        <w:rPr>
+          <w:lang w:val="en-US"/>
+        </w:rPr>
+        <w:t xml:space="preserve"> </w:t>
+      </w:r>
+    </w:p>
+    <w:p>
+      <w:pPr>
+        <w:spacing w:before="200"/>
+        <w:rPr>
+          <w:lang w:val="en-US"/>
+        </w:rPr>
+      </w:pPr>
+      <w:r>
+        <w:rPr>
+          <w:lang w:val="en-US"/>
+        </w:rPr>
+        <w:t>what subnets/vlans get access</w:t>
+      </w:r>
+    </w:p>
+    <w:p>
+      <w:pPr>
+        <w:spacing w:before="200"/>
+        <w:rPr>
+          <w:lang w:val="en-US"/>
+        </w:rPr>
+      </w:pPr>
+      <w:r>
+        <w:rPr>
+          <w:lang w:val="en-US"/>
+        </w:rPr>
+        <w:t xml:space="preserve">and single IP for NMS/SYSLOG </w:t>
+      </w:r>
+      <w:r>
+        <w:rPr>
+          <w:color w:val="EE0000"/>
+          <w:lang w:val="en-US"/>
+        </w:rPr>
+        <w:t xml:space="preserve">(192.168.0.107) </w:t>
+      </w:r>
+    </w:p>
+    <w:p>
+      <w:pPr>
+        <w:spacing w:before="200"/>
+        <w:rPr>
+          <w:color w:val="000000" w:themeColor="text1"/>
+          <w:lang w:val="en-US"/>
+        </w:rPr>
+      </w:pPr>
+      <w:r>
+        <w:rPr>
+          <w:color w:val="000000" w:themeColor="text1"/>
+          <w:lang w:val="en-US"/>
+        </w:rPr>
+        <w:t>SITE 01 – WIRED_SUM = 10.1.0.0/20, WIFI_SUM = is not summarized to route to the WLC</w:t>
+      </w:r>
+    </w:p>
+    <w:p>
+      <w:pPr>
+        <w:numPr>
+          <w:ilvl w:val="0"/>
+          <w:numId w:val="2"/>
+        </w:numPr>
+        <w:spacing w:before="200"/>
+        <w:rPr>
+          <w:color w:val="EE0000"/>
+        </w:rPr>
+      </w:pPr>
+      <w:r>
+        <w:rPr>
+          <w:color w:val="EE0000"/>
+        </w:rPr>
+        <w:t>VLAN 10 (MANAGEMENT) – 10.1.0.0/24</w:t>
+      </w:r>
+    </w:p>
+    <w:p>
+      <w:pPr>
+        <w:numPr>
+          <w:ilvl w:val="0"/>
+          <w:numId w:val="2"/>
+        </w:numPr>
+        <w:spacing w:before="200"/>
+        <w:rPr>
+          <w:color w:val="EE0000"/>
+        </w:rPr>
+      </w:pPr>
+      <w:r>
+        <w:rPr>
+          <w:color w:val="EE0000"/>
+        </w:rPr>
+        <w:t>VLAN 20 (FINANCE/ACCOUNTING) – 10.1.1.0/24</w:t>
+      </w:r>
+    </w:p>
+    <w:p>
+      <w:pPr>
+        <w:numPr>
+          <w:ilvl w:val="0"/>
+          <w:numId w:val="2"/>
+        </w:numPr>
+        <w:spacing w:before="200"/>
+        <w:rPr>
+          <w:color w:val="EE0000"/>
+        </w:rPr>
+      </w:pPr>
+      <w:r>
+        <w:rPr>
+          <w:color w:val="EE0000"/>
+        </w:rPr>
+        <w:t>VLAN 100 (CORP-WIFI-AAA) – 10.1.4.0/23</w:t>
+      </w:r>
+    </w:p>
+    <w:p>
+      <w:pPr>
+        <w:numPr>
+          <w:ilvl w:val="0"/>
+          <w:numId w:val="2"/>
+        </w:numPr>
+        <w:spacing w:before="200"/>
+        <w:rPr>
+          <w:color w:val="EE0000"/>
+        </w:rPr>
+      </w:pPr>
+      <w:r>
+        <w:rPr>
+          <w:color w:val="EE0000"/>
+        </w:rPr>
+        <w:t>VLAN 110 (CORP-WIFI-PSK) – 10.1.7.0/24</w:t>
+      </w:r>
+    </w:p>
+    <w:p>
+      <w:pPr>
+        <w:numPr>
+          <w:ilvl w:val="0"/>
+          <w:numId w:val="2"/>
+        </w:numPr>
+        <w:spacing w:before="200"/>
+        <w:rPr>
+          <w:color w:val="EE0000"/>
+        </w:rPr>
+      </w:pPr>
+      <w:r>
+        <w:rPr>
+          <w:color w:val="EE0000"/>
+        </w:rPr>
+        <w:t>VLAN 120 (CORP-GUEST-WIFI) – 10.1.8.0/24</w:t>
+      </w:r>
+    </w:p>
+    <w:p>
+      <w:pPr>
+        <w:spacing w:before="200"/>
+        <w:rPr>
+          <w:color w:val="000000" w:themeColor="text1"/>
+          <w:lang w:val="en-US"/>
+        </w:rPr>
+      </w:pPr>
+      <w:r>
+        <w:rPr>
+          <w:color w:val="000000" w:themeColor="text1"/>
+          <w:lang w:val="en-US"/>
+        </w:rPr>
+        <w:t>SITE 02 Summary 10.2.0.0/20 – does not exist in CML</w:t>
+      </w:r>
+    </w:p>
+    <w:p>
+      <w:pPr>
+        <w:numPr>
+          <w:ilvl w:val="0"/>
+          <w:numId w:val="3"/>
+        </w:numPr>
+        <w:spacing w:before="200"/>
+        <w:rPr>
+          <w:color w:val="000000" w:themeColor="text1"/>
+        </w:rPr>
+      </w:pPr>
+      <w:r>
+        <w:rPr>
+          <w:color w:val="000000" w:themeColor="text1"/>
+        </w:rPr>
+        <w:t>VLAN 10 (SALES/MARKETING) – 10.2.0.0/24</w:t>
+      </w:r>
+    </w:p>
+    <w:p>
+      <w:pPr>
+        <w:numPr>
+          <w:ilvl w:val="0"/>
+          <w:numId w:val="3"/>
+        </w:numPr>
+        <w:spacing w:before="200"/>
+        <w:rPr>
+          <w:color w:val="000000" w:themeColor="text1"/>
+        </w:rPr>
+      </w:pPr>
+      <w:r>
+        <w:rPr>
+          <w:color w:val="000000" w:themeColor="text1"/>
+        </w:rPr>
+        <w:t>VLAN 20 (ENGINEERING/R&amp;D) – 10.2.1.0/24</w:t>
+      </w:r>
+    </w:p>
+    <w:p>
+      <w:pPr>
+        <w:numPr>
+          <w:ilvl w:val="0"/>
+          <w:numId w:val="3"/>
+        </w:numPr>
+        <w:spacing w:before="200"/>
+        <w:rPr>
+          <w:color w:val="000000" w:themeColor="text1"/>
+        </w:rPr>
+      </w:pPr>
+      <w:r>
+        <w:rPr>
+          <w:color w:val="000000" w:themeColor="text1"/>
+        </w:rPr>
+        <w:t>VLAN 110 (CORP-WIFI-PSK) – 10.2.7.0/24</w:t>
+      </w:r>
+    </w:p>
+    <w:p>
+      <w:pPr>
+        <w:numPr>
+          <w:ilvl w:val="0"/>
+          <w:numId w:val="3"/>
+        </w:numPr>
+        <w:spacing w:before="200"/>
+        <w:rPr>
+          <w:color w:val="000000" w:themeColor="text1"/>
+        </w:rPr>
+      </w:pPr>
+      <w:r>
+        <w:rPr>
+          <w:color w:val="000000" w:themeColor="text1"/>
+        </w:rPr>
+        <w:t>VLAN 120 (GUEST-WIFI) – 10.2.8.0/24</w:t>
+      </w:r>
+    </w:p>
+    <w:p>
+      <w:pPr>
+        <w:spacing w:before="200"/>
+        <w:rPr>
+          <w:lang w:val="en-US"/>
+        </w:rPr>
+      </w:pPr>
+    </w:p>
+    <w:p>
+      <w:pPr>
+        <w:spacing w:before="200"/>
+        <w:rPr>
+          <w:lang w:val="en-US"/>
+        </w:rPr>
+      </w:pPr>
+    </w:p>
+    <w:p>
+      <w:pPr>
+        <w:spacing w:before="200"/>
+        <w:rPr>
+          <w:lang w:val="en-US"/>
+        </w:rPr>
+      </w:pPr>
+    </w:p>
+    <w:p>
+      <w:pPr>
+        <w:spacing w:before="200"/>
+        <w:rPr>
+          <w:lang w:val="en-US"/>
+        </w:rPr>
+      </w:pPr>
+    </w:p>
+    <w:p>
+      <w:pPr>
+        <w:spacing w:before="200"/>
+        <w:rPr>
+          <w:lang w:val="en-US"/>
+        </w:rPr>
+      </w:pPr>
+    </w:p>
+    <w:p>
+      <w:pPr>
+        <w:spacing w:before="200"/>
+        <w:rPr>
+          <w:lang w:val="en-US"/>
+        </w:rPr>
+      </w:pPr>
+    </w:p>
+    <w:p>
+      <w:pPr>
+        <w:spacing w:before="200"/>
+        <w:rPr>
+          <w:lang w:val="en-US"/>
+        </w:rPr>
+      </w:pPr>
+    </w:p>
+    <w:p>
+      <w:pPr>
+        <w:spacing w:before="200"/>
+        <w:rPr>
+          <w:lang w:val="en-US"/>
+        </w:rPr>
+      </w:pPr>
+    </w:p>
+    <w:p>
+      <w:pPr>
+        <w:spacing w:before="200"/>
+        <w:rPr>
+          <w:lang w:val="en-US"/>
+        </w:rPr>
+      </w:pPr>
+    </w:p>
+    <w:p>
+      <w:pPr>
+        <w:spacing w:before="200"/>
+        <w:rPr>
+          <w:lang w:val="en-US"/>
+        </w:rPr>
+      </w:pPr>
+    </w:p>
+    <w:p>
+      <w:pPr>
+        <w:spacing w:before="200"/>
+        <w:rPr>
+          <w:lang w:val="en-US"/>
+        </w:rPr>
+      </w:pPr>
+    </w:p>
+    <w:p>
+      <w:pPr>
+        <w:spacing w:before="200"/>
+        <w:rPr>
+          <w:lang w:val="en-US"/>
+        </w:rPr>
+      </w:pPr>
+    </w:p>
+    <w:p>
+      <w:pPr>
+        <w:spacing w:before="200"/>
+        <w:rPr>
+          <w:color w:val="00B0F0"/>
+          <w:lang w:val="en-US"/>
+        </w:rPr>
+      </w:pPr>
+      <w:r>
+        <w:rPr>
+          <w:color w:val="00B0F0"/>
+          <w:lang w:val="en-US"/>
+        </w:rPr>
+        <w:t xml:space="preserve">Assigned Public IP block - </w:t>
+      </w:r>
+      <w:r>
+        <w:rPr>
+          <w:color w:val="00B0F0"/>
+          <w:lang w:val="en-US"/>
+        </w:rPr>
+        <w:t>203.0.113.0/29</w:t>
+      </w:r>
+    </w:p>
+    <w:p>
+      <w:pPr>
+        <w:spacing w:before="200"/>
+        <w:rPr>
+          <w:color w:val="00B0F0"/>
+          <w:lang w:val="en-US"/>
+        </w:rPr>
+      </w:pPr>
+      <w:r>
+        <w:rPr>
+          <w:color w:val="00B0F0"/>
+          <w:lang w:val="en-US"/>
+        </w:rPr>
+        <w:t>ISP BGP ASN 6500</w:t>
+      </w:r>
+    </w:p>
+    <w:p>
+      <w:pPr>
+        <w:spacing w:before="200"/>
+        <w:rPr>
+          <w:color w:val="00B0F0"/>
+          <w:lang w:val="en-US"/>
+        </w:rPr>
+      </w:pPr>
+      <w:r>
+        <w:rPr>
+          <w:color w:val="00B0F0"/>
+          <w:lang w:val="en-US"/>
+        </w:rPr>
+        <w:t>LOCAL BGL ASN 65001</w:t>
+      </w:r>
+    </w:p>
+    <w:p>
+      <w:pPr>
+        <w:spacing w:before="200"/>
+        <w:rPr>
+          <w:color w:val="EE0000"/>
+          <w:lang w:val="en-US"/>
+        </w:rPr>
+      </w:pPr>
+      <w:r>
+        <w:rPr>
+          <w:color w:val="EE0000"/>
+          <w:lang w:val="en-US"/>
+        </w:rPr>
+        <w:t>VLAN – Subnet mapping private network of class A</w:t>
+      </w:r>
+    </w:p>
+    <w:p>
+      <w:pPr>
+        <w:spacing w:before="200"/>
+        <w:rPr>
+          <w:color w:val="EE0000"/>
+          <w:lang w:val="en-US"/>
+        </w:rPr>
+      </w:pPr>
+      <w:r>
+        <w:rPr>
+          <w:color w:val="EE0000"/>
+          <w:lang w:val="en-US"/>
+        </w:rPr>
+        <w:t xml:space="preserve">SITE 01 – </w:t>
+      </w:r>
+      <w:r>
+        <w:rPr>
+          <w:color w:val="EE0000"/>
+          <w:lang w:val="en-US"/>
+        </w:rPr>
+        <w:t>WIRED_SUM = 10.1.0.0/20, WIFI_S</w:t>
+      </w:r>
+      <w:r>
+        <w:rPr>
+          <w:color w:val="EE0000"/>
+          <w:lang w:val="en-US"/>
+        </w:rPr>
+        <w:t>UM = is not summarized to route to the WLC</w:t>
+      </w:r>
+    </w:p>
+    <w:p>
+      <w:pPr>
+        <w:numPr>
+          <w:ilvl w:val="0"/>
+          <w:numId w:val="2"/>
+        </w:numPr>
+        <w:spacing w:before="200"/>
+        <w:rPr>
+          <w:color w:val="EE0000"/>
+        </w:rPr>
+      </w:pPr>
+      <w:r>
+        <w:rPr>
+          <w:color w:val="EE0000"/>
+        </w:rPr>
+        <w:t>VLAN 10 (MANAGEMENT) – 10.1.0.0/24</w:t>
+      </w:r>
+    </w:p>
+    <w:p>
+      <w:pPr>
+        <w:numPr>
+          <w:ilvl w:val="0"/>
+          <w:numId w:val="2"/>
+        </w:numPr>
+        <w:spacing w:before="200"/>
+        <w:rPr>
+          <w:color w:val="EE0000"/>
+        </w:rPr>
+      </w:pPr>
+      <w:r>
+        <w:rPr>
+          <w:color w:val="EE0000"/>
+        </w:rPr>
+        <w:t>VLAN 20 (FINANCE/ACCOUNTING) – 10.1.1.0/24</w:t>
+      </w:r>
+    </w:p>
+    <w:p>
+      <w:pPr>
+        <w:numPr>
+          <w:ilvl w:val="0"/>
+          <w:numId w:val="2"/>
+        </w:numPr>
+        <w:spacing w:before="200"/>
+        <w:rPr>
+          <w:color w:val="EE0000"/>
+        </w:rPr>
+      </w:pPr>
+      <w:r>
+        <w:rPr>
+          <w:color w:val="EE0000"/>
+        </w:rPr>
+        <w:t>VLAN 50 (VoIP) – 10.1.2.0/23</w:t>
+      </w:r>
+    </w:p>
+    <w:p>
+      <w:pPr>
+        <w:numPr>
+          <w:ilvl w:val="0"/>
+          <w:numId w:val="2"/>
+        </w:numPr>
+        <w:spacing w:before="200"/>
+        <w:rPr>
+          <w:color w:val="EE0000"/>
+        </w:rPr>
+      </w:pPr>
+      <w:r>
+        <w:rPr>
+          <w:color w:val="EE0000"/>
+        </w:rPr>
+        <w:t>VLAN 80 (Access Points) – 10.1.6.0/24</w:t>
+      </w:r>
+    </w:p>
+    <w:p>
+      <w:pPr>
+        <w:numPr>
+          <w:ilvl w:val="0"/>
+          <w:numId w:val="2"/>
+        </w:numPr>
+        <w:spacing w:before="200"/>
+        <w:rPr>
+          <w:color w:val="EE0000"/>
+        </w:rPr>
+      </w:pPr>
+      <w:r>
+        <w:rPr>
+          <w:color w:val="EE0000"/>
+        </w:rPr>
+        <w:t>VLAN 99 (MGMT) – 10.1.9.0/24</w:t>
+      </w:r>
+    </w:p>
+    <w:p>
+      <w:pPr>
+        <w:numPr>
+          <w:ilvl w:val="0"/>
+          <w:numId w:val="2"/>
+        </w:numPr>
+        <w:spacing w:before="200"/>
+        <w:rPr>
+          <w:color w:val="EE0000"/>
+        </w:rPr>
+      </w:pPr>
+      <w:r>
+        <w:rPr>
+          <w:color w:val="EE0000"/>
+        </w:rPr>
+        <w:t>VLAN 100 (CORP-WIFI-AAA) – 10.1.4.0/23</w:t>
+      </w:r>
+    </w:p>
+    <w:p>
+      <w:pPr>
+        <w:numPr>
+          <w:ilvl w:val="0"/>
+          <w:numId w:val="2"/>
+        </w:numPr>
+        <w:spacing w:before="200"/>
+        <w:rPr>
+          <w:color w:val="EE0000"/>
+        </w:rPr>
+      </w:pPr>
+      <w:r>
+        <w:rPr>
+          <w:color w:val="EE0000"/>
+        </w:rPr>
+        <w:t>VLAN 110 (CORP-WIFI-PSK) – 10.1.7.0/24</w:t>
+      </w:r>
+    </w:p>
+    <w:p>
+      <w:pPr>
+        <w:numPr>
+          <w:ilvl w:val="0"/>
+          <w:numId w:val="2"/>
+        </w:numPr>
+        <w:spacing w:before="200"/>
+        <w:rPr>
+          <w:color w:val="EE0000"/>
+        </w:rPr>
+      </w:pPr>
+      <w:r>
+        <w:rPr>
+          <w:color w:val="EE0000"/>
+        </w:rPr>
         <w:t>VLAN 120 (</w:t>
       </w:r>
       <w:r>
@@ -848,6 +1474,7 @@
         <w:rPr>
           <w:color w:val="EE0000"/>
         </w:rPr>
+        <w:lastRenderedPageBreak/>
         <w:t>1</w:t>
       </w:r>
       <w:r>
@@ -991,7 +1618,6 @@
           <w:color w:val="EE0000"/>
           <w:lang w:val="en-US"/>
         </w:rPr>
-        <w:lastRenderedPageBreak/>
         <w:t>Core → Distribution (full mesh, both sites)</w:t>
       </w:r>
       <w:r>
@@ -1230,14 +1856,488 @@
           <w:lang w:val="en-US"/>
         </w:rPr>
       </w:pPr>
-    </w:p>
-    <w:p>
-      <w:pPr>
-        <w:spacing w:before="200"/>
-        <w:rPr>
-          <w:lang w:val="en-US"/>
-        </w:rPr>
-      </w:pPr>
+      <w:r>
+        <w:rPr>
+          <w:lang w:val="en-US"/>
+        </w:rPr>
+        <w:t>Ntp</w:t>
+      </w:r>
+    </w:p>
+    <w:p>
+      <w:pPr>
+        <w:spacing w:before="200"/>
+        <w:rPr>
+          <w:lang w:val="en-US"/>
+        </w:rPr>
+      </w:pPr>
+      <w:r>
+        <w:rPr>
+          <w:lang w:val="en-US"/>
+        </w:rPr>
+        <w:t>en</w:t>
+      </w:r>
+    </w:p>
+    <w:p>
+      <w:pPr>
+        <w:spacing w:before="200"/>
+        <w:rPr>
+          <w:lang w:val="en-US"/>
+        </w:rPr>
+      </w:pPr>
+      <w:r>
+        <w:rPr>
+          <w:lang w:val="en-US"/>
+        </w:rPr>
+        <w:lastRenderedPageBreak/>
+        <w:t>conf t</w:t>
+      </w:r>
+    </w:p>
+    <w:p>
+      <w:pPr>
+        <w:spacing w:before="200"/>
+        <w:rPr>
+          <w:lang w:val="en-US"/>
+        </w:rPr>
+      </w:pPr>
+      <w:r>
+        <w:rPr>
+          <w:lang w:val="en-US"/>
+        </w:rPr>
+        <w:t>clock timezone gmt+5 +5</w:t>
+      </w:r>
+    </w:p>
+    <w:p>
+      <w:pPr>
+        <w:spacing w:before="200"/>
+        <w:rPr>
+          <w:lang w:val="en-US"/>
+        </w:rPr>
+      </w:pPr>
+      <w:r>
+        <w:rPr>
+          <w:lang w:val="en-US"/>
+        </w:rPr>
+        <w:t>ntp server 192.168.0.100 prefer</w:t>
+      </w:r>
+    </w:p>
+    <w:p>
+      <w:pPr>
+        <w:spacing w:before="200"/>
+        <w:rPr>
+          <w:lang w:val="en-US"/>
+        </w:rPr>
+      </w:pPr>
+      <w:r>
+        <w:rPr>
+          <w:lang w:val="en-US"/>
+        </w:rPr>
+        <w:t>ntp source loopback0</w:t>
+      </w:r>
+    </w:p>
+    <w:p>
+      <w:pPr>
+        <w:spacing w:before="200"/>
+        <w:rPr>
+          <w:lang w:val="en-US"/>
+        </w:rPr>
+      </w:pPr>
+      <w:r>
+        <w:rPr>
+          <w:lang w:val="en-US"/>
+        </w:rPr>
+        <w:t>end</w:t>
+      </w:r>
+    </w:p>
+    <w:p>
+      <w:pPr>
+        <w:spacing w:before="200"/>
+        <w:rPr>
+          <w:lang w:val="en-US"/>
+        </w:rPr>
+      </w:pPr>
+      <w:r>
+        <w:rPr>
+          <w:lang w:val="en-US"/>
+        </w:rPr>
+        <w:t>write</w:t>
+      </w:r>
+    </w:p>
+    <w:p>
+      <w:pPr>
+        <w:spacing w:before="200"/>
+        <w:rPr>
+          <w:lang w:val="en-US"/>
+        </w:rPr>
+      </w:pPr>
+    </w:p>
+    <w:p>
+      <w:pPr>
+        <w:spacing w:before="200"/>
+        <w:rPr>
+          <w:lang w:val="en-US"/>
+        </w:rPr>
+      </w:pPr>
+      <w:r>
+        <w:rPr>
+          <w:lang w:val="en-US"/>
+        </w:rPr>
+        <w:t>using chrony –</w:t>
+      </w:r>
+    </w:p>
+    <w:p>
+      <w:pPr>
+        <w:spacing w:before="200"/>
+        <w:rPr>
+          <w:lang w:val="en-US"/>
+        </w:rPr>
+      </w:pPr>
+    </w:p>
+    <w:p>
+      <w:pPr>
+        <w:spacing w:before="200"/>
+        <w:rPr>
+          <w:lang w:val="en-US"/>
+        </w:rPr>
+      </w:pPr>
+      <w:r>
+        <w:rPr>
+          <w:lang w:val="en-US"/>
+        </w:rPr>
+        <w:t>DNS</w:t>
+      </w:r>
+    </w:p>
+    <w:p>
+      <w:pPr>
+        <w:spacing w:before="200"/>
+        <w:rPr>
+          <w:lang w:val="en-US"/>
+        </w:rPr>
+      </w:pPr>
+      <w:r>
+        <w:rPr>
+          <w:lang w:val="en-US"/>
+        </w:rPr>
+        <w:t>Good, that clarifies things, comrade — yes, your instinct is basically right, with one nuance for L2 switches.</w:t>
+      </w:r>
+    </w:p>
+    <w:p>
+      <w:pPr>
+        <w:spacing w:before="200"/>
+        <w:rPr>
+          <w:lang w:val="en-US"/>
+        </w:rPr>
+      </w:pPr>
+      <w:r>
+        <w:rPr>
+          <w:b/>
+          <w:bCs/>
+          <w:lang w:val="en-US"/>
+        </w:rPr>
+        <w:t>Network devices (L3: routers, core, distribution, firewall, SRVRM-SW1)</w:t>
+      </w:r>
+      <w:r>
+        <w:rPr>
+          <w:lang w:val="en-US"/>
+        </w:rPr>
+        <w:t xml:space="preserve"> — use their </w:t>
+      </w:r>
+      <w:r>
+        <w:rPr>
+          <w:b/>
+          <w:bCs/>
+          <w:lang w:val="en-US"/>
+        </w:rPr>
+        <w:t>Loopback0 management IPs</w:t>
+      </w:r>
+      <w:r>
+        <w:rPr>
+          <w:lang w:val="en-US"/>
+        </w:rPr>
+        <w:t xml:space="preserve"> (10.0.5.x/32), since that's their designated management interface and the stable, always-reachable address regardless of physical link state. That's exactly what it's there for.</w:t>
+      </w:r>
+    </w:p>
+    <w:p>
+      <w:pPr>
+        <w:spacing w:before="200"/>
+        <w:rPr>
+          <w:lang w:val="en-US"/>
+        </w:rPr>
+      </w:pPr>
+      <w:r>
+        <w:rPr>
+          <w:lang w:val="en-US"/>
+        </w:rPr>
+        <w:t>wan-r1          IN  A   10.0.5.1</w:t>
+      </w:r>
+    </w:p>
+    <w:p>
+      <w:pPr>
+        <w:spacing w:before="200"/>
+        <w:rPr>
+          <w:lang w:val="en-US"/>
+        </w:rPr>
+      </w:pPr>
+      <w:r>
+        <w:rPr>
+          <w:lang w:val="en-US"/>
+        </w:rPr>
+        <w:t>fw              IN  A   10.0.5.2</w:t>
+      </w:r>
+    </w:p>
+    <w:p>
+      <w:pPr>
+        <w:spacing w:before="200"/>
+        <w:rPr>
+          <w:lang w:val="en-US"/>
+        </w:rPr>
+      </w:pPr>
+      <w:r>
+        <w:rPr>
+          <w:lang w:val="en-US"/>
+        </w:rPr>
+        <w:t>core-r1         IN  A   10.0.5.3</w:t>
+      </w:r>
+    </w:p>
+    <w:p>
+      <w:pPr>
+        <w:spacing w:before="200"/>
+        <w:rPr>
+          <w:lang w:val="en-US"/>
+        </w:rPr>
+      </w:pPr>
+      <w:r>
+        <w:rPr>
+          <w:lang w:val="en-US"/>
+        </w:rPr>
+        <w:t>core-r2         IN  A   10.0.5.4</w:t>
+      </w:r>
+    </w:p>
+    <w:p>
+      <w:pPr>
+        <w:spacing w:before="200"/>
+        <w:rPr>
+          <w:lang w:val="en-US"/>
+        </w:rPr>
+      </w:pPr>
+      <w:r>
+        <w:rPr>
+          <w:lang w:val="en-US"/>
+        </w:rPr>
+        <w:t>srvrm-sw1       IN  A   10.0.5.5</w:t>
+      </w:r>
+    </w:p>
+    <w:p>
+      <w:pPr>
+        <w:spacing w:before="200"/>
+        <w:rPr>
+          <w:lang w:val="en-US"/>
+        </w:rPr>
+      </w:pPr>
+      <w:r>
+        <w:rPr>
+          <w:lang w:val="en-US"/>
+        </w:rPr>
+        <w:t>dsw01-site01    IN  A   10.0.5.11</w:t>
+      </w:r>
+    </w:p>
+    <w:p>
+      <w:pPr>
+        <w:spacing w:before="200"/>
+        <w:rPr>
+          <w:lang w:val="en-US"/>
+        </w:rPr>
+      </w:pPr>
+      <w:r>
+        <w:rPr>
+          <w:lang w:val="en-US"/>
+        </w:rPr>
+        <w:t>dsw02-site01    IN  A   10.0.5.12</w:t>
+      </w:r>
+    </w:p>
+    <w:p>
+      <w:pPr>
+        <w:spacing w:before="200"/>
+        <w:rPr>
+          <w:lang w:val="en-US"/>
+        </w:rPr>
+      </w:pPr>
+      <w:r>
+        <w:rPr>
+          <w:b/>
+          <w:bCs/>
+          <w:lang w:val="en-US"/>
+        </w:rPr>
+        <w:t>Pure L2 access switches (ASW)</w:t>
+      </w:r>
+      <w:r>
+        <w:rPr>
+          <w:lang w:val="en-US"/>
+        </w:rPr>
+        <w:t xml:space="preserve"> — no loopback available, so use their </w:t>
+      </w:r>
+      <w:r>
+        <w:rPr>
+          <w:b/>
+          <w:bCs/>
+          <w:lang w:val="en-US"/>
+        </w:rPr>
+        <w:t>VLAN 99 SVI address</w:t>
+      </w:r>
+      <w:r>
+        <w:rPr>
+          <w:lang w:val="en-US"/>
+        </w:rPr>
+        <w:t xml:space="preserve"> instead:</w:t>
+      </w:r>
+    </w:p>
+    <w:p>
+      <w:pPr>
+        <w:spacing w:before="200"/>
+        <w:rPr>
+          <w:lang w:val="en-US"/>
+        </w:rPr>
+      </w:pPr>
+      <w:r>
+        <w:rPr>
+          <w:lang w:val="en-US"/>
+        </w:rPr>
+        <w:t>asw01-site01    IN  A   10.1.9.11</w:t>
+      </w:r>
+    </w:p>
+    <w:p>
+      <w:pPr>
+        <w:spacing w:before="200"/>
+        <w:rPr>
+          <w:lang w:val="en-US"/>
+        </w:rPr>
+      </w:pPr>
+      <w:r>
+        <w:rPr>
+          <w:lang w:val="en-US"/>
+        </w:rPr>
+        <w:t>asw02-site01    IN  A   10.1.9.12</w:t>
+      </w:r>
+    </w:p>
+    <w:p>
+      <w:pPr>
+        <w:spacing w:before="200"/>
+        <w:rPr>
+          <w:lang w:val="en-US"/>
+        </w:rPr>
+      </w:pPr>
+      <w:r>
+        <w:rPr>
+          <w:b/>
+          <w:bCs/>
+          <w:lang w:val="en-US"/>
+        </w:rPr>
+        <w:t>Servers</w:t>
+      </w:r>
+      <w:r>
+        <w:rPr>
+          <w:lang w:val="en-US"/>
+        </w:rPr>
+        <w:t xml:space="preserve"> — yes, just their normal/common assigned IP, since they typically have one relevant address anyway:</w:t>
+      </w:r>
+    </w:p>
+    <w:p>
+      <w:pPr>
+        <w:spacing w:before="200"/>
+        <w:rPr>
+          <w:lang w:val="en-US"/>
+        </w:rPr>
+      </w:pPr>
+      <w:r>
+        <w:rPr>
+          <w:lang w:val="en-US"/>
+        </w:rPr>
+        <w:t>dns-dhcp-ntp    IN  A   192.168.0.100</w:t>
+      </w:r>
+    </w:p>
+    <w:p>
+      <w:pPr>
+        <w:spacing w:before="200"/>
+        <w:rPr>
+          <w:lang w:val="en-US"/>
+        </w:rPr>
+      </w:pPr>
+      <w:r>
+        <w:rPr>
+          <w:lang w:val="en-US"/>
+        </w:rPr>
+        <w:t>pub-srv         IN  A   10.0.1.100</w:t>
+      </w:r>
+    </w:p>
+    <w:p>
+      <w:pPr>
+        <w:spacing w:before="200"/>
+        <w:rPr>
+          <w:lang w:val="en-US"/>
+        </w:rPr>
+      </w:pPr>
+      <w:r>
+        <w:rPr>
+          <w:lang w:val="en-US"/>
+        </w:rPr>
+        <w:lastRenderedPageBreak/>
+        <w:t>wlc             IN  A   10.0.2.100</w:t>
+      </w:r>
+    </w:p>
+    <w:p>
+      <w:pPr>
+        <w:spacing w:before="200"/>
+        <w:rPr>
+          <w:lang w:val="en-US"/>
+        </w:rPr>
+      </w:pPr>
+      <w:r>
+        <w:rPr>
+          <w:lang w:val="en-US"/>
+        </w:rPr>
+        <w:t>ldap-aaa        IN  A   192.168.0.101</w:t>
+      </w:r>
+    </w:p>
+    <w:p>
+      <w:pPr>
+        <w:spacing w:before="200"/>
+        <w:rPr>
+          <w:lang w:val="en-US"/>
+        </w:rPr>
+      </w:pPr>
+      <w:r>
+        <w:rPr>
+          <w:lang w:val="en-US"/>
+        </w:rPr>
+        <w:t>pki-srv         IN  A   192.168.0.102</w:t>
+      </w:r>
+    </w:p>
+    <w:p>
+      <w:pPr>
+        <w:spacing w:before="200"/>
+        <w:rPr>
+          <w:lang w:val="en-US"/>
+        </w:rPr>
+      </w:pPr>
+      <w:r>
+        <w:rPr>
+          <w:lang w:val="en-US"/>
+        </w:rPr>
+        <w:t xml:space="preserve">So the rule of thumb: </w:t>
+      </w:r>
+      <w:r>
+        <w:rPr>
+          <w:b/>
+          <w:bCs/>
+          <w:lang w:val="en-US"/>
+        </w:rPr>
+        <w:t>loopback if it has one, VLAN 99 SVI if it's L2-only, plain assigned IP for servers.</w:t>
+      </w:r>
+      <w:r>
+        <w:rPr>
+          <w:lang w:val="en-US"/>
+        </w:rPr>
+        <w:t xml:space="preserve"> That matches the "always use the stable management-plane address" philosophy your doc already establishes for the loopback block.</w:t>
+      </w:r>
     </w:p>
     <w:p>
       <w:pPr>
@@ -2954,6 +4054,82 @@
         <w:t>13. Out-of-Band Management</w:t>
       </w:r>
       <w:bookmarkEnd w:id="48"/>
+      <w:r>
+        <w:rPr>
+          <w:lang w:val="en-US"/>
+        </w:rPr>
+        <w:t xml:space="preserve"> and Servers Ips</w:t>
+      </w:r>
+    </w:p>
+    <w:p>
+      <w:pPr>
+        <w:pStyle w:val="1"/>
+        <w:rPr>
+          <w:lang w:val="en-US"/>
+        </w:rPr>
+      </w:pPr>
+      <w:r>
+        <w:rPr>
+          <w:lang w:val="en-US"/>
+        </w:rPr>
+        <w:t>DNS/DHCP/NTP – 192.168.0.100</w:t>
+      </w:r>
+    </w:p>
+    <w:p>
+      <w:pPr>
+        <w:pStyle w:val="1"/>
+        <w:rPr>
+          <w:lang w:val="en-US"/>
+        </w:rPr>
+      </w:pPr>
+      <w:r>
+        <w:rPr>
+          <w:lang w:val="en-US"/>
+        </w:rPr>
+        <w:t>PUBLIC_SRV – 10.0.1.100</w:t>
+      </w:r>
+    </w:p>
+    <w:p>
+      <w:pPr>
+        <w:pStyle w:val="1"/>
+        <w:rPr>
+          <w:lang w:val="en-US"/>
+        </w:rPr>
+      </w:pPr>
+      <w:r>
+        <w:rPr>
+          <w:lang w:val="en-US"/>
+        </w:rPr>
+        <w:t>WLC – 10.0.2.100</w:t>
+      </w:r>
+    </w:p>
+    <w:p>
+      <w:pPr>
+        <w:pStyle w:val="1"/>
+        <w:rPr>
+          <w:lang w:val="en-US"/>
+        </w:rPr>
+      </w:pPr>
+      <w:r>
+        <w:rPr>
+          <w:lang w:val="en-US"/>
+        </w:rPr>
+        <w:t>LDAP/AAA – 192.168.0.101 – yet to add</w:t>
+      </w:r>
+    </w:p>
+    <w:p>
+      <w:pPr>
+        <w:pStyle w:val="1"/>
+        <w:rPr>
+          <w:lang w:val="en-US"/>
+        </w:rPr>
+      </w:pPr>
+      <w:r>
+        <w:rPr>
+          <w:lang w:val="en-US"/>
+        </w:rPr>
+        <w:t>PKI_SRV – 192.168.0.102 – yet to add</w:t>
+      </w:r>
     </w:p>
     <w:p>
       <w:pPr>
@@ -4441,6 +5617,7 @@
         <w:rPr>
           <w:lang w:val="en-US"/>
         </w:rPr>
+        <w:lastRenderedPageBreak/>
         <w:t>14. Management and Monitoring</w:t>
       </w:r>
       <w:bookmarkEnd w:id="49"/>
@@ -4553,7 +5730,6 @@
         <w:rPr>
           <w:lang w:val="en-US"/>
         </w:rPr>
-        <w:lastRenderedPageBreak/>
         <w:t>14.4 Backup and Configuration Management</w:t>
       </w:r>
       <w:bookmarkEnd w:id="53"/>

</xml_diff>

<commit_message>
SLA + GLBP labs
</commit_message>
<xml_diff>
--- a/CCNP Lab111 - Small Enterprise Network Design/CCNP_Lab111_-_Small_Enterprise_Network_Design_Documentation.docx
+++ b/CCNP Lab111 - Small Enterprise Network Design/CCNP_Lab111_-_Small_Enterprise_Network_Design_Documentation.docx
@@ -265,7 +265,21 @@
         <w:rPr>
           <w:lang w:val="en-US"/>
         </w:rPr>
-        <w:t>DHCP server 192.168.0.100, serves for following vlans/subnets</w:t>
+        <w:t xml:space="preserve">DHCP server 192.168.0.100, serves for following </w:t>
+      </w:r>
+      <w:proofErr w:type="spellStart"/>
+      <w:r>
+        <w:rPr>
+          <w:lang w:val="en-US"/>
+        </w:rPr>
+        <w:t>vlans</w:t>
+      </w:r>
+      <w:proofErr w:type="spellEnd"/>
+      <w:r>
+        <w:rPr>
+          <w:lang w:val="en-US"/>
+        </w:rPr>
+        <w:t>/subnets</w:t>
       </w:r>
     </w:p>
     <w:p>
@@ -360,7 +374,21 @@
         <w:rPr>
           <w:color w:val="EE0000"/>
         </w:rPr>
-        <w:t>VLAN 80 (Access Points) – 10.1.6.0/24</w:t>
+        <w:t xml:space="preserve">VLAN 80 (Access </w:t>
+      </w:r>
+      <w:proofErr w:type="spellStart"/>
+      <w:r>
+        <w:rPr>
+          <w:color w:val="EE0000"/>
+        </w:rPr>
+        <w:t>Points</w:t>
+      </w:r>
+      <w:proofErr w:type="spellEnd"/>
+      <w:r>
+        <w:rPr>
+          <w:color w:val="EE0000"/>
+        </w:rPr>
+        <w:t>) – 10.1.6.0/24</w:t>
       </w:r>
     </w:p>
     <w:p>
@@ -494,7 +522,15 @@
         <w:spacing w:before="200"/>
       </w:pPr>
       <w:r>
-        <w:t>VLAN 80 (Access Points) – 10.2.6.0/24</w:t>
+        <w:t xml:space="preserve">VLAN 80 (Access </w:t>
+      </w:r>
+      <w:proofErr w:type="spellStart"/>
+      <w:r>
+        <w:t>Points</w:t>
+      </w:r>
+      <w:proofErr w:type="spellEnd"/>
+      <w:r>
+        <w:t>) – 10.2.6.0/24</w:t>
       </w:r>
     </w:p>
     <w:p>
@@ -634,21 +670,71 @@
         <w:rPr>
           <w:lang w:val="en-US"/>
         </w:rPr>
-        <w:t>Static nat for tcp ports 80 and 443 from internet to the server in dmz</w:t>
-      </w:r>
-    </w:p>
-    <w:p>
-      <w:pPr>
-        <w:spacing w:before="200"/>
-        <w:rPr>
-          <w:lang w:val="en-US"/>
-        </w:rPr>
-      </w:pPr>
-      <w:r>
-        <w:rPr>
-          <w:lang w:val="en-US"/>
-        </w:rPr>
-        <w:t>Public ip is 203.0.113.0</w:t>
+        <w:t xml:space="preserve">Static </w:t>
+      </w:r>
+      <w:proofErr w:type="spellStart"/>
+      <w:r>
+        <w:rPr>
+          <w:lang w:val="en-US"/>
+        </w:rPr>
+        <w:t>nat</w:t>
+      </w:r>
+      <w:proofErr w:type="spellEnd"/>
+      <w:r>
+        <w:rPr>
+          <w:lang w:val="en-US"/>
+        </w:rPr>
+        <w:t xml:space="preserve"> for </w:t>
+      </w:r>
+      <w:proofErr w:type="spellStart"/>
+      <w:r>
+        <w:rPr>
+          <w:lang w:val="en-US"/>
+        </w:rPr>
+        <w:t>tcp</w:t>
+      </w:r>
+      <w:proofErr w:type="spellEnd"/>
+      <w:r>
+        <w:rPr>
+          <w:lang w:val="en-US"/>
+        </w:rPr>
+        <w:t xml:space="preserve"> ports 80 and 443 from internet to the server in </w:t>
+      </w:r>
+      <w:proofErr w:type="spellStart"/>
+      <w:r>
+        <w:rPr>
+          <w:lang w:val="en-US"/>
+        </w:rPr>
+        <w:t>dmz</w:t>
+      </w:r>
+      <w:proofErr w:type="spellEnd"/>
+    </w:p>
+    <w:p>
+      <w:pPr>
+        <w:spacing w:before="200"/>
+        <w:rPr>
+          <w:lang w:val="en-US"/>
+        </w:rPr>
+      </w:pPr>
+      <w:r>
+        <w:rPr>
+          <w:lang w:val="en-US"/>
+        </w:rPr>
+        <w:t xml:space="preserve">Public </w:t>
+      </w:r>
+      <w:proofErr w:type="spellStart"/>
+      <w:r>
+        <w:rPr>
+          <w:lang w:val="en-US"/>
+        </w:rPr>
+        <w:t>ip</w:t>
+      </w:r>
+      <w:proofErr w:type="spellEnd"/>
+      <w:r>
+        <w:rPr>
+          <w:lang w:val="en-US"/>
+        </w:rPr>
+        <w:t xml:space="preserve"> is 203.0.113.0</w:t>
       </w:r>
       <w:r>
         <w:rPr>
@@ -716,7 +802,21 @@
         <w:rPr>
           <w:lang w:val="en-US"/>
         </w:rPr>
-        <w:t>what subnets/vlans get access</w:t>
+        <w:t>what subnets/</w:t>
+      </w:r>
+      <w:proofErr w:type="spellStart"/>
+      <w:r>
+        <w:rPr>
+          <w:lang w:val="en-US"/>
+        </w:rPr>
+        <w:t>vlans</w:t>
+      </w:r>
+      <w:proofErr w:type="spellEnd"/>
+      <w:r>
+        <w:rPr>
+          <w:lang w:val="en-US"/>
+        </w:rPr>
+        <w:t xml:space="preserve"> get access</w:t>
       </w:r>
     </w:p>
     <w:p>
@@ -1200,7 +1300,21 @@
         <w:rPr>
           <w:color w:val="EE0000"/>
         </w:rPr>
-        <w:t>VLAN 80 (Access Points) – 10.1.6.0/24</w:t>
+        <w:t xml:space="preserve">VLAN 80 (Access </w:t>
+      </w:r>
+      <w:proofErr w:type="spellStart"/>
+      <w:r>
+        <w:rPr>
+          <w:color w:val="EE0000"/>
+        </w:rPr>
+        <w:t>Points</w:t>
+      </w:r>
+      <w:proofErr w:type="spellEnd"/>
+      <w:r>
+        <w:rPr>
+          <w:color w:val="EE0000"/>
+        </w:rPr>
+        <w:t>) – 10.1.6.0/24</w:t>
       </w:r>
     </w:p>
     <w:p>
@@ -1412,8 +1526,18 @@
           <w:bCs/>
           <w:color w:val="EE0000"/>
         </w:rPr>
-        <w:t>Edge / Internet block</w:t>
-      </w:r>
+        <w:t xml:space="preserve">Edge / Internet </w:t>
+      </w:r>
+      <w:proofErr w:type="spellStart"/>
+      <w:r>
+        <w:rPr>
+          <w:b/>
+          <w:bCs/>
+          <w:color w:val="EE0000"/>
+        </w:rPr>
+        <w:t>block</w:t>
+      </w:r>
+      <w:proofErr w:type="spellEnd"/>
     </w:p>
     <w:p>
       <w:pPr>
@@ -1785,7 +1909,15 @@
         <w:spacing w:before="200"/>
       </w:pPr>
       <w:r>
-        <w:t>VLAN 80 (Access Points) – 10.2.6.0/24</w:t>
+        <w:t xml:space="preserve">VLAN 80 (Access </w:t>
+      </w:r>
+      <w:proofErr w:type="spellStart"/>
+      <w:r>
+        <w:t>Points</w:t>
+      </w:r>
+      <w:proofErr w:type="spellEnd"/>
+      <w:r>
+        <w:t>) – 10.2.6.0/24</w:t>
       </w:r>
     </w:p>
     <w:p>
@@ -1856,26 +1988,30 @@
           <w:lang w:val="en-US"/>
         </w:rPr>
       </w:pPr>
+      <w:proofErr w:type="spellStart"/>
       <w:r>
         <w:rPr>
           <w:lang w:val="en-US"/>
         </w:rPr>
         <w:t>Ntp</w:t>
       </w:r>
-    </w:p>
-    <w:p>
-      <w:pPr>
-        <w:spacing w:before="200"/>
-        <w:rPr>
-          <w:lang w:val="en-US"/>
-        </w:rPr>
-      </w:pPr>
+      <w:proofErr w:type="spellEnd"/>
+    </w:p>
+    <w:p>
+      <w:pPr>
+        <w:spacing w:before="200"/>
+        <w:rPr>
+          <w:lang w:val="en-US"/>
+        </w:rPr>
+      </w:pPr>
+      <w:proofErr w:type="spellStart"/>
       <w:r>
         <w:rPr>
           <w:lang w:val="en-US"/>
         </w:rPr>
         <w:t>en</w:t>
       </w:r>
+      <w:proofErr w:type="spellEnd"/>
     </w:p>
     <w:p>
       <w:pPr>
@@ -1903,35 +2039,65 @@
         <w:rPr>
           <w:lang w:val="en-US"/>
         </w:rPr>
-        <w:t>clock timezone gmt+5 +5</w:t>
-      </w:r>
-    </w:p>
-    <w:p>
-      <w:pPr>
-        <w:spacing w:before="200"/>
-        <w:rPr>
-          <w:lang w:val="en-US"/>
-        </w:rPr>
-      </w:pPr>
-      <w:r>
-        <w:rPr>
-          <w:lang w:val="en-US"/>
-        </w:rPr>
-        <w:t>ntp server 192.168.0.100 prefer</w:t>
-      </w:r>
-    </w:p>
-    <w:p>
-      <w:pPr>
-        <w:spacing w:before="200"/>
-        <w:rPr>
-          <w:lang w:val="en-US"/>
-        </w:rPr>
-      </w:pPr>
-      <w:r>
-        <w:rPr>
-          <w:lang w:val="en-US"/>
-        </w:rPr>
-        <w:t>ntp source loopback0</w:t>
+        <w:t xml:space="preserve">clock </w:t>
+      </w:r>
+      <w:proofErr w:type="spellStart"/>
+      <w:r>
+        <w:rPr>
+          <w:lang w:val="en-US"/>
+        </w:rPr>
+        <w:t>timezone</w:t>
+      </w:r>
+      <w:proofErr w:type="spellEnd"/>
+      <w:r>
+        <w:rPr>
+          <w:lang w:val="en-US"/>
+        </w:rPr>
+        <w:t xml:space="preserve"> gmt+5 +5</w:t>
+      </w:r>
+    </w:p>
+    <w:p>
+      <w:pPr>
+        <w:spacing w:before="200"/>
+        <w:rPr>
+          <w:lang w:val="en-US"/>
+        </w:rPr>
+      </w:pPr>
+      <w:proofErr w:type="spellStart"/>
+      <w:r>
+        <w:rPr>
+          <w:lang w:val="en-US"/>
+        </w:rPr>
+        <w:t>ntp</w:t>
+      </w:r>
+      <w:proofErr w:type="spellEnd"/>
+      <w:r>
+        <w:rPr>
+          <w:lang w:val="en-US"/>
+        </w:rPr>
+        <w:t xml:space="preserve"> server 192.168.0.100 prefer</w:t>
+      </w:r>
+    </w:p>
+    <w:p>
+      <w:pPr>
+        <w:spacing w:before="200"/>
+        <w:rPr>
+          <w:lang w:val="en-US"/>
+        </w:rPr>
+      </w:pPr>
+      <w:proofErr w:type="spellStart"/>
+      <w:r>
+        <w:rPr>
+          <w:lang w:val="en-US"/>
+        </w:rPr>
+        <w:t>ntp</w:t>
+      </w:r>
+      <w:proofErr w:type="spellEnd"/>
+      <w:r>
+        <w:rPr>
+          <w:lang w:val="en-US"/>
+        </w:rPr>
+        <w:t xml:space="preserve"> source loopback0</w:t>
       </w:r>
     </w:p>
     <w:p>
@@ -1981,7 +2147,21 @@
         <w:rPr>
           <w:lang w:val="en-US"/>
         </w:rPr>
-        <w:t>using chrony –</w:t>
+        <w:t xml:space="preserve">using </w:t>
+      </w:r>
+      <w:proofErr w:type="spellStart"/>
+      <w:r>
+        <w:rPr>
+          <w:lang w:val="en-US"/>
+        </w:rPr>
+        <w:t>chrony</w:t>
+      </w:r>
+      <w:proofErr w:type="spellEnd"/>
+      <w:r>
+        <w:rPr>
+          <w:lang w:val="en-US"/>
+        </w:rPr>
+        <w:t xml:space="preserve"> –</w:t>
       </w:r>
     </w:p>
     <w:p>
@@ -2077,11 +2257,19 @@
           <w:lang w:val="en-US"/>
         </w:rPr>
       </w:pPr>
-      <w:r>
-        <w:rPr>
-          <w:lang w:val="en-US"/>
-        </w:rPr>
-        <w:t>fw              IN  A   10.0.5.2</w:t>
+      <w:proofErr w:type="spellStart"/>
+      <w:r>
+        <w:rPr>
+          <w:lang w:val="en-US"/>
+        </w:rPr>
+        <w:t>fw</w:t>
+      </w:r>
+      <w:proofErr w:type="spellEnd"/>
+      <w:r>
+        <w:rPr>
+          <w:lang w:val="en-US"/>
+        </w:rPr>
+        <w:t xml:space="preserve">              IN  A   10.0.5.2</w:t>
       </w:r>
     </w:p>
     <w:p>
@@ -2247,68 +2435,114 @@
           <w:lang w:val="en-US"/>
         </w:rPr>
       </w:pPr>
-      <w:r>
-        <w:rPr>
-          <w:lang w:val="en-US"/>
-        </w:rPr>
-        <w:t>dns-dhcp-ntp    IN  A   192.168.0.100</w:t>
-      </w:r>
-    </w:p>
-    <w:p>
-      <w:pPr>
-        <w:spacing w:before="200"/>
-        <w:rPr>
-          <w:lang w:val="en-US"/>
-        </w:rPr>
-      </w:pPr>
-      <w:r>
-        <w:rPr>
-          <w:lang w:val="en-US"/>
-        </w:rPr>
-        <w:t>pub-srv         IN  A   10.0.1.100</w:t>
-      </w:r>
-    </w:p>
-    <w:p>
-      <w:pPr>
-        <w:spacing w:before="200"/>
-        <w:rPr>
-          <w:lang w:val="en-US"/>
-        </w:rPr>
-      </w:pPr>
+      <w:proofErr w:type="spellStart"/>
+      <w:r>
+        <w:rPr>
+          <w:lang w:val="en-US"/>
+        </w:rPr>
+        <w:t>dns-dhcp-ntp</w:t>
+      </w:r>
+      <w:proofErr w:type="spellEnd"/>
+      <w:r>
+        <w:rPr>
+          <w:lang w:val="en-US"/>
+        </w:rPr>
+        <w:t xml:space="preserve">    IN  A   192.168.0.100</w:t>
+      </w:r>
+    </w:p>
+    <w:p>
+      <w:pPr>
+        <w:spacing w:before="200"/>
+        <w:rPr>
+          <w:lang w:val="en-US"/>
+        </w:rPr>
+      </w:pPr>
+      <w:r>
+        <w:rPr>
+          <w:lang w:val="en-US"/>
+        </w:rPr>
+        <w:t>pub-</w:t>
+      </w:r>
+      <w:proofErr w:type="spellStart"/>
+      <w:r>
+        <w:rPr>
+          <w:lang w:val="en-US"/>
+        </w:rPr>
+        <w:t>srv</w:t>
+      </w:r>
+      <w:proofErr w:type="spellEnd"/>
+      <w:r>
+        <w:rPr>
+          <w:lang w:val="en-US"/>
+        </w:rPr>
+        <w:t xml:space="preserve">         IN  A   10.0.1.100</w:t>
+      </w:r>
+    </w:p>
+    <w:p>
+      <w:pPr>
+        <w:spacing w:before="200"/>
+        <w:rPr>
+          <w:lang w:val="en-US"/>
+        </w:rPr>
+      </w:pPr>
+      <w:proofErr w:type="spellStart"/>
       <w:r>
         <w:rPr>
           <w:lang w:val="en-US"/>
         </w:rPr>
         <w:lastRenderedPageBreak/>
-        <w:t>wlc             IN  A   10.0.2.100</w:t>
-      </w:r>
-    </w:p>
-    <w:p>
-      <w:pPr>
-        <w:spacing w:before="200"/>
-        <w:rPr>
-          <w:lang w:val="en-US"/>
-        </w:rPr>
-      </w:pPr>
-      <w:r>
-        <w:rPr>
-          <w:lang w:val="en-US"/>
-        </w:rPr>
-        <w:t>ldap-aaa        IN  A   192.168.0.101</w:t>
-      </w:r>
-    </w:p>
-    <w:p>
-      <w:pPr>
-        <w:spacing w:before="200"/>
-        <w:rPr>
-          <w:lang w:val="en-US"/>
-        </w:rPr>
-      </w:pPr>
-      <w:r>
-        <w:rPr>
-          <w:lang w:val="en-US"/>
-        </w:rPr>
-        <w:t>pki-srv         IN  A   192.168.0.102</w:t>
+        <w:t>wlc</w:t>
+      </w:r>
+      <w:proofErr w:type="spellEnd"/>
+      <w:r>
+        <w:rPr>
+          <w:lang w:val="en-US"/>
+        </w:rPr>
+        <w:t xml:space="preserve">             IN  A   10.0.2.100</w:t>
+      </w:r>
+    </w:p>
+    <w:p>
+      <w:pPr>
+        <w:spacing w:before="200"/>
+        <w:rPr>
+          <w:lang w:val="en-US"/>
+        </w:rPr>
+      </w:pPr>
+      <w:proofErr w:type="spellStart"/>
+      <w:r>
+        <w:rPr>
+          <w:lang w:val="en-US"/>
+        </w:rPr>
+        <w:t>ldap-aaa</w:t>
+      </w:r>
+      <w:proofErr w:type="spellEnd"/>
+      <w:r>
+        <w:rPr>
+          <w:lang w:val="en-US"/>
+        </w:rPr>
+        <w:t xml:space="preserve">        IN  A   192.168.0.101</w:t>
+      </w:r>
+    </w:p>
+    <w:p>
+      <w:pPr>
+        <w:spacing w:before="200"/>
+        <w:rPr>
+          <w:lang w:val="en-US"/>
+        </w:rPr>
+      </w:pPr>
+      <w:proofErr w:type="spellStart"/>
+      <w:r>
+        <w:rPr>
+          <w:lang w:val="en-US"/>
+        </w:rPr>
+        <w:t>pki-srv</w:t>
+      </w:r>
+      <w:proofErr w:type="spellEnd"/>
+      <w:r>
+        <w:rPr>
+          <w:lang w:val="en-US"/>
+        </w:rPr>
+        <w:t xml:space="preserve">         IN  A   192.168.0.102</w:t>
       </w:r>
     </w:p>
     <w:p>
@@ -4187,6 +4421,7 @@
             <w:shd w:val="clear" w:color="auto" w:fill="D9D9D9"/>
           </w:tcPr>
           <w:p>
+            <w:proofErr w:type="spellStart"/>
             <w:r>
               <w:rPr>
                 <w:b/>
@@ -4194,6 +4429,7 @@
               </w:rPr>
               <w:t>Role</w:t>
             </w:r>
+            <w:proofErr w:type="spellEnd"/>
           </w:p>
         </w:tc>
         <w:tc>
@@ -4260,8 +4496,16 @@
               <w:rPr>
                 <w:color w:val="EE0000"/>
               </w:rPr>
-              <w:t>Edge router</w:t>
-            </w:r>
+              <w:t xml:space="preserve">Edge </w:t>
+            </w:r>
+            <w:proofErr w:type="spellStart"/>
+            <w:r>
+              <w:rPr>
+                <w:color w:val="EE0000"/>
+              </w:rPr>
+              <w:t>router</w:t>
+            </w:r>
+            <w:proofErr w:type="spellEnd"/>
           </w:p>
         </w:tc>
         <w:tc>
@@ -4408,8 +4652,16 @@
               <w:rPr>
                 <w:color w:val="EE0000"/>
               </w:rPr>
-              <w:t>Core router</w:t>
-            </w:r>
+              <w:t xml:space="preserve">Core </w:t>
+            </w:r>
+            <w:proofErr w:type="spellStart"/>
+            <w:r>
+              <w:rPr>
+                <w:color w:val="EE0000"/>
+              </w:rPr>
+              <w:t>router</w:t>
+            </w:r>
+            <w:proofErr w:type="spellEnd"/>
           </w:p>
         </w:tc>
         <w:tc>
@@ -4482,8 +4734,16 @@
               <w:rPr>
                 <w:color w:val="EE0000"/>
               </w:rPr>
-              <w:t>Core router</w:t>
-            </w:r>
+              <w:t xml:space="preserve">Core </w:t>
+            </w:r>
+            <w:proofErr w:type="spellStart"/>
+            <w:r>
+              <w:rPr>
+                <w:color w:val="EE0000"/>
+              </w:rPr>
+              <w:t>router</w:t>
+            </w:r>
+            <w:proofErr w:type="spellEnd"/>
           </w:p>
         </w:tc>
         <w:tc>
@@ -4556,8 +4816,30 @@
               <w:rPr>
                 <w:color w:val="EE0000"/>
               </w:rPr>
-              <w:t>Server-room switch</w:t>
-            </w:r>
+              <w:t>Server-</w:t>
+            </w:r>
+            <w:proofErr w:type="spellStart"/>
+            <w:r>
+              <w:rPr>
+                <w:color w:val="EE0000"/>
+              </w:rPr>
+              <w:t>room</w:t>
+            </w:r>
+            <w:proofErr w:type="spellEnd"/>
+            <w:r>
+              <w:rPr>
+                <w:color w:val="EE0000"/>
+              </w:rPr>
+              <w:t xml:space="preserve"> </w:t>
+            </w:r>
+            <w:proofErr w:type="spellStart"/>
+            <w:r>
+              <w:rPr>
+                <w:color w:val="EE0000"/>
+              </w:rPr>
+              <w:t>switch</w:t>
+            </w:r>
+            <w:proofErr w:type="spellEnd"/>
           </w:p>
         </w:tc>
         <w:tc>
@@ -4630,8 +4912,16 @@
               <w:rPr>
                 <w:color w:val="EE0000"/>
               </w:rPr>
-              <w:t>Distribution switch</w:t>
-            </w:r>
+              <w:t xml:space="preserve">Distribution </w:t>
+            </w:r>
+            <w:proofErr w:type="spellStart"/>
+            <w:r>
+              <w:rPr>
+                <w:color w:val="EE0000"/>
+              </w:rPr>
+              <w:t>switch</w:t>
+            </w:r>
+            <w:proofErr w:type="spellEnd"/>
           </w:p>
         </w:tc>
         <w:tc>
@@ -4704,8 +4994,16 @@
               <w:rPr>
                 <w:color w:val="EE0000"/>
               </w:rPr>
-              <w:t>Distribution switch</w:t>
-            </w:r>
+              <w:t xml:space="preserve">Distribution </w:t>
+            </w:r>
+            <w:proofErr w:type="spellStart"/>
+            <w:r>
+              <w:rPr>
+                <w:color w:val="EE0000"/>
+              </w:rPr>
+              <w:t>switch</w:t>
+            </w:r>
+            <w:proofErr w:type="spellEnd"/>
           </w:p>
         </w:tc>
         <w:tc>
@@ -4778,8 +5076,16 @@
               <w:rPr>
                 <w:color w:val="000000" w:themeColor="text1"/>
               </w:rPr>
-              <w:t>Distribution switch</w:t>
-            </w:r>
+              <w:t xml:space="preserve">Distribution </w:t>
+            </w:r>
+            <w:proofErr w:type="spellStart"/>
+            <w:r>
+              <w:rPr>
+                <w:color w:val="000000" w:themeColor="text1"/>
+              </w:rPr>
+              <w:t>switch</w:t>
+            </w:r>
+            <w:proofErr w:type="spellEnd"/>
           </w:p>
         </w:tc>
         <w:tc>
@@ -4852,8 +5158,16 @@
               <w:rPr>
                 <w:color w:val="000000" w:themeColor="text1"/>
               </w:rPr>
-              <w:t>Distribution switch</w:t>
-            </w:r>
+              <w:t xml:space="preserve">Distribution </w:t>
+            </w:r>
+            <w:proofErr w:type="spellStart"/>
+            <w:r>
+              <w:rPr>
+                <w:color w:val="000000" w:themeColor="text1"/>
+              </w:rPr>
+              <w:t>switch</w:t>
+            </w:r>
+            <w:proofErr w:type="spellEnd"/>
           </w:p>
         </w:tc>
         <w:tc>
@@ -4913,7 +5227,21 @@
         <w:rPr>
           <w:lang w:val="en-US"/>
         </w:rPr>
-        <w:t>Pure Layer 2 access switches (ASW) cannot host a routed loopback, so each site has a dedicated management VLAN (VLAN 99) terminated as an SVI on both distribution switches, running HSRP for redundancy. Each ASW gets an SVI in this VLAN and points ip default-gateway at the site's HSRP virtual IP, since a pure L2 switch has no IP routing table of its own.</w:t>
+        <w:t xml:space="preserve">Pure Layer 2 access switches (ASW) cannot host a routed loopback, so each site has a dedicated management VLAN (VLAN 99) terminated as an SVI on both distribution switches, running HSRP for redundancy. Each ASW gets an SVI in this VLAN and points </w:t>
+      </w:r>
+      <w:proofErr w:type="spellStart"/>
+      <w:r>
+        <w:rPr>
+          <w:lang w:val="en-US"/>
+        </w:rPr>
+        <w:t>ip</w:t>
+      </w:r>
+      <w:proofErr w:type="spellEnd"/>
+      <w:r>
+        <w:rPr>
+          <w:lang w:val="en-US"/>
+        </w:rPr>
+        <w:t xml:space="preserve"> default-gateway at the site's HSRP virtual IP, since a pure L2 switch has no IP routing table of its own.</w:t>
       </w:r>
     </w:p>
     <w:tbl>
@@ -4957,6 +5285,7 @@
             <w:shd w:val="clear" w:color="auto" w:fill="D9D9D9"/>
           </w:tcPr>
           <w:p>
+            <w:proofErr w:type="spellStart"/>
             <w:r>
               <w:rPr>
                 <w:b/>
@@ -4964,6 +5293,7 @@
               </w:rPr>
               <w:t>Role</w:t>
             </w:r>
+            <w:proofErr w:type="spellEnd"/>
           </w:p>
         </w:tc>
         <w:tc>
@@ -5184,7 +5514,21 @@
               <w:rPr>
                 <w:color w:val="EE0000"/>
               </w:rPr>
-              <w:t>HSRP VIP (both)</w:t>
+              <w:t>HSRP VIP (</w:t>
+            </w:r>
+            <w:proofErr w:type="spellStart"/>
+            <w:r>
+              <w:rPr>
+                <w:color w:val="EE0000"/>
+              </w:rPr>
+              <w:t>both</w:t>
+            </w:r>
+            <w:proofErr w:type="spellEnd"/>
+            <w:r>
+              <w:rPr>
+                <w:color w:val="EE0000"/>
+              </w:rPr>
+              <w:t>)</w:t>
             </w:r>
           </w:p>
         </w:tc>
@@ -5458,7 +5802,15 @@
           </w:tcPr>
           <w:p>
             <w:r>
-              <w:t>HSRP VIP (both)</w:t>
+              <w:t>HSRP VIP (</w:t>
+            </w:r>
+            <w:proofErr w:type="spellStart"/>
+            <w:r>
+              <w:t>both</w:t>
+            </w:r>
+            <w:proofErr w:type="spellEnd"/>
+            <w:r>
+              <w:t>)</w:t>
             </w:r>
           </w:p>
         </w:tc>
@@ -5943,13 +6295,139 @@
       <w:bookmarkEnd w:id="60"/>
     </w:p>
     <w:p>
-      <w:r>
+      <w:pPr>
         <w:rPr>
           <w:i/>
           <w:iCs/>
           <w:color w:val="888888"/>
         </w:rPr>
-        <w:t>[Content to be added]</w:t>
+      </w:pPr>
+      <w:r>
+        <w:rPr>
+          <w:i/>
+          <w:iCs/>
+          <w:color w:val="888888"/>
+        </w:rPr>
+        <w:t xml:space="preserve">[Content </w:t>
+      </w:r>
+      <w:proofErr w:type="spellStart"/>
+      <w:r>
+        <w:rPr>
+          <w:i/>
+          <w:iCs/>
+          <w:color w:val="888888"/>
+        </w:rPr>
+        <w:t>to</w:t>
+      </w:r>
+      <w:proofErr w:type="spellEnd"/>
+      <w:r>
+        <w:rPr>
+          <w:i/>
+          <w:iCs/>
+          <w:color w:val="888888"/>
+        </w:rPr>
+        <w:t xml:space="preserve"> </w:t>
+      </w:r>
+      <w:proofErr w:type="spellStart"/>
+      <w:r>
+        <w:rPr>
+          <w:i/>
+          <w:iCs/>
+          <w:color w:val="888888"/>
+        </w:rPr>
+        <w:t>be</w:t>
+      </w:r>
+      <w:proofErr w:type="spellEnd"/>
+      <w:r>
+        <w:rPr>
+          <w:i/>
+          <w:iCs/>
+          <w:color w:val="888888"/>
+        </w:rPr>
+        <w:t xml:space="preserve"> </w:t>
+      </w:r>
+      <w:proofErr w:type="spellStart"/>
+      <w:r>
+        <w:rPr>
+          <w:i/>
+          <w:iCs/>
+          <w:color w:val="888888"/>
+        </w:rPr>
+        <w:t>added</w:t>
+      </w:r>
+      <w:proofErr w:type="spellEnd"/>
+      <w:r>
+        <w:rPr>
+          <w:i/>
+          <w:iCs/>
+          <w:color w:val="888888"/>
+        </w:rPr>
+        <w:t>]</w:t>
+      </w:r>
+    </w:p>
+    <w:p>
+      <w:pPr>
+        <w:rPr>
+          <w:i/>
+          <w:iCs/>
+          <w:color w:val="888888"/>
+        </w:rPr>
+      </w:pPr>
+    </w:p>
+    <w:p>
+      <w:pPr>
+        <w:rPr>
+          <w:i/>
+          <w:iCs/>
+          <w:color w:val="888888"/>
+        </w:rPr>
+      </w:pPr>
+    </w:p>
+    <w:p>
+      <w:pPr>
+        <w:rPr>
+          <w:i/>
+          <w:iCs/>
+          <w:color w:val="888888"/>
+        </w:rPr>
+      </w:pPr>
+    </w:p>
+    <w:p>
+      <w:proofErr w:type="spellStart"/>
+      <w:r>
+        <w:rPr>
+          <w:i/>
+          <w:iCs/>
+          <w:color w:val="888888"/>
+        </w:rPr>
+        <w:t>Changed</w:t>
+      </w:r>
+      <w:proofErr w:type="spellEnd"/>
+      <w:r>
+        <w:rPr>
+          <w:i/>
+          <w:iCs/>
+          <w:color w:val="888888"/>
+        </w:rPr>
+        <w:t xml:space="preserve"> </w:t>
+      </w:r>
+      <w:proofErr w:type="spellStart"/>
+      <w:r>
+        <w:rPr>
+          <w:i/>
+          <w:iCs/>
+          <w:color w:val="888888"/>
+        </w:rPr>
+        <w:t>the</w:t>
+      </w:r>
+      <w:proofErr w:type="spellEnd"/>
+      <w:r>
+        <w:rPr>
+          <w:i/>
+          <w:iCs/>
+          <w:color w:val="888888"/>
+        </w:rPr>
+        <w:t xml:space="preserve"> </w:t>
       </w:r>
     </w:p>
     <w:sectPr>
@@ -7115,6 +7593,7 @@
   <w:style w:type="character" w:default="1" w:styleId="a0">
     <w:name w:val="Default Paragraph Font"/>
     <w:uiPriority w:val="1"/>
+    <w:semiHidden/>
     <w:unhideWhenUsed/>
   </w:style>
   <w:style w:type="table" w:default="1" w:styleId="a1">

</xml_diff>